<commit_message>
Updated resume for mentorship
</commit_message>
<xml_diff>
--- a/assets/resume/Resume_Md-Arafat-Hossain.docx
+++ b/assets/resume/Resume_Md-Arafat-Hossain.docx
@@ -1356,21 +1356,18 @@
         <w:tab/>
       </w:r>
       <w:r>
-        <w:t>Jan</w:t>
+        <w:t xml:space="preserve">Jan </w:t>
+      </w:r>
+      <w:r>
+        <w:t>20</w:t>
+      </w:r>
+      <w:r>
+        <w:t>23 –</w:t>
       </w:r>
       <w:r>
         <w:t xml:space="preserve"> </w:t>
       </w:r>
       <w:r>
-        <w:t>20</w:t>
-      </w:r>
-      <w:r>
-        <w:t>23 –</w:t>
-      </w:r>
-      <w:r>
-        <w:t xml:space="preserve"> </w:t>
-      </w:r>
-      <w:r>
         <w:t>Feb 2024</w:t>
       </w:r>
     </w:p>
@@ -1379,26 +1376,17 @@
         <w:pStyle w:val="ListBullet"/>
       </w:pPr>
       <w:r>
-        <w:rPr>
-          <w:b/>
-          <w:bCs/>
-        </w:rPr>
-        <w:t xml:space="preserve">Part </w:t>
-      </w:r>
-      <w:proofErr w:type="gramStart"/>
-      <w:r>
-        <w:rPr>
-          <w:b/>
-          <w:bCs/>
-        </w:rPr>
-        <w:t>Lead</w:t>
-      </w:r>
-      <w:proofErr w:type="gramEnd"/>
-      <w:r>
-        <w:t xml:space="preserve"> -</w:t>
-      </w:r>
-      <w:r>
-        <w:t xml:space="preserve"> managing roadmap, feature ownership, and development execution</w:t>
+        <w:t xml:space="preserve">Acted as </w:t>
+      </w:r>
+      <w:r>
+        <w:rPr>
+          <w:b/>
+          <w:bCs/>
+        </w:rPr>
+        <w:t>Tech Lead</w:t>
+      </w:r>
+      <w:r>
+        <w:t>, facilitating communication with HQ and managing comprehensive documentation.</w:t>
       </w:r>
     </w:p>
     <w:p>
@@ -1406,15 +1394,7 @@
         <w:pStyle w:val="ListBullet"/>
       </w:pPr>
       <w:r>
-        <w:t xml:space="preserve">Led responses to Market </w:t>
-      </w:r>
-      <w:proofErr w:type="spellStart"/>
-      <w:r>
-        <w:t>VoCs</w:t>
-      </w:r>
-      <w:proofErr w:type="spellEnd"/>
-      <w:r>
-        <w:t>, resolved QA issues, and ensured stakeholder alignment</w:t>
+        <w:t>Conducted knowledge-sharing sessions across teams to ensure seamless domain transfer</w:t>
       </w:r>
     </w:p>
     <w:p>
@@ -1458,28 +1438,19 @@
         <w:tab/>
       </w:r>
       <w:r>
-        <w:t>Mar</w:t>
+        <w:t xml:space="preserve">Mar </w:t>
+      </w:r>
+      <w:r>
+        <w:t>20</w:t>
+      </w:r>
+      <w:r>
+        <w:t>19 –</w:t>
       </w:r>
       <w:r>
         <w:t xml:space="preserve"> </w:t>
       </w:r>
       <w:r>
-        <w:t>20</w:t>
-      </w:r>
-      <w:r>
-        <w:t>19</w:t>
-      </w:r>
-      <w:r>
-        <w:t xml:space="preserve"> –</w:t>
-      </w:r>
-      <w:r>
-        <w:t xml:space="preserve"> </w:t>
-      </w:r>
-      <w:r>
-        <w:t>Dec</w:t>
-      </w:r>
-      <w:r>
-        <w:t xml:space="preserve"> </w:t>
+        <w:t xml:space="preserve">Dec </w:t>
       </w:r>
       <w:r>
         <w:t>20</w:t>
@@ -4080,6 +4051,7 @@
   <w:style w:type="character" w:default="1" w:styleId="DefaultParagraphFont">
     <w:name w:val="Default Paragraph Font"/>
     <w:uiPriority w:val="1"/>
+    <w:semiHidden/>
     <w:unhideWhenUsed/>
   </w:style>
   <w:style w:type="table" w:default="1" w:styleId="TableNormal">
@@ -4668,10 +4640,42 @@
 </file>
 
 <file path=customXml/item1.xml><?xml version="1.0" encoding="utf-8"?>
-<b:Sources xmlns:b="http://schemas.openxmlformats.org/officeDocument/2006/bibliography" xmlns="http://schemas.openxmlformats.org/officeDocument/2006/bibliography" SelectedStyle="\APASixthEditionOfficeOnline.xsl" StyleName="APA" Version="6"/>
+<?mso-contentType ?>
+<FormTemplates xmlns="http://schemas.microsoft.com/sharepoint/v3/contenttype/forms">
+  <Display>DocumentLibraryForm</Display>
+  <Edit>DocumentLibraryForm</Edit>
+  <New>DocumentLibraryForm</New>
+</FormTemplates>
 </file>
 
 <file path=customXml/item2.xml><?xml version="1.0" encoding="utf-8"?>
+<p:properties xmlns:p="http://schemas.microsoft.com/office/2006/metadata/properties" xmlns:xsi="http://www.w3.org/2001/XMLSchema-instance" xmlns:pc="http://schemas.microsoft.com/office/infopath/2007/PartnerControls">
+  <documentManagement>
+    <_ip_UnifiedCompliancePolicyUIAction xmlns="http://schemas.microsoft.com/sharepoint/v3" xsi:nil="true"/>
+    <_ip_UnifiedCompliancePolicyProperties xmlns="http://schemas.microsoft.com/sharepoint/v3" xsi:nil="true"/>
+    <TaxCatchAll xmlns="230e9df3-be65-4c73-a93b-d1236ebd677e" xsi:nil="true"/>
+    <ImageTagsTaxHTField xmlns="71af3243-3dd4-4a8d-8c0d-dd76da1f02a5">
+      <Terms xmlns="http://schemas.microsoft.com/office/infopath/2007/PartnerControls"/>
+    </ImageTagsTaxHTField>
+    <Image xmlns="71af3243-3dd4-4a8d-8c0d-dd76da1f02a5">
+      <Url xsi:nil="true"/>
+      <Description xsi:nil="true"/>
+    </Image>
+    <Status xmlns="71af3243-3dd4-4a8d-8c0d-dd76da1f02a5">Not started</Status>
+    <Background xmlns="71af3243-3dd4-4a8d-8c0d-dd76da1f02a5">false</Background>
+    <MediaServiceKeyPoints xmlns="71af3243-3dd4-4a8d-8c0d-dd76da1f02a5" xsi:nil="true"/>
+    <SharedWithUsers xmlns="16c05727-aa75-4e4a-9b5f-8a80a1165891">
+      <UserInfo>
+        <DisplayName/>
+        <AccountId xsi:nil="true"/>
+        <AccountType/>
+      </UserInfo>
+    </SharedWithUsers>
+  </documentManagement>
+</p:properties>
+</file>
+
+<file path=customXml/item3.xml><?xml version="1.0" encoding="utf-8"?>
 <ct:contentTypeSchema xmlns:ct="http://schemas.microsoft.com/office/2006/metadata/contentType" xmlns:ma="http://schemas.microsoft.com/office/2006/metadata/properties/metaAttributes" ct:_="" ma:_="" ma:contentTypeName="Document" ma:contentTypeID="0x01010079F111ED35F8CC479449609E8A0923A6" ma:contentTypeVersion="30" ma:contentTypeDescription="Create a new document." ma:contentTypeScope="" ma:versionID="cec0622158e8f13124e9e8fd4de31bd1">
   <xsd:schema xmlns:xsd="http://www.w3.org/2001/XMLSchema" xmlns:xs="http://www.w3.org/2001/XMLSchema" xmlns:p="http://schemas.microsoft.com/office/2006/metadata/properties" xmlns:ns1="http://schemas.microsoft.com/sharepoint/v3" xmlns:ns2="71af3243-3dd4-4a8d-8c0d-dd76da1f02a5" xmlns:ns3="16c05727-aa75-4e4a-9b5f-8a80a1165891" xmlns:ns4="230e9df3-be65-4c73-a93b-d1236ebd677e" targetNamespace="http://schemas.microsoft.com/office/2006/metadata/properties" ma:root="true" ma:fieldsID="3b52f30ab005d15df08657af532e6e38" ns1:_="" ns2:_="" ns3:_="" ns4:_="">
     <xsd:import namespace="http://schemas.microsoft.com/sharepoint/v3"/>
@@ -4989,51 +4993,32 @@
 </ct:contentTypeSchema>
 </file>
 
-<file path=customXml/item3.xml><?xml version="1.0" encoding="utf-8"?>
-<p:properties xmlns:p="http://schemas.microsoft.com/office/2006/metadata/properties" xmlns:xsi="http://www.w3.org/2001/XMLSchema-instance" xmlns:pc="http://schemas.microsoft.com/office/infopath/2007/PartnerControls">
-  <documentManagement>
-    <_ip_UnifiedCompliancePolicyUIAction xmlns="http://schemas.microsoft.com/sharepoint/v3" xsi:nil="true"/>
-    <_ip_UnifiedCompliancePolicyProperties xmlns="http://schemas.microsoft.com/sharepoint/v3" xsi:nil="true"/>
-    <TaxCatchAll xmlns="230e9df3-be65-4c73-a93b-d1236ebd677e" xsi:nil="true"/>
-    <ImageTagsTaxHTField xmlns="71af3243-3dd4-4a8d-8c0d-dd76da1f02a5">
-      <Terms xmlns="http://schemas.microsoft.com/office/infopath/2007/PartnerControls"/>
-    </ImageTagsTaxHTField>
-    <Image xmlns="71af3243-3dd4-4a8d-8c0d-dd76da1f02a5">
-      <Url xsi:nil="true"/>
-      <Description xsi:nil="true"/>
-    </Image>
-    <Status xmlns="71af3243-3dd4-4a8d-8c0d-dd76da1f02a5">Not started</Status>
-    <Background xmlns="71af3243-3dd4-4a8d-8c0d-dd76da1f02a5">false</Background>
-    <MediaServiceKeyPoints xmlns="71af3243-3dd4-4a8d-8c0d-dd76da1f02a5" xsi:nil="true"/>
-    <SharedWithUsers xmlns="16c05727-aa75-4e4a-9b5f-8a80a1165891">
-      <UserInfo>
-        <DisplayName/>
-        <AccountId xsi:nil="true"/>
-        <AccountType/>
-      </UserInfo>
-    </SharedWithUsers>
-  </documentManagement>
-</p:properties>
-</file>
-
 <file path=customXml/item4.xml><?xml version="1.0" encoding="utf-8"?>
-<?mso-contentType ?>
-<FormTemplates xmlns="http://schemas.microsoft.com/sharepoint/v3/contenttype/forms">
-  <Display>DocumentLibraryForm</Display>
-  <Edit>DocumentLibraryForm</Edit>
-  <New>DocumentLibraryForm</New>
-</FormTemplates>
+<b:Sources xmlns:b="http://schemas.openxmlformats.org/officeDocument/2006/bibliography" xmlns="http://schemas.openxmlformats.org/officeDocument/2006/bibliography" SelectedStyle="\APASixthEditionOfficeOnline.xsl" StyleName="APA" Version="6"/>
 </file>
 
 <file path=customXml/itemProps1.xml><?xml version="1.0" encoding="utf-8"?>
-<ds:datastoreItem xmlns:ds="http://schemas.openxmlformats.org/officeDocument/2006/customXml" ds:itemID="{673513B2-79CE-4C66-ACE4-3D67382244F7}">
+<ds:datastoreItem xmlns:ds="http://schemas.openxmlformats.org/officeDocument/2006/customXml" ds:itemID="{F8158BE5-FF4A-47EA-ABCC-F2FC8C69734F}">
   <ds:schemaRefs>
-    <ds:schemaRef ds:uri="http://schemas.openxmlformats.org/officeDocument/2006/bibliography"/>
+    <ds:schemaRef ds:uri="http://schemas.microsoft.com/sharepoint/v3/contenttype/forms"/>
   </ds:schemaRefs>
 </ds:datastoreItem>
 </file>
 
 <file path=customXml/itemProps2.xml><?xml version="1.0" encoding="utf-8"?>
+<ds:datastoreItem xmlns:ds="http://schemas.openxmlformats.org/officeDocument/2006/customXml" ds:itemID="{2FA1C4FC-8415-4BF3-9F42-41DE68C426A1}">
+  <ds:schemaRefs>
+    <ds:schemaRef ds:uri="http://schemas.microsoft.com/office/2006/metadata/properties"/>
+    <ds:schemaRef ds:uri="http://schemas.microsoft.com/office/infopath/2007/PartnerControls"/>
+    <ds:schemaRef ds:uri="http://schemas.microsoft.com/sharepoint/v3"/>
+    <ds:schemaRef ds:uri="230e9df3-be65-4c73-a93b-d1236ebd677e"/>
+    <ds:schemaRef ds:uri="71af3243-3dd4-4a8d-8c0d-dd76da1f02a5"/>
+    <ds:schemaRef ds:uri="16c05727-aa75-4e4a-9b5f-8a80a1165891"/>
+  </ds:schemaRefs>
+</ds:datastoreItem>
+</file>
+
+<file path=customXml/itemProps3.xml><?xml version="1.0" encoding="utf-8"?>
 <ds:datastoreItem xmlns:ds="http://schemas.openxmlformats.org/officeDocument/2006/customXml" ds:itemID="{E334ADCA-0391-45BE-A0B8-AA9AA9016254}">
   <ds:schemaRefs>
     <ds:schemaRef ds:uri="http://schemas.microsoft.com/office/2006/metadata/contentType"/>
@@ -5054,23 +5039,10 @@
 </ds:datastoreItem>
 </file>
 
-<file path=customXml/itemProps3.xml><?xml version="1.0" encoding="utf-8"?>
-<ds:datastoreItem xmlns:ds="http://schemas.openxmlformats.org/officeDocument/2006/customXml" ds:itemID="{2FA1C4FC-8415-4BF3-9F42-41DE68C426A1}">
+<file path=customXml/itemProps4.xml><?xml version="1.0" encoding="utf-8"?>
+<ds:datastoreItem xmlns:ds="http://schemas.openxmlformats.org/officeDocument/2006/customXml" ds:itemID="{673513B2-79CE-4C66-ACE4-3D67382244F7}">
   <ds:schemaRefs>
-    <ds:schemaRef ds:uri="http://schemas.microsoft.com/office/2006/metadata/properties"/>
-    <ds:schemaRef ds:uri="http://schemas.microsoft.com/office/infopath/2007/PartnerControls"/>
-    <ds:schemaRef ds:uri="http://schemas.microsoft.com/sharepoint/v3"/>
-    <ds:schemaRef ds:uri="230e9df3-be65-4c73-a93b-d1236ebd677e"/>
-    <ds:schemaRef ds:uri="71af3243-3dd4-4a8d-8c0d-dd76da1f02a5"/>
-    <ds:schemaRef ds:uri="16c05727-aa75-4e4a-9b5f-8a80a1165891"/>
-  </ds:schemaRefs>
-</ds:datastoreItem>
-</file>
-
-<file path=customXml/itemProps4.xml><?xml version="1.0" encoding="utf-8"?>
-<ds:datastoreItem xmlns:ds="http://schemas.openxmlformats.org/officeDocument/2006/customXml" ds:itemID="{F8158BE5-FF4A-47EA-ABCC-F2FC8C69734F}">
-  <ds:schemaRefs>
-    <ds:schemaRef ds:uri="http://schemas.microsoft.com/sharepoint/v3/contenttype/forms"/>
+    <ds:schemaRef ds:uri="http://schemas.openxmlformats.org/officeDocument/2006/bibliography"/>
   </ds:schemaRefs>
 </ds:datastoreItem>
 </file>

</xml_diff>

<commit_message>
Update resume to 2.6
</commit_message>
<xml_diff>
--- a/assets/resume/Resume_Md-Arafat-Hossain.docx
+++ b/assets/resume/Resume_Md-Arafat-Hossain.docx
@@ -4,42 +4,72 @@
   <w:body>
     <w:p>
       <w:pPr>
-        <w:pStyle w:val="Space"/>
-      </w:pPr>
-    </w:p>
-    <w:p>
-      <w:pPr>
         <w:pStyle w:val="Title"/>
-      </w:pPr>
-      <w:r>
+        <w:rPr>
+          <w:color w:val="000000" w:themeColor="text1"/>
+        </w:rPr>
+      </w:pPr>
+      <w:r>
+        <w:rPr>
+          <w:color w:val="000000" w:themeColor="text1"/>
+        </w:rPr>
         <w:t>Md Arafat Hossain</w:t>
       </w:r>
     </w:p>
     <w:p>
-      <w:r>
+      <w:pPr>
+        <w:rPr>
+          <w:color w:val="000000" w:themeColor="text1"/>
+        </w:rPr>
+      </w:pPr>
+      <w:r>
+        <w:rPr>
+          <w:color w:val="000000" w:themeColor="text1"/>
+        </w:rPr>
         <w:t>Staff Engineer | iOS, macOS</w:t>
       </w:r>
     </w:p>
     <w:p>
-      <w:r>
+      <w:pPr>
+        <w:rPr>
+          <w:color w:val="000000" w:themeColor="text1"/>
+        </w:rPr>
+      </w:pPr>
+      <w:r>
+        <w:rPr>
+          <w:color w:val="000000" w:themeColor="text1"/>
+        </w:rPr>
         <w:t xml:space="preserve">arafat07.ruet@gmail.com | </w:t>
       </w:r>
       <w:r>
+        <w:rPr>
+          <w:color w:val="000000" w:themeColor="text1"/>
+        </w:rPr>
         <w:t>+8801717451117</w:t>
       </w:r>
       <w:r>
+        <w:rPr>
+          <w:color w:val="000000" w:themeColor="text1"/>
+        </w:rPr>
         <w:t xml:space="preserve"> | </w:t>
       </w:r>
       <w:r>
+        <w:rPr>
+          <w:color w:val="000000" w:themeColor="text1"/>
+        </w:rPr>
         <w:t>Dhaka, Bangladesh</w:t>
       </w:r>
       <w:r>
+        <w:rPr>
+          <w:color w:val="000000" w:themeColor="text1"/>
+        </w:rPr>
         <w:t xml:space="preserve"> | </w:t>
       </w:r>
       <w:hyperlink r:id="rId11" w:history="1">
         <w:r>
           <w:rPr>
             <w:rStyle w:val="Hyperlink"/>
+            <w:color w:val="000000" w:themeColor="text1"/>
           </w:rPr>
           <w:t>https://www.linkedin.com/in/iarafathsn</w:t>
         </w:r>
@@ -53,7 +83,7 @@
         <w:spacing w:line="240" w:lineRule="auto"/>
         <w:rPr>
           <w:rFonts w:ascii="Open Sans" w:hAnsi="Open Sans" w:cs="Open Sans"/>
-          <w:color w:val="3A3A3A" w:themeColor="background2" w:themeShade="40"/>
+          <w:color w:val="000000" w:themeColor="text1"/>
           <w:sz w:val="8"/>
           <w:szCs w:val="8"/>
         </w:rPr>
@@ -64,7 +94,7 @@
         <w:spacing w:line="240" w:lineRule="auto"/>
         <w:rPr>
           <w:rFonts w:ascii="Open Sans" w:hAnsi="Open Sans" w:cs="Open Sans"/>
-          <w:color w:val="3A3A3A" w:themeColor="background2" w:themeShade="40"/>
+          <w:color w:val="000000" w:themeColor="text1"/>
           <w:sz w:val="14"/>
           <w:szCs w:val="14"/>
         </w:rPr>
@@ -73,20 +103,35 @@
     <w:p>
       <w:pPr>
         <w:pStyle w:val="Heading1"/>
-      </w:pPr>
-      <w:r>
+        <w:rPr>
+          <w:color w:val="000000" w:themeColor="text1"/>
+        </w:rPr>
+      </w:pPr>
+      <w:r>
+        <w:rPr>
+          <w:color w:val="000000" w:themeColor="text1"/>
+        </w:rPr>
         <w:t>Career Summary</w:t>
       </w:r>
     </w:p>
     <w:p>
-      <w:r>
-        <w:t>Experienced Software Engineer with over 12 years of expertise in building and optimizing applications across iOS, macOS, Windows, and cross-platform environments. Proven ability to lead cross-functional teams, deliver high-performance apps, and mentor engineers. Specialized in Swift, iOS frameworks, and scalable architecture patterns. Known for driving innovations with measurable business impact and aligning solutions with strategic goals.</w:t>
+      <w:pPr>
+        <w:rPr>
+          <w:color w:val="000000" w:themeColor="text1"/>
+        </w:rPr>
+      </w:pPr>
+      <w:r>
+        <w:rPr>
+          <w:color w:val="000000" w:themeColor="text1"/>
+        </w:rPr>
+        <w:t>Seasoned Software Engineer with over 12 years of experience designing, developing, and optimizing applications across iOS, macOS, Windows, and cross-platform environments. Demonstrated success in leading high-performing teams, architecting scalable solutions, and mentoring engineers to deliver quality-driven, user-centric products. Specialized in Swift and modern iOS frameworks, with deep expertise in concurrency, reactive programming, and MVVM-based architectures. Recognized for driving innovation, improving performance, and aligning technology initiatives with strategic business goals.</w:t>
       </w:r>
     </w:p>
     <w:p>
       <w:pPr>
         <w:pStyle w:val="Space"/>
         <w:rPr>
+          <w:color w:val="000000" w:themeColor="text1"/>
           <w:sz w:val="10"/>
           <w:szCs w:val="10"/>
         </w:rPr>
@@ -95,8 +140,14 @@
     <w:p>
       <w:pPr>
         <w:pStyle w:val="Heading1"/>
-      </w:pPr>
-      <w:r>
+        <w:rPr>
+          <w:color w:val="000000" w:themeColor="text1"/>
+        </w:rPr>
+      </w:pPr>
+      <w:r>
+        <w:rPr>
+          <w:color w:val="000000" w:themeColor="text1"/>
+        </w:rPr>
         <w:t>Technical Skills</w:t>
       </w:r>
     </w:p>
@@ -108,18 +159,28 @@
           <w:numId w:val="13"/>
         </w:numPr>
         <w:jc w:val="left"/>
-      </w:pPr>
-      <w:r>
-        <w:rPr>
-          <w:b/>
-          <w:bCs/>
+        <w:rPr>
+          <w:color w:val="000000" w:themeColor="text1"/>
+        </w:rPr>
+      </w:pPr>
+      <w:r>
+        <w:rPr>
+          <w:b/>
+          <w:bCs/>
+          <w:color w:val="000000" w:themeColor="text1"/>
         </w:rPr>
         <w:t>Languages &amp; Frameworks:</w:t>
       </w:r>
       <w:r>
+        <w:rPr>
+          <w:color w:val="000000" w:themeColor="text1"/>
+        </w:rPr>
         <w:t xml:space="preserve"> </w:t>
       </w:r>
       <w:r>
+        <w:rPr>
+          <w:color w:val="000000" w:themeColor="text1"/>
+        </w:rPr>
         <w:t>Swift, Objective-C, Java, C/C++, C#, WPF, MFC</w:t>
       </w:r>
     </w:p>
@@ -131,39 +192,64 @@
           <w:numId w:val="13"/>
         </w:numPr>
         <w:jc w:val="left"/>
-      </w:pPr>
-      <w:r>
-        <w:rPr>
-          <w:b/>
-          <w:bCs/>
+        <w:rPr>
+          <w:color w:val="000000" w:themeColor="text1"/>
+        </w:rPr>
+      </w:pPr>
+      <w:r>
+        <w:rPr>
+          <w:b/>
+          <w:bCs/>
+          <w:color w:val="000000" w:themeColor="text1"/>
         </w:rPr>
         <w:t>Mobile &amp; Desktop Development</w:t>
       </w:r>
       <w:r>
+        <w:rPr>
+          <w:color w:val="000000" w:themeColor="text1"/>
+        </w:rPr>
         <w:t xml:space="preserve">: </w:t>
       </w:r>
       <w:proofErr w:type="spellStart"/>
       <w:r>
+        <w:rPr>
+          <w:color w:val="000000" w:themeColor="text1"/>
+        </w:rPr>
         <w:t>UIKit</w:t>
       </w:r>
       <w:proofErr w:type="spellEnd"/>
       <w:r>
+        <w:rPr>
+          <w:color w:val="000000" w:themeColor="text1"/>
+        </w:rPr>
         <w:t xml:space="preserve">, </w:t>
       </w:r>
       <w:proofErr w:type="spellStart"/>
       <w:r>
+        <w:rPr>
+          <w:color w:val="000000" w:themeColor="text1"/>
+        </w:rPr>
         <w:t>SwiftUI</w:t>
       </w:r>
       <w:proofErr w:type="spellEnd"/>
       <w:r>
+        <w:rPr>
+          <w:color w:val="000000" w:themeColor="text1"/>
+        </w:rPr>
         <w:t xml:space="preserve">, Combine, </w:t>
       </w:r>
       <w:proofErr w:type="spellStart"/>
       <w:r>
+        <w:rPr>
+          <w:color w:val="000000" w:themeColor="text1"/>
+        </w:rPr>
         <w:t>ReactiveSwift</w:t>
       </w:r>
       <w:proofErr w:type="spellEnd"/>
       <w:r>
+        <w:rPr>
+          <w:color w:val="000000" w:themeColor="text1"/>
+        </w:rPr>
         <w:t>, WPF</w:t>
       </w:r>
     </w:p>
@@ -175,11 +261,15 @@
           <w:numId w:val="13"/>
         </w:numPr>
         <w:jc w:val="left"/>
-      </w:pPr>
-      <w:r>
-        <w:rPr>
-          <w:b/>
-          <w:bCs/>
+        <w:rPr>
+          <w:color w:val="000000" w:themeColor="text1"/>
+        </w:rPr>
+      </w:pPr>
+      <w:r>
+        <w:rPr>
+          <w:b/>
+          <w:bCs/>
+          <w:color w:val="000000" w:themeColor="text1"/>
         </w:rPr>
         <w:t>Architecture</w:t>
       </w:r>
@@ -187,6 +277,7 @@
         <w:rPr>
           <w:b/>
           <w:bCs/>
+          <w:color w:val="000000" w:themeColor="text1"/>
         </w:rPr>
         <w:t>s</w:t>
       </w:r>
@@ -194,10 +285,14 @@
         <w:rPr>
           <w:b/>
           <w:bCs/>
+          <w:color w:val="000000" w:themeColor="text1"/>
         </w:rPr>
         <w:t>:</w:t>
       </w:r>
       <w:r>
+        <w:rPr>
+          <w:color w:val="000000" w:themeColor="text1"/>
+        </w:rPr>
         <w:t xml:space="preserve"> MVVM, MVVM-C, Redux</w:t>
       </w:r>
     </w:p>
@@ -209,23 +304,42 @@
           <w:numId w:val="13"/>
         </w:numPr>
         <w:jc w:val="left"/>
-      </w:pPr>
-      <w:r>
-        <w:rPr>
-          <w:b/>
-          <w:bCs/>
-        </w:rPr>
-        <w:t>Tools &amp; DevOps: Git</w:t>
-      </w:r>
-      <w:r>
+        <w:rPr>
+          <w:color w:val="000000" w:themeColor="text1"/>
+        </w:rPr>
+      </w:pPr>
+      <w:r>
+        <w:rPr>
+          <w:b/>
+          <w:bCs/>
+          <w:color w:val="000000" w:themeColor="text1"/>
+        </w:rPr>
+        <w:t xml:space="preserve">Tools &amp; DevOps: </w:t>
+      </w:r>
+      <w:r>
+        <w:rPr>
+          <w:color w:val="000000" w:themeColor="text1"/>
+        </w:rPr>
+        <w:t>Git</w:t>
+      </w:r>
+      <w:r>
+        <w:rPr>
+          <w:color w:val="000000" w:themeColor="text1"/>
+        </w:rPr>
         <w:t>, Perforce, REST API, Unit Testing (</w:t>
       </w:r>
       <w:proofErr w:type="spellStart"/>
       <w:r>
+        <w:rPr>
+          <w:color w:val="000000" w:themeColor="text1"/>
+        </w:rPr>
         <w:t>XCTest</w:t>
       </w:r>
       <w:proofErr w:type="spellEnd"/>
       <w:r>
+        <w:rPr>
+          <w:color w:val="000000" w:themeColor="text1"/>
+        </w:rPr>
         <w:t>, JUnit), CI/CD (GitHub Actions, Jenkins)</w:t>
       </w:r>
     </w:p>
@@ -237,15 +351,22 @@
           <w:numId w:val="13"/>
         </w:numPr>
         <w:jc w:val="left"/>
-      </w:pPr>
-      <w:r>
-        <w:rPr>
-          <w:b/>
-          <w:bCs/>
+        <w:rPr>
+          <w:color w:val="000000" w:themeColor="text1"/>
+        </w:rPr>
+      </w:pPr>
+      <w:r>
+        <w:rPr>
+          <w:b/>
+          <w:bCs/>
+          <w:color w:val="000000" w:themeColor="text1"/>
         </w:rPr>
         <w:t>Methodologies:</w:t>
       </w:r>
       <w:r>
+        <w:rPr>
+          <w:color w:val="000000" w:themeColor="text1"/>
+        </w:rPr>
         <w:t xml:space="preserve"> Agile, Scrum</w:t>
       </w:r>
     </w:p>
@@ -253,6 +374,7 @@
       <w:pPr>
         <w:pStyle w:val="Space"/>
         <w:rPr>
+          <w:color w:val="000000" w:themeColor="text1"/>
           <w:sz w:val="10"/>
           <w:szCs w:val="10"/>
         </w:rPr>
@@ -261,64 +383,106 @@
     <w:p>
       <w:pPr>
         <w:pStyle w:val="Heading1"/>
-      </w:pPr>
-      <w:r>
+        <w:rPr>
+          <w:color w:val="000000" w:themeColor="text1"/>
+        </w:rPr>
+      </w:pPr>
+      <w:r>
+        <w:rPr>
+          <w:color w:val="000000" w:themeColor="text1"/>
+        </w:rPr>
         <w:t>Work Experience</w:t>
       </w:r>
     </w:p>
     <w:p>
       <w:pPr>
         <w:pStyle w:val="List"/>
+        <w:rPr>
+          <w:color w:val="000000" w:themeColor="text1"/>
+        </w:rPr>
       </w:pPr>
       <w:r>
         <w:rPr>
           <w:rStyle w:val="Emphasis"/>
+          <w:color w:val="000000" w:themeColor="text1"/>
         </w:rPr>
         <w:t>Samsung R&amp;D Institute Bangladesh Ltd.</w:t>
       </w:r>
       <w:r>
         <w:rPr>
           <w:rStyle w:val="Emphasis"/>
+          <w:color w:val="000000" w:themeColor="text1"/>
         </w:rPr>
         <w:t xml:space="preserve"> </w:t>
       </w:r>
       <w:r>
+        <w:rPr>
+          <w:color w:val="000000" w:themeColor="text1"/>
+        </w:rPr>
         <w:t xml:space="preserve">| </w:t>
       </w:r>
       <w:r>
+        <w:rPr>
+          <w:color w:val="000000" w:themeColor="text1"/>
+        </w:rPr>
         <w:t>Staff Engineer-I</w:t>
       </w:r>
       <w:r>
+        <w:rPr>
+          <w:color w:val="000000" w:themeColor="text1"/>
+        </w:rPr>
         <w:tab/>
       </w:r>
       <w:r>
+        <w:rPr>
+          <w:color w:val="000000" w:themeColor="text1"/>
+        </w:rPr>
         <w:t>Mar 202</w:t>
       </w:r>
       <w:r>
+        <w:rPr>
+          <w:color w:val="000000" w:themeColor="text1"/>
+        </w:rPr>
         <w:t>1</w:t>
       </w:r>
       <w:r>
+        <w:rPr>
+          <w:color w:val="000000" w:themeColor="text1"/>
+        </w:rPr>
         <w:t xml:space="preserve"> </w:t>
       </w:r>
       <w:r>
+        <w:rPr>
+          <w:color w:val="000000" w:themeColor="text1"/>
+        </w:rPr>
         <w:t>- Present</w:t>
       </w:r>
     </w:p>
     <w:p>
       <w:pPr>
         <w:pStyle w:val="ListBullet"/>
-      </w:pPr>
-      <w:r>
+        <w:rPr>
+          <w:color w:val="000000" w:themeColor="text1"/>
+        </w:rPr>
+      </w:pPr>
+      <w:r>
+        <w:rPr>
+          <w:color w:val="000000" w:themeColor="text1"/>
+        </w:rPr>
         <w:t xml:space="preserve">Led development of </w:t>
       </w:r>
       <w:r>
         <w:rPr>
           <w:b/>
           <w:bCs/>
+          <w:color w:val="000000" w:themeColor="text1"/>
         </w:rPr>
         <w:t>Settings</w:t>
       </w:r>
       <w:r>
+        <w:rPr>
+          <w:color w:val="000000" w:themeColor="text1"/>
+        </w:rPr>
         <w:t xml:space="preserve"> and </w:t>
       </w:r>
       <w:proofErr w:type="spellStart"/>
@@ -326,17 +490,22 @@
         <w:rPr>
           <w:b/>
           <w:bCs/>
+          <w:color w:val="000000" w:themeColor="text1"/>
         </w:rPr>
         <w:t>MapView</w:t>
       </w:r>
       <w:proofErr w:type="spellEnd"/>
       <w:r>
+        <w:rPr>
+          <w:color w:val="000000" w:themeColor="text1"/>
+        </w:rPr>
         <w:t xml:space="preserve"> features in </w:t>
       </w:r>
       <w:r>
         <w:rPr>
           <w:b/>
           <w:bCs/>
+          <w:color w:val="000000" w:themeColor="text1"/>
         </w:rPr>
         <w:t>SmartThings</w:t>
       </w:r>
@@ -344,46 +513,98 @@
         <w:rPr>
           <w:b/>
           <w:bCs/>
+          <w:color w:val="000000" w:themeColor="text1"/>
         </w:rPr>
         <w:t xml:space="preserve"> iOS</w:t>
       </w:r>
       <w:r>
-        <w:t xml:space="preserve"> (20M+ downloads, 4.5+ rating)</w:t>
+        <w:rPr>
+          <w:color w:val="000000" w:themeColor="text1"/>
+        </w:rPr>
+        <w:t xml:space="preserve"> (</w:t>
+      </w:r>
+      <w:r>
+        <w:rPr>
+          <w:b/>
+          <w:bCs/>
+          <w:color w:val="000000" w:themeColor="text1"/>
+        </w:rPr>
+        <w:t>20M+</w:t>
+      </w:r>
+      <w:r>
+        <w:rPr>
+          <w:color w:val="000000" w:themeColor="text1"/>
+        </w:rPr>
+        <w:t xml:space="preserve"> downloads, </w:t>
+      </w:r>
+      <w:r>
+        <w:rPr>
+          <w:b/>
+          <w:bCs/>
+          <w:color w:val="000000" w:themeColor="text1"/>
+        </w:rPr>
+        <w:t>4.5+</w:t>
+      </w:r>
+      <w:r>
+        <w:rPr>
+          <w:color w:val="000000" w:themeColor="text1"/>
+        </w:rPr>
+        <w:t xml:space="preserve"> rating)</w:t>
       </w:r>
     </w:p>
     <w:p>
       <w:pPr>
         <w:pStyle w:val="ListBullet"/>
-      </w:pPr>
-      <w:r>
+        <w:rPr>
+          <w:color w:val="000000" w:themeColor="text1"/>
+        </w:rPr>
+      </w:pPr>
+      <w:r>
+        <w:rPr>
+          <w:color w:val="000000" w:themeColor="text1"/>
+        </w:rPr>
         <w:t xml:space="preserve">Implemented </w:t>
       </w:r>
       <w:r>
         <w:rPr>
           <w:b/>
           <w:bCs/>
+          <w:color w:val="000000" w:themeColor="text1"/>
         </w:rPr>
         <w:t>Do Not Disturb</w:t>
       </w:r>
       <w:r>
+        <w:rPr>
+          <w:color w:val="000000" w:themeColor="text1"/>
+        </w:rPr>
         <w:t xml:space="preserve"> and </w:t>
       </w:r>
       <w:r>
         <w:rPr>
           <w:b/>
           <w:bCs/>
+          <w:color w:val="000000" w:themeColor="text1"/>
         </w:rPr>
         <w:t>Emergency Alert</w:t>
       </w:r>
       <w:r>
+        <w:rPr>
+          <w:color w:val="000000" w:themeColor="text1"/>
+        </w:rPr>
         <w:t xml:space="preserve"> settings, enhancing user control and safety features</w:t>
       </w:r>
     </w:p>
     <w:p>
       <w:pPr>
         <w:pStyle w:val="ListBullet"/>
-      </w:pPr>
-      <w:r>
+        <w:rPr>
+          <w:color w:val="000000" w:themeColor="text1"/>
+        </w:rPr>
+      </w:pPr>
+      <w:r>
+        <w:rPr>
+          <w:color w:val="000000" w:themeColor="text1"/>
+        </w:rPr>
         <w:t xml:space="preserve">Enhanced </w:t>
       </w:r>
       <w:proofErr w:type="spellStart"/>
@@ -391,72 +612,134 @@
         <w:rPr>
           <w:b/>
           <w:bCs/>
+          <w:color w:val="000000" w:themeColor="text1"/>
         </w:rPr>
         <w:t>MapView</w:t>
       </w:r>
       <w:proofErr w:type="spellEnd"/>
       <w:r>
+        <w:rPr>
+          <w:color w:val="000000" w:themeColor="text1"/>
+        </w:rPr>
         <w:t xml:space="preserve"> by integrating </w:t>
       </w:r>
       <w:r>
         <w:rPr>
           <w:b/>
           <w:bCs/>
+          <w:color w:val="000000" w:themeColor="text1"/>
         </w:rPr>
         <w:t>TV/light device cards</w:t>
       </w:r>
       <w:r>
+        <w:rPr>
+          <w:color w:val="000000" w:themeColor="text1"/>
+        </w:rPr>
         <w:t xml:space="preserve"> and new device support</w:t>
       </w:r>
     </w:p>
     <w:p>
       <w:pPr>
         <w:pStyle w:val="ListBullet"/>
-      </w:pPr>
-      <w:r>
+        <w:rPr>
+          <w:color w:val="000000" w:themeColor="text1"/>
+        </w:rPr>
+      </w:pPr>
+      <w:r>
+        <w:rPr>
+          <w:color w:val="000000" w:themeColor="text1"/>
+        </w:rPr>
         <w:t xml:space="preserve">Migrated codebase from </w:t>
       </w:r>
       <w:proofErr w:type="spellStart"/>
       <w:r>
         <w:rPr>
-          <w:b/>
-          <w:bCs/>
+          <w:color w:val="000000" w:themeColor="text1"/>
         </w:rPr>
         <w:t>ReactiveSwift</w:t>
       </w:r>
       <w:proofErr w:type="spellEnd"/>
       <w:r>
         <w:rPr>
-          <w:b/>
-          <w:bCs/>
-        </w:rPr>
-        <w:t xml:space="preserve"> to Combine</w:t>
-      </w:r>
-      <w:r>
+          <w:color w:val="000000" w:themeColor="text1"/>
+        </w:rPr>
+        <w:t xml:space="preserve"> to </w:t>
+      </w:r>
+      <w:r>
+        <w:rPr>
+          <w:b/>
+          <w:bCs/>
+          <w:color w:val="000000" w:themeColor="text1"/>
+        </w:rPr>
+        <w:t>Combine</w:t>
+      </w:r>
+      <w:r>
+        <w:rPr>
+          <w:color w:val="000000" w:themeColor="text1"/>
+        </w:rPr>
         <w:t>, aligning with modern Apple ecosystem standards</w:t>
       </w:r>
     </w:p>
     <w:p>
       <w:pPr>
         <w:pStyle w:val="ListBullet"/>
-      </w:pPr>
-      <w:r>
+        <w:rPr>
+          <w:color w:val="000000" w:themeColor="text1"/>
+        </w:rPr>
+      </w:pPr>
+      <w:r>
+        <w:rPr>
+          <w:color w:val="000000" w:themeColor="text1"/>
+        </w:rPr>
+        <w:t xml:space="preserve">Migrating existing modules to </w:t>
+      </w:r>
+      <w:r>
+        <w:rPr>
+          <w:b/>
+          <w:bCs/>
+          <w:color w:val="000000" w:themeColor="text1"/>
+        </w:rPr>
+        <w:t>Swift 6 Concurrency</w:t>
+      </w:r>
+      <w:r>
+        <w:rPr>
+          <w:color w:val="000000" w:themeColor="text1"/>
+        </w:rPr>
+        <w:t xml:space="preserve"> (async/await, structured concurrency, actors) to improve code safety, responsiveness, and maintainability</w:t>
+      </w:r>
+    </w:p>
+    <w:p>
+      <w:pPr>
+        <w:pStyle w:val="ListBullet"/>
+        <w:rPr>
+          <w:color w:val="000000" w:themeColor="text1"/>
+        </w:rPr>
+      </w:pPr>
+      <w:r>
+        <w:rPr>
+          <w:color w:val="000000" w:themeColor="text1"/>
+        </w:rPr>
         <w:t xml:space="preserve">Delivered </w:t>
       </w:r>
       <w:r>
         <w:rPr>
           <w:b/>
           <w:bCs/>
+          <w:color w:val="000000" w:themeColor="text1"/>
         </w:rPr>
         <w:t>Dark Mode</w:t>
       </w:r>
       <w:r>
+        <w:rPr>
+          <w:color w:val="000000" w:themeColor="text1"/>
+        </w:rPr>
         <w:t xml:space="preserve"> support and addressed key </w:t>
       </w:r>
       <w:r>
         <w:rPr>
           <w:b/>
           <w:bCs/>
+          <w:color w:val="000000" w:themeColor="text1"/>
         </w:rPr>
         <w:t xml:space="preserve">market </w:t>
       </w:r>
@@ -465,6 +748,7 @@
         <w:rPr>
           <w:b/>
           <w:bCs/>
+          <w:color w:val="000000" w:themeColor="text1"/>
         </w:rPr>
         <w:t>VoCs</w:t>
       </w:r>
@@ -473,54 +757,112 @@
     <w:p>
       <w:pPr>
         <w:pStyle w:val="ListBullet"/>
-      </w:pPr>
-      <w:r>
+        <w:rPr>
+          <w:color w:val="000000" w:themeColor="text1"/>
+        </w:rPr>
+      </w:pPr>
+      <w:r>
+        <w:rPr>
+          <w:color w:val="000000" w:themeColor="text1"/>
+        </w:rPr>
         <w:t xml:space="preserve">Modernized the UI of the </w:t>
       </w:r>
       <w:r>
         <w:rPr>
           <w:b/>
           <w:bCs/>
+          <w:color w:val="000000" w:themeColor="text1"/>
         </w:rPr>
         <w:t>5D Viewer (WPF)</w:t>
       </w:r>
       <w:r>
+        <w:rPr>
+          <w:color w:val="000000" w:themeColor="text1"/>
+        </w:rPr>
         <w:t xml:space="preserve"> used in medical ultrasound systems</w:t>
       </w:r>
     </w:p>
     <w:p>
       <w:pPr>
         <w:pStyle w:val="ListBullet"/>
-      </w:pPr>
-      <w:r>
+        <w:rPr>
+          <w:color w:val="000000" w:themeColor="text1"/>
+        </w:rPr>
+      </w:pPr>
+      <w:r>
+        <w:rPr>
+          <w:color w:val="000000" w:themeColor="text1"/>
+        </w:rPr>
         <w:t xml:space="preserve">Improved </w:t>
       </w:r>
       <w:r>
         <w:rPr>
           <w:b/>
           <w:bCs/>
-        </w:rPr>
-        <w:t>IPC functionality using COM</w:t>
-      </w:r>
-      <w:r>
-        <w:t xml:space="preserve"> in 5D Viewer, ensuring stable device communication</w:t>
+          <w:color w:val="000000" w:themeColor="text1"/>
+        </w:rPr>
+        <w:t xml:space="preserve">IPC </w:t>
+      </w:r>
+      <w:r>
+        <w:rPr>
+          <w:color w:val="000000" w:themeColor="text1"/>
+        </w:rPr>
+        <w:t>functionality using</w:t>
+      </w:r>
+      <w:r>
+        <w:rPr>
+          <w:b/>
+          <w:bCs/>
+          <w:color w:val="000000" w:themeColor="text1"/>
+        </w:rPr>
+        <w:t xml:space="preserve"> COM</w:t>
+      </w:r>
+      <w:r>
+        <w:rPr>
+          <w:color w:val="000000" w:themeColor="text1"/>
+        </w:rPr>
+        <w:t xml:space="preserve"> in </w:t>
+      </w:r>
+      <w:r>
+        <w:rPr>
+          <w:b/>
+          <w:bCs/>
+          <w:color w:val="000000" w:themeColor="text1"/>
+        </w:rPr>
+        <w:t>5D Viewer</w:t>
+      </w:r>
+      <w:r>
+        <w:rPr>
+          <w:color w:val="000000" w:themeColor="text1"/>
+        </w:rPr>
+        <w:t>, ensuring stable device communication</w:t>
       </w:r>
     </w:p>
     <w:p>
       <w:pPr>
         <w:pStyle w:val="ListBullet"/>
-      </w:pPr>
-      <w:r>
+        <w:rPr>
+          <w:color w:val="000000" w:themeColor="text1"/>
+        </w:rPr>
+      </w:pPr>
+      <w:r>
+        <w:rPr>
+          <w:color w:val="000000" w:themeColor="text1"/>
+        </w:rPr>
         <w:t xml:space="preserve">Served as </w:t>
       </w:r>
       <w:r>
         <w:rPr>
           <w:b/>
           <w:bCs/>
+          <w:color w:val="000000" w:themeColor="text1"/>
         </w:rPr>
         <w:t>Tech Lead</w:t>
       </w:r>
       <w:r>
+        <w:rPr>
+          <w:color w:val="000000" w:themeColor="text1"/>
+        </w:rPr>
         <w:t xml:space="preserve"> for </w:t>
       </w:r>
       <w:proofErr w:type="spellStart"/>
@@ -528,6 +870,7 @@
         <w:rPr>
           <w:b/>
           <w:bCs/>
+          <w:color w:val="000000" w:themeColor="text1"/>
         </w:rPr>
         <w:t>DeX</w:t>
       </w:r>
@@ -536,82 +879,84 @@
         <w:rPr>
           <w:b/>
           <w:bCs/>
+          <w:color w:val="000000" w:themeColor="text1"/>
         </w:rPr>
         <w:t xml:space="preserve"> for PC</w:t>
       </w:r>
       <w:r>
+        <w:rPr>
+          <w:color w:val="000000" w:themeColor="text1"/>
+        </w:rPr>
         <w:t xml:space="preserve"> (7M+ downloads, 757K+ monthly users), guiding feature planning and delivery</w:t>
       </w:r>
     </w:p>
     <w:p>
       <w:pPr>
         <w:pStyle w:val="ListBullet"/>
-      </w:pPr>
-      <w:r>
+        <w:rPr>
+          <w:color w:val="000000" w:themeColor="text1"/>
+        </w:rPr>
+      </w:pPr>
+      <w:r>
+        <w:rPr>
+          <w:color w:val="000000" w:themeColor="text1"/>
+        </w:rPr>
         <w:t xml:space="preserve">Conducted </w:t>
       </w:r>
       <w:r>
         <w:rPr>
           <w:b/>
           <w:bCs/>
+          <w:color w:val="000000" w:themeColor="text1"/>
         </w:rPr>
         <w:t>memory optimizations and code reviews</w:t>
       </w:r>
       <w:r>
+        <w:rPr>
+          <w:color w:val="000000" w:themeColor="text1"/>
+        </w:rPr>
         <w:t xml:space="preserve"> for MFC-based legacy </w:t>
       </w:r>
       <w:proofErr w:type="spellStart"/>
       <w:r>
+        <w:rPr>
+          <w:color w:val="000000" w:themeColor="text1"/>
+        </w:rPr>
         <w:t>DeX</w:t>
       </w:r>
       <w:proofErr w:type="spellEnd"/>
       <w:r>
+        <w:rPr>
+          <w:color w:val="000000" w:themeColor="text1"/>
+        </w:rPr>
         <w:t xml:space="preserve"> Windows applications</w:t>
       </w:r>
     </w:p>
     <w:p>
       <w:pPr>
         <w:pStyle w:val="ListBullet"/>
-      </w:pPr>
-      <w:r>
+        <w:rPr>
+          <w:color w:val="000000" w:themeColor="text1"/>
+        </w:rPr>
+      </w:pPr>
+      <w:r>
+        <w:rPr>
+          <w:color w:val="000000" w:themeColor="text1"/>
+        </w:rPr>
         <w:t>Achieved</w:t>
       </w:r>
       <w:r>
         <w:rPr>
           <w:b/>
           <w:bCs/>
-        </w:rPr>
-        <w:t xml:space="preserve"> </w:t>
-      </w:r>
-      <w:r>
-        <w:rPr>
-          <w:b/>
-          <w:bCs/>
-        </w:rPr>
-        <w:t>Professional</w:t>
-      </w:r>
-      <w:r>
-        <w:rPr>
-          <w:b/>
-          <w:bCs/>
-        </w:rPr>
-        <w:t xml:space="preserve"> Level (Top </w:t>
-      </w:r>
-      <w:r>
-        <w:rPr>
-          <w:b/>
-          <w:bCs/>
-        </w:rPr>
-        <w:t>2</w:t>
-      </w:r>
-      <w:r>
-        <w:rPr>
-          <w:b/>
-          <w:bCs/>
-        </w:rPr>
-        <w:t>0%)</w:t>
-      </w:r>
-      <w:r>
+          <w:color w:val="000000" w:themeColor="text1"/>
+        </w:rPr>
+        <w:t xml:space="preserve"> Professional Level (Top 20%)</w:t>
+      </w:r>
+      <w:r>
+        <w:rPr>
+          <w:color w:val="000000" w:themeColor="text1"/>
+        </w:rPr>
         <w:t xml:space="preserve"> in Samsung’s SW Certificate Test</w:t>
       </w:r>
     </w:p>
@@ -619,6 +964,7 @@
       <w:pPr>
         <w:pStyle w:val="Space"/>
         <w:rPr>
+          <w:color w:val="000000" w:themeColor="text1"/>
           <w:sz w:val="10"/>
           <w:szCs w:val="10"/>
         </w:rPr>
@@ -627,59 +973,85 @@
     <w:p>
       <w:pPr>
         <w:pStyle w:val="List"/>
+        <w:rPr>
+          <w:color w:val="000000" w:themeColor="text1"/>
+        </w:rPr>
       </w:pPr>
       <w:r>
         <w:rPr>
           <w:rStyle w:val="Emphasis"/>
-        </w:rPr>
-        <w:t>Samsung R&amp;D Institute Bangladesh Ltd.</w:t>
-      </w:r>
-      <w:r>
-        <w:rPr>
-          <w:rStyle w:val="Emphasis"/>
+          <w:color w:val="000000" w:themeColor="text1"/>
+        </w:rPr>
+        <w:t xml:space="preserve">Samsung R&amp;D Institute Bangladesh Ltd. </w:t>
+      </w:r>
+      <w:r>
+        <w:rPr>
+          <w:color w:val="000000" w:themeColor="text1"/>
+        </w:rPr>
+        <w:t>| Engineer-III</w:t>
+      </w:r>
+      <w:r>
+        <w:rPr>
+          <w:color w:val="000000" w:themeColor="text1"/>
+        </w:rPr>
+        <w:tab/>
+      </w:r>
+      <w:r>
+        <w:rPr>
+          <w:color w:val="000000" w:themeColor="text1"/>
+        </w:rPr>
+        <w:t>Mar 2019 –</w:t>
+      </w:r>
+      <w:r>
+        <w:rPr>
+          <w:color w:val="000000" w:themeColor="text1"/>
         </w:rPr>
         <w:t xml:space="preserve"> </w:t>
       </w:r>
       <w:r>
-        <w:t xml:space="preserve">| </w:t>
-      </w:r>
-      <w:r>
-        <w:t>Engineer-III</w:t>
-      </w:r>
-      <w:r>
-        <w:tab/>
-      </w:r>
-      <w:r>
-        <w:t>Mar 2019 –</w:t>
-      </w:r>
-      <w:r>
-        <w:t xml:space="preserve"> </w:t>
-      </w:r>
-      <w:r>
+        <w:rPr>
+          <w:color w:val="000000" w:themeColor="text1"/>
+        </w:rPr>
         <w:t xml:space="preserve">Feb </w:t>
       </w:r>
       <w:r>
+        <w:rPr>
+          <w:color w:val="000000" w:themeColor="text1"/>
+        </w:rPr>
         <w:t>20</w:t>
       </w:r>
       <w:r>
+        <w:rPr>
+          <w:color w:val="000000" w:themeColor="text1"/>
+        </w:rPr>
         <w:t>21</w:t>
       </w:r>
     </w:p>
     <w:p>
       <w:pPr>
         <w:pStyle w:val="ListBullet"/>
-      </w:pPr>
-      <w:r>
+        <w:rPr>
+          <w:color w:val="000000" w:themeColor="text1"/>
+        </w:rPr>
+      </w:pPr>
+      <w:r>
+        <w:rPr>
+          <w:color w:val="000000" w:themeColor="text1"/>
+        </w:rPr>
         <w:t xml:space="preserve">Served as </w:t>
       </w:r>
       <w:r>
         <w:rPr>
           <w:b/>
           <w:bCs/>
+          <w:color w:val="000000" w:themeColor="text1"/>
         </w:rPr>
         <w:t>Lead Developer &amp; Release Maintainer</w:t>
       </w:r>
       <w:r>
+        <w:rPr>
+          <w:color w:val="000000" w:themeColor="text1"/>
+        </w:rPr>
         <w:t xml:space="preserve"> of the </w:t>
       </w:r>
       <w:proofErr w:type="spellStart"/>
@@ -687,6 +1059,7 @@
         <w:rPr>
           <w:b/>
           <w:bCs/>
+          <w:color w:val="000000" w:themeColor="text1"/>
         </w:rPr>
         <w:t>DeX</w:t>
       </w:r>
@@ -695,21 +1068,29 @@
         <w:rPr>
           <w:b/>
           <w:bCs/>
+          <w:color w:val="000000" w:themeColor="text1"/>
         </w:rPr>
         <w:t xml:space="preserve"> for PC (macOS)</w:t>
       </w:r>
       <w:r>
+        <w:rPr>
+          <w:color w:val="000000" w:themeColor="text1"/>
+        </w:rPr>
         <w:t xml:space="preserve"> application</w:t>
       </w:r>
     </w:p>
     <w:p>
       <w:pPr>
         <w:pStyle w:val="ListBullet"/>
-      </w:pPr>
-      <w:r>
-        <w:rPr>
-          <w:b/>
-          <w:bCs/>
+        <w:rPr>
+          <w:color w:val="000000" w:themeColor="text1"/>
+        </w:rPr>
+      </w:pPr>
+      <w:r>
+        <w:rPr>
+          <w:b/>
+          <w:bCs/>
+          <w:color w:val="000000" w:themeColor="text1"/>
         </w:rPr>
         <w:t>Spearheaded universal macOS app support for Apple M1 architecture</w:t>
       </w:r>
@@ -717,75 +1098,113 @@
     <w:p>
       <w:pPr>
         <w:pStyle w:val="ListBullet"/>
-      </w:pPr>
-      <w:r>
+        <w:rPr>
+          <w:color w:val="000000" w:themeColor="text1"/>
+        </w:rPr>
+      </w:pPr>
+      <w:r>
+        <w:rPr>
+          <w:color w:val="000000" w:themeColor="text1"/>
+        </w:rPr>
         <w:t xml:space="preserve">Enabled seamless </w:t>
       </w:r>
       <w:r>
         <w:rPr>
           <w:b/>
           <w:bCs/>
+          <w:color w:val="000000" w:themeColor="text1"/>
         </w:rPr>
         <w:t>USB and wireless connectivity</w:t>
       </w:r>
       <w:r>
+        <w:rPr>
+          <w:color w:val="000000" w:themeColor="text1"/>
+        </w:rPr>
         <w:t xml:space="preserve"> between Android devices and macOS</w:t>
       </w:r>
     </w:p>
     <w:p>
       <w:pPr>
         <w:pStyle w:val="ListBullet"/>
-      </w:pPr>
-      <w:r>
+        <w:rPr>
+          <w:color w:val="000000" w:themeColor="text1"/>
+        </w:rPr>
+      </w:pPr>
+      <w:r>
+        <w:rPr>
+          <w:color w:val="000000" w:themeColor="text1"/>
+        </w:rPr>
         <w:t xml:space="preserve">Delivered robust </w:t>
       </w:r>
       <w:r>
         <w:rPr>
           <w:b/>
           <w:bCs/>
+          <w:color w:val="000000" w:themeColor="text1"/>
         </w:rPr>
         <w:t>file transfer</w:t>
       </w:r>
       <w:r>
+        <w:rPr>
+          <w:color w:val="000000" w:themeColor="text1"/>
+        </w:rPr>
         <w:t xml:space="preserve">, </w:t>
       </w:r>
       <w:r>
         <w:rPr>
           <w:b/>
           <w:bCs/>
+          <w:color w:val="000000" w:themeColor="text1"/>
         </w:rPr>
         <w:t>RTSP-based screen rendering</w:t>
       </w:r>
       <w:r>
+        <w:rPr>
+          <w:color w:val="000000" w:themeColor="text1"/>
+        </w:rPr>
         <w:t xml:space="preserve">, and </w:t>
       </w:r>
       <w:r>
         <w:rPr>
           <w:b/>
           <w:bCs/>
+          <w:color w:val="000000" w:themeColor="text1"/>
         </w:rPr>
         <w:t>input sharing</w:t>
       </w:r>
       <w:r>
+        <w:rPr>
+          <w:color w:val="000000" w:themeColor="text1"/>
+        </w:rPr>
         <w:t xml:space="preserve"> (clipboard, keyboard, mouse) features</w:t>
       </w:r>
     </w:p>
     <w:p>
       <w:pPr>
         <w:pStyle w:val="ListBullet"/>
-      </w:pPr>
-      <w:r>
+        <w:rPr>
+          <w:color w:val="000000" w:themeColor="text1"/>
+        </w:rPr>
+      </w:pPr>
+      <w:r>
+        <w:rPr>
+          <w:color w:val="000000" w:themeColor="text1"/>
+        </w:rPr>
         <w:t>Collaborated with cross-functional teams to ensure stability, performance, and user experience</w:t>
       </w:r>
     </w:p>
     <w:p>
       <w:pPr>
         <w:pStyle w:val="ListBullet"/>
-      </w:pPr>
-      <w:r>
-        <w:rPr>
-          <w:b/>
-          <w:bCs/>
+        <w:rPr>
+          <w:color w:val="000000" w:themeColor="text1"/>
+        </w:rPr>
+      </w:pPr>
+      <w:r>
+        <w:rPr>
+          <w:b/>
+          <w:bCs/>
+          <w:color w:val="000000" w:themeColor="text1"/>
         </w:rPr>
         <w:t>Awards &amp; Recognition:</w:t>
       </w:r>
@@ -798,15 +1217,22 @@
           <w:tab w:val="num" w:pos="720"/>
         </w:tabs>
         <w:ind w:left="1440"/>
-      </w:pPr>
-      <w:r>
-        <w:rPr>
-          <w:b/>
-          <w:bCs/>
+        <w:rPr>
+          <w:color w:val="000000" w:themeColor="text1"/>
+        </w:rPr>
+      </w:pPr>
+      <w:r>
+        <w:rPr>
+          <w:b/>
+          <w:bCs/>
+          <w:color w:val="000000" w:themeColor="text1"/>
         </w:rPr>
         <w:t>Samsung Mobile R&amp;D CTO Award, 2019</w:t>
       </w:r>
       <w:r>
+        <w:rPr>
+          <w:color w:val="000000" w:themeColor="text1"/>
+        </w:rPr>
         <w:t xml:space="preserve"> – For significant business impact</w:t>
       </w:r>
     </w:p>
@@ -818,11 +1244,15 @@
           <w:tab w:val="num" w:pos="720"/>
         </w:tabs>
         <w:ind w:left="1440"/>
-      </w:pPr>
-      <w:r>
-        <w:rPr>
-          <w:b/>
-          <w:bCs/>
+        <w:rPr>
+          <w:color w:val="000000" w:themeColor="text1"/>
+        </w:rPr>
+      </w:pPr>
+      <w:r>
+        <w:rPr>
+          <w:b/>
+          <w:bCs/>
+          <w:color w:val="000000" w:themeColor="text1"/>
         </w:rPr>
         <w:t>SRBD Best Team Award, 2019</w:t>
       </w:r>
@@ -831,6 +1261,7 @@
       <w:pPr>
         <w:pStyle w:val="Space"/>
         <w:rPr>
+          <w:color w:val="000000" w:themeColor="text1"/>
           <w:sz w:val="10"/>
           <w:szCs w:val="10"/>
         </w:rPr>
@@ -839,92 +1270,140 @@
     <w:p>
       <w:pPr>
         <w:pStyle w:val="List"/>
+        <w:rPr>
+          <w:color w:val="000000" w:themeColor="text1"/>
+        </w:rPr>
       </w:pPr>
       <w:r>
         <w:rPr>
           <w:rStyle w:val="Emphasis"/>
-        </w:rPr>
-        <w:t>Samsung R&amp;D Institute Bangladesh Ltd.</w:t>
-      </w:r>
-      <w:r>
-        <w:rPr>
-          <w:rStyle w:val="Emphasis"/>
+          <w:color w:val="000000" w:themeColor="text1"/>
+        </w:rPr>
+        <w:lastRenderedPageBreak/>
+        <w:t xml:space="preserve">Samsung R&amp;D Institute Bangladesh Ltd. </w:t>
+      </w:r>
+      <w:r>
+        <w:rPr>
+          <w:color w:val="000000" w:themeColor="text1"/>
+        </w:rPr>
+        <w:t>| Engineer-II</w:t>
+      </w:r>
+      <w:r>
+        <w:rPr>
+          <w:color w:val="000000" w:themeColor="text1"/>
+        </w:rPr>
+        <w:tab/>
+      </w:r>
+      <w:r>
+        <w:rPr>
+          <w:color w:val="000000" w:themeColor="text1"/>
+        </w:rPr>
+        <w:t xml:space="preserve">Mar </w:t>
+      </w:r>
+      <w:r>
+        <w:rPr>
+          <w:color w:val="000000" w:themeColor="text1"/>
+        </w:rPr>
+        <w:t>20</w:t>
+      </w:r>
+      <w:r>
+        <w:rPr>
+          <w:color w:val="000000" w:themeColor="text1"/>
+        </w:rPr>
+        <w:t>17 –</w:t>
+      </w:r>
+      <w:r>
+        <w:rPr>
+          <w:color w:val="000000" w:themeColor="text1"/>
         </w:rPr>
         <w:t xml:space="preserve"> </w:t>
       </w:r>
       <w:r>
-        <w:t xml:space="preserve">| </w:t>
-      </w:r>
-      <w:r>
-        <w:t>Engineer-II</w:t>
-      </w:r>
-      <w:r>
-        <w:tab/>
-      </w:r>
-      <w:r>
-        <w:t xml:space="preserve">Mar </w:t>
-      </w:r>
-      <w:r>
+        <w:rPr>
+          <w:color w:val="000000" w:themeColor="text1"/>
+        </w:rPr>
+        <w:t xml:space="preserve">Feb </w:t>
+      </w:r>
+      <w:r>
+        <w:rPr>
+          <w:color w:val="000000" w:themeColor="text1"/>
+        </w:rPr>
         <w:t>20</w:t>
       </w:r>
       <w:r>
-        <w:t>17 –</w:t>
-      </w:r>
-      <w:r>
-        <w:t xml:space="preserve"> </w:t>
-      </w:r>
-      <w:r>
-        <w:t xml:space="preserve">Feb </w:t>
-      </w:r>
-      <w:r>
-        <w:t>20</w:t>
-      </w:r>
-      <w:r>
+        <w:rPr>
+          <w:color w:val="000000" w:themeColor="text1"/>
+        </w:rPr>
         <w:t>19</w:t>
       </w:r>
     </w:p>
     <w:p>
       <w:pPr>
         <w:pStyle w:val="ListBullet"/>
-      </w:pPr>
-      <w:r>
+        <w:rPr>
+          <w:color w:val="000000" w:themeColor="text1"/>
+        </w:rPr>
+      </w:pPr>
+      <w:r>
+        <w:rPr>
+          <w:color w:val="000000" w:themeColor="text1"/>
+        </w:rPr>
         <w:t xml:space="preserve">Built </w:t>
       </w:r>
       <w:r>
         <w:rPr>
           <w:b/>
           <w:bCs/>
+          <w:color w:val="000000" w:themeColor="text1"/>
         </w:rPr>
         <w:t>UI Automator</w:t>
       </w:r>
       <w:r>
+        <w:rPr>
+          <w:color w:val="000000" w:themeColor="text1"/>
+        </w:rPr>
         <w:t xml:space="preserve"> for Android &amp; Tizen used internally for B2B testing</w:t>
       </w:r>
     </w:p>
     <w:p>
       <w:pPr>
         <w:pStyle w:val="ListBullet"/>
-      </w:pPr>
-      <w:r>
+        <w:rPr>
+          <w:color w:val="000000" w:themeColor="text1"/>
+        </w:rPr>
+      </w:pPr>
+      <w:r>
+        <w:rPr>
+          <w:color w:val="000000" w:themeColor="text1"/>
+        </w:rPr>
         <w:t xml:space="preserve">Developed an </w:t>
       </w:r>
       <w:r>
         <w:rPr>
           <w:b/>
           <w:bCs/>
+          <w:color w:val="000000" w:themeColor="text1"/>
         </w:rPr>
         <w:t>iOS testing framework</w:t>
       </w:r>
       <w:r>
+        <w:rPr>
+          <w:color w:val="000000" w:themeColor="text1"/>
+        </w:rPr>
         <w:t xml:space="preserve"> similar to Appium</w:t>
       </w:r>
     </w:p>
     <w:p>
       <w:pPr>
         <w:pStyle w:val="ListBullet"/>
-      </w:pPr>
-      <w:r>
-        <w:lastRenderedPageBreak/>
+        <w:rPr>
+          <w:color w:val="000000" w:themeColor="text1"/>
+        </w:rPr>
+      </w:pPr>
+      <w:r>
+        <w:rPr>
+          <w:color w:val="000000" w:themeColor="text1"/>
+        </w:rPr>
         <w:t>Created Eclipse plugin for generating test cases and integrating tools</w:t>
       </w:r>
     </w:p>
@@ -939,6 +1418,7 @@
           <w:rStyle w:val="Emphasis"/>
           <w:b w:val="0"/>
           <w:iCs w:val="0"/>
+          <w:color w:val="000000" w:themeColor="text1"/>
           <w:sz w:val="16"/>
           <w:szCs w:val="16"/>
         </w:rPr>
@@ -947,55 +1427,42 @@
     <w:p>
       <w:pPr>
         <w:pStyle w:val="List"/>
+        <w:rPr>
+          <w:color w:val="000000" w:themeColor="text1"/>
+        </w:rPr>
       </w:pPr>
       <w:r>
         <w:rPr>
           <w:rStyle w:val="Emphasis"/>
-        </w:rPr>
-        <w:t>Samsung R&amp;D Institute Bangladesh Ltd.</w:t>
-      </w:r>
-      <w:r>
-        <w:rPr>
-          <w:rStyle w:val="Emphasis"/>
-        </w:rPr>
-        <w:t xml:space="preserve"> </w:t>
-      </w:r>
-      <w:r>
-        <w:t xml:space="preserve">| </w:t>
-      </w:r>
-      <w:r>
-        <w:t>Engineer-I</w:t>
-      </w:r>
-      <w:r>
+          <w:color w:val="000000" w:themeColor="text1"/>
+        </w:rPr>
+        <w:t xml:space="preserve">Samsung R&amp;D Institute Bangladesh Ltd. </w:t>
+      </w:r>
+      <w:r>
+        <w:rPr>
+          <w:color w:val="000000" w:themeColor="text1"/>
+        </w:rPr>
+        <w:t>| Engineer-I</w:t>
+      </w:r>
+      <w:r>
+        <w:rPr>
+          <w:color w:val="000000" w:themeColor="text1"/>
+        </w:rPr>
         <w:tab/>
-      </w:r>
-      <w:r>
-        <w:t xml:space="preserve">Jun </w:t>
-      </w:r>
-      <w:r>
-        <w:t>20</w:t>
-      </w:r>
-      <w:r>
-        <w:t>13 –</w:t>
-      </w:r>
-      <w:r>
-        <w:t xml:space="preserve"> </w:t>
-      </w:r>
-      <w:r>
-        <w:t xml:space="preserve">Feb </w:t>
-      </w:r>
-      <w:r>
-        <w:t>20</w:t>
-      </w:r>
-      <w:r>
-        <w:t>17</w:t>
+        <w:t>Jun 2013 – Feb 2017</w:t>
       </w:r>
     </w:p>
     <w:p>
       <w:pPr>
         <w:pStyle w:val="ListBullet"/>
-      </w:pPr>
-      <w:r>
+        <w:rPr>
+          <w:color w:val="000000" w:themeColor="text1"/>
+        </w:rPr>
+      </w:pPr>
+      <w:r>
+        <w:rPr>
+          <w:color w:val="000000" w:themeColor="text1"/>
+        </w:rPr>
         <w:t xml:space="preserve">Contributed to the development of the </w:t>
       </w:r>
       <w:proofErr w:type="spellStart"/>
@@ -1003,6 +1470,7 @@
         <w:rPr>
           <w:b/>
           <w:bCs/>
+          <w:color w:val="000000" w:themeColor="text1"/>
         </w:rPr>
         <w:t>IoTivity</w:t>
       </w:r>
@@ -1011,70 +1479,105 @@
         <w:rPr>
           <w:b/>
           <w:bCs/>
+          <w:color w:val="000000" w:themeColor="text1"/>
         </w:rPr>
         <w:t xml:space="preserve"> SDK</w:t>
       </w:r>
       <w:r>
+        <w:rPr>
+          <w:color w:val="000000" w:themeColor="text1"/>
+        </w:rPr>
         <w:t>, adopted by Samsung, LG, and Microsoft IoT products</w:t>
       </w:r>
     </w:p>
     <w:p>
       <w:pPr>
         <w:pStyle w:val="ListBullet"/>
-      </w:pPr>
-      <w:r>
+        <w:rPr>
+          <w:color w:val="000000" w:themeColor="text1"/>
+        </w:rPr>
+      </w:pPr>
+      <w:r>
+        <w:rPr>
+          <w:color w:val="000000" w:themeColor="text1"/>
+        </w:rPr>
         <w:t xml:space="preserve">Developed </w:t>
       </w:r>
       <w:r>
         <w:rPr>
           <w:b/>
           <w:bCs/>
+          <w:color w:val="000000" w:themeColor="text1"/>
         </w:rPr>
         <w:t>OCF-compliant APIs</w:t>
       </w:r>
       <w:r>
+        <w:rPr>
+          <w:color w:val="000000" w:themeColor="text1"/>
+        </w:rPr>
         <w:t xml:space="preserve"> for open-source IoT interoperability</w:t>
       </w:r>
     </w:p>
     <w:p>
       <w:pPr>
         <w:pStyle w:val="ListBullet"/>
-      </w:pPr>
-      <w:r>
+        <w:rPr>
+          <w:color w:val="000000" w:themeColor="text1"/>
+        </w:rPr>
+      </w:pPr>
+      <w:r>
+        <w:rPr>
+          <w:color w:val="000000" w:themeColor="text1"/>
+        </w:rPr>
         <w:t xml:space="preserve">Built a </w:t>
       </w:r>
       <w:r>
         <w:rPr>
           <w:b/>
           <w:bCs/>
+          <w:color w:val="000000" w:themeColor="text1"/>
         </w:rPr>
         <w:t>C# .NET desktop application</w:t>
       </w:r>
       <w:r>
+        <w:rPr>
+          <w:color w:val="000000" w:themeColor="text1"/>
+        </w:rPr>
         <w:t xml:space="preserve"> for remote control of Android and Tizen devices</w:t>
       </w:r>
     </w:p>
     <w:p>
       <w:pPr>
         <w:pStyle w:val="ListBullet"/>
-      </w:pPr>
-      <w:r>
+        <w:rPr>
+          <w:color w:val="000000" w:themeColor="text1"/>
+        </w:rPr>
+      </w:pPr>
+      <w:r>
+        <w:rPr>
+          <w:color w:val="000000" w:themeColor="text1"/>
+        </w:rPr>
         <w:t xml:space="preserve">Achieved </w:t>
       </w:r>
       <w:r>
         <w:rPr>
           <w:b/>
           <w:bCs/>
+          <w:color w:val="000000" w:themeColor="text1"/>
         </w:rPr>
         <w:t>Advanced Level</w:t>
       </w:r>
       <w:r>
+        <w:rPr>
+          <w:color w:val="000000" w:themeColor="text1"/>
+        </w:rPr>
         <w:t xml:space="preserve"> (Top 50%) in </w:t>
       </w:r>
       <w:r>
         <w:rPr>
           <w:b/>
           <w:bCs/>
+          <w:color w:val="000000" w:themeColor="text1"/>
         </w:rPr>
         <w:t>Samsung’s Software Certification Test</w:t>
       </w:r>
@@ -1087,6 +1590,7 @@
           <w:numId w:val="0"/>
         </w:numPr>
         <w:rPr>
+          <w:color w:val="000000" w:themeColor="text1"/>
           <w:sz w:val="16"/>
           <w:szCs w:val="16"/>
         </w:rPr>
@@ -1095,71 +1599,63 @@
     <w:p>
       <w:pPr>
         <w:pStyle w:val="List"/>
+        <w:rPr>
+          <w:color w:val="000000" w:themeColor="text1"/>
+        </w:rPr>
       </w:pPr>
       <w:r>
         <w:rPr>
           <w:rStyle w:val="Emphasis"/>
-        </w:rPr>
-        <w:t>RTC Hubs Limited</w:t>
-      </w:r>
-      <w:r>
-        <w:rPr>
-          <w:rStyle w:val="Emphasis"/>
-        </w:rPr>
-        <w:t xml:space="preserve"> </w:t>
-      </w:r>
-      <w:r>
-        <w:t xml:space="preserve">| </w:t>
-      </w:r>
-      <w:r>
-        <w:t>Junior Programmer</w:t>
-      </w:r>
-      <w:r>
+          <w:color w:val="000000" w:themeColor="text1"/>
+        </w:rPr>
+        <w:t xml:space="preserve">RTC Hubs Limited </w:t>
+      </w:r>
+      <w:r>
+        <w:rPr>
+          <w:color w:val="000000" w:themeColor="text1"/>
+        </w:rPr>
+        <w:t>| Junior Programmer</w:t>
+      </w:r>
+      <w:r>
+        <w:rPr>
+          <w:color w:val="000000" w:themeColor="text1"/>
+        </w:rPr>
         <w:tab/>
-      </w:r>
-      <w:r>
-        <w:t xml:space="preserve">Sep </w:t>
-      </w:r>
-      <w:r>
-        <w:t>20</w:t>
-      </w:r>
-      <w:r>
-        <w:t>12 –</w:t>
-      </w:r>
-      <w:r>
-        <w:t xml:space="preserve"> </w:t>
-      </w:r>
-      <w:r>
-        <w:t xml:space="preserve">Jun </w:t>
-      </w:r>
-      <w:r>
-        <w:t>20</w:t>
-      </w:r>
-      <w:r>
-        <w:t>13</w:t>
+        <w:t>Sep 2012 – Jun 2013</w:t>
       </w:r>
     </w:p>
     <w:p>
       <w:pPr>
         <w:pStyle w:val="ListBullet"/>
-      </w:pPr>
-      <w:r>
+        <w:rPr>
+          <w:color w:val="000000" w:themeColor="text1"/>
+        </w:rPr>
+      </w:pPr>
+      <w:r>
+        <w:rPr>
+          <w:color w:val="000000" w:themeColor="text1"/>
+        </w:rPr>
         <w:t xml:space="preserve">Created </w:t>
       </w:r>
       <w:r>
         <w:rPr>
           <w:b/>
           <w:bCs/>
+          <w:color w:val="000000" w:themeColor="text1"/>
         </w:rPr>
         <w:t xml:space="preserve">Multi Shot Cam, a top-charted app </w:t>
       </w:r>
       <w:r>
+        <w:rPr>
+          <w:color w:val="000000" w:themeColor="text1"/>
+        </w:rPr>
         <w:t>that generated the highest revenue at</w:t>
       </w:r>
       <w:r>
         <w:rPr>
           <w:b/>
           <w:bCs/>
+          <w:color w:val="000000" w:themeColor="text1"/>
         </w:rPr>
         <w:t xml:space="preserve"> RTC Hubs</w:t>
       </w:r>
@@ -1167,36 +1663,56 @@
     <w:p>
       <w:pPr>
         <w:pStyle w:val="ListBullet"/>
-      </w:pPr>
-      <w:r>
+        <w:rPr>
+          <w:color w:val="000000" w:themeColor="text1"/>
+        </w:rPr>
+      </w:pPr>
+      <w:r>
+        <w:rPr>
+          <w:color w:val="000000" w:themeColor="text1"/>
+        </w:rPr>
         <w:t xml:space="preserve">Developed </w:t>
       </w:r>
       <w:r>
         <w:rPr>
           <w:b/>
           <w:bCs/>
+          <w:color w:val="000000" w:themeColor="text1"/>
         </w:rPr>
         <w:t>8+ iOS applications</w:t>
       </w:r>
       <w:r>
+        <w:rPr>
+          <w:color w:val="000000" w:themeColor="text1"/>
+        </w:rPr>
         <w:t>, including camera and productivity tools</w:t>
       </w:r>
     </w:p>
     <w:p>
       <w:pPr>
         <w:pStyle w:val="ListBullet"/>
-      </w:pPr>
-      <w:r>
+        <w:rPr>
+          <w:color w:val="000000" w:themeColor="text1"/>
+        </w:rPr>
+      </w:pPr>
+      <w:r>
+        <w:rPr>
+          <w:color w:val="000000" w:themeColor="text1"/>
+        </w:rPr>
         <w:t xml:space="preserve">Implemented </w:t>
       </w:r>
       <w:r>
         <w:rPr>
           <w:b/>
           <w:bCs/>
+          <w:color w:val="000000" w:themeColor="text1"/>
         </w:rPr>
         <w:t>real-time camera effects</w:t>
       </w:r>
       <w:r>
+        <w:rPr>
+          <w:color w:val="000000" w:themeColor="text1"/>
+        </w:rPr>
         <w:t xml:space="preserve"> using </w:t>
       </w:r>
       <w:hyperlink r:id="rId12" w:history="1">
@@ -1206,12 +1722,16 @@
             <w:rStyle w:val="Hyperlink"/>
             <w:b/>
             <w:bCs/>
+            <w:color w:val="000000" w:themeColor="text1"/>
           </w:rPr>
           <w:t>GPUImage</w:t>
         </w:r>
         <w:proofErr w:type="spellEnd"/>
       </w:hyperlink>
       <w:r>
+        <w:rPr>
+          <w:color w:val="000000" w:themeColor="text1"/>
+        </w:rPr>
         <w:t xml:space="preserve"> in multiple apps</w:t>
       </w:r>
     </w:p>
@@ -1222,109 +1742,193 @@
           <w:ilvl w:val="0"/>
           <w:numId w:val="0"/>
         </w:numPr>
+        <w:rPr>
+          <w:color w:val="000000" w:themeColor="text1"/>
+        </w:rPr>
       </w:pPr>
     </w:p>
     <w:p>
       <w:pPr>
         <w:pStyle w:val="Heading1"/>
-      </w:pPr>
-      <w:r>
+        <w:rPr>
+          <w:color w:val="000000" w:themeColor="text1"/>
+        </w:rPr>
+      </w:pPr>
+      <w:r>
+        <w:rPr>
+          <w:color w:val="000000" w:themeColor="text1"/>
+        </w:rPr>
         <w:t>Mentoring and Leadership</w:t>
       </w:r>
     </w:p>
     <w:p>
       <w:pPr>
         <w:pStyle w:val="List"/>
+        <w:rPr>
+          <w:color w:val="000000" w:themeColor="text1"/>
+        </w:rPr>
       </w:pPr>
       <w:r>
         <w:rPr>
           <w:b/>
           <w:iCs/>
-        </w:rPr>
-        <w:t>SmartThings</w:t>
-      </w:r>
-      <w:r>
-        <w:rPr>
-          <w:b/>
+          <w:color w:val="000000" w:themeColor="text1"/>
+        </w:rPr>
+        <w:t>SmartThings (iOS)</w:t>
+      </w:r>
+      <w:r>
+        <w:rPr>
+          <w:bCs/>
           <w:iCs/>
-        </w:rPr>
-        <w:t xml:space="preserve"> (iOS)</w:t>
-      </w:r>
+          <w:color w:val="000000" w:themeColor="text1"/>
+        </w:rPr>
+        <w:t xml:space="preserve"> – Settings &amp; </w:t>
+      </w:r>
+      <w:proofErr w:type="spellStart"/>
       <w:r>
         <w:rPr>
           <w:bCs/>
           <w:iCs/>
-        </w:rPr>
-        <w:t xml:space="preserve"> – Settings &amp; </w:t>
+          <w:color w:val="000000" w:themeColor="text1"/>
+        </w:rPr>
+        <w:t>MapView</w:t>
+      </w:r>
+      <w:proofErr w:type="spellEnd"/>
+      <w:r>
+        <w:rPr>
+          <w:color w:val="000000" w:themeColor="text1"/>
+        </w:rPr>
+        <w:tab/>
+        <w:t>Mar 2024 – Present</w:t>
+      </w:r>
+    </w:p>
+    <w:p>
+      <w:pPr>
+        <w:pStyle w:val="ListBullet"/>
+        <w:rPr>
+          <w:color w:val="000000" w:themeColor="text1"/>
+        </w:rPr>
+      </w:pPr>
+      <w:r>
+        <w:rPr>
+          <w:b/>
+          <w:bCs/>
+          <w:color w:val="000000" w:themeColor="text1"/>
+        </w:rPr>
+        <w:t xml:space="preserve">Part </w:t>
+      </w:r>
+      <w:proofErr w:type="gramStart"/>
+      <w:r>
+        <w:rPr>
+          <w:b/>
+          <w:bCs/>
+          <w:color w:val="000000" w:themeColor="text1"/>
+        </w:rPr>
+        <w:t>Lead</w:t>
+      </w:r>
+      <w:proofErr w:type="gramEnd"/>
+      <w:r>
+        <w:rPr>
+          <w:color w:val="000000" w:themeColor="text1"/>
+        </w:rPr>
+        <w:t xml:space="preserve"> – managing roadmap, feature ownership, and development execution for a 6-member engineering team</w:t>
+      </w:r>
+    </w:p>
+    <w:p>
+      <w:pPr>
+        <w:pStyle w:val="ListBullet"/>
+        <w:rPr>
+          <w:color w:val="000000" w:themeColor="text1"/>
+        </w:rPr>
+      </w:pPr>
+      <w:r>
+        <w:rPr>
+          <w:color w:val="000000" w:themeColor="text1"/>
+        </w:rPr>
+        <w:t>Providing technical supervision and guidance, sharing best practices, and supporting team members in resolving complex development challenges</w:t>
+      </w:r>
+    </w:p>
+    <w:p>
+      <w:pPr>
+        <w:pStyle w:val="ListBullet"/>
+        <w:rPr>
+          <w:color w:val="000000" w:themeColor="text1"/>
+        </w:rPr>
+      </w:pPr>
+      <w:r>
+        <w:rPr>
+          <w:color w:val="000000" w:themeColor="text1"/>
+        </w:rPr>
+        <w:t>Mentoring new engineers to align with project standards, architecture, and coding conventions</w:t>
+      </w:r>
+    </w:p>
+    <w:p>
+      <w:pPr>
+        <w:pStyle w:val="ListBullet"/>
+        <w:rPr>
+          <w:color w:val="000000" w:themeColor="text1"/>
+        </w:rPr>
+      </w:pPr>
+      <w:r>
+        <w:rPr>
+          <w:color w:val="000000" w:themeColor="text1"/>
+        </w:rPr>
+        <w:t xml:space="preserve">Conducting hands-on training on Swift, Concurrency, </w:t>
       </w:r>
       <w:proofErr w:type="spellStart"/>
       <w:r>
         <w:rPr>
-          <w:bCs/>
-          <w:iCs/>
-        </w:rPr>
-        <w:t>MapView</w:t>
+          <w:color w:val="000000" w:themeColor="text1"/>
+        </w:rPr>
+        <w:t>SwiftUI</w:t>
       </w:r>
       <w:proofErr w:type="spellEnd"/>
       <w:r>
-        <w:tab/>
-      </w:r>
-      <w:r>
-        <w:t xml:space="preserve">Mar </w:t>
-      </w:r>
-      <w:r>
-        <w:t>20</w:t>
-      </w:r>
-      <w:r>
-        <w:t>24 –</w:t>
-      </w:r>
-      <w:r>
-        <w:t xml:space="preserve"> </w:t>
-      </w:r>
-      <w:r>
-        <w:t>Present</w:t>
+        <w:rPr>
+          <w:color w:val="000000" w:themeColor="text1"/>
+        </w:rPr>
+        <w:t xml:space="preserve">, and </w:t>
+      </w:r>
+      <w:proofErr w:type="spellStart"/>
+      <w:r>
+        <w:rPr>
+          <w:color w:val="000000" w:themeColor="text1"/>
+        </w:rPr>
+        <w:t>UIKit</w:t>
+      </w:r>
+      <w:proofErr w:type="spellEnd"/>
+      <w:r>
+        <w:rPr>
+          <w:color w:val="000000" w:themeColor="text1"/>
+        </w:rPr>
+        <w:t xml:space="preserve"> best practices, emphasizing maintainable architecture and high-quality code standards</w:t>
       </w:r>
     </w:p>
     <w:p>
       <w:pPr>
         <w:pStyle w:val="ListBullet"/>
-      </w:pPr>
-      <w:r>
-        <w:rPr>
-          <w:b/>
-          <w:bCs/>
-        </w:rPr>
-        <w:t xml:space="preserve">Part </w:t>
-      </w:r>
-      <w:proofErr w:type="gramStart"/>
-      <w:r>
-        <w:rPr>
-          <w:b/>
-          <w:bCs/>
-        </w:rPr>
-        <w:t>Lead</w:t>
-      </w:r>
-      <w:proofErr w:type="gramEnd"/>
-      <w:r>
-        <w:t xml:space="preserve"> -</w:t>
-      </w:r>
-      <w:r>
-        <w:t xml:space="preserve"> managing roadmap, feature ownership, and development execution</w:t>
-      </w:r>
-    </w:p>
-    <w:p>
-      <w:pPr>
-        <w:pStyle w:val="ListBullet"/>
-      </w:pPr>
-      <w:r>
+        <w:rPr>
+          <w:color w:val="000000" w:themeColor="text1"/>
+        </w:rPr>
+      </w:pPr>
+      <w:r>
+        <w:rPr>
+          <w:color w:val="000000" w:themeColor="text1"/>
+        </w:rPr>
         <w:t xml:space="preserve">Led responses to Market </w:t>
       </w:r>
       <w:proofErr w:type="spellStart"/>
       <w:r>
+        <w:rPr>
+          <w:color w:val="000000" w:themeColor="text1"/>
+        </w:rPr>
         <w:t>VoCs</w:t>
       </w:r>
       <w:proofErr w:type="spellEnd"/>
       <w:r>
+        <w:rPr>
+          <w:color w:val="000000" w:themeColor="text1"/>
+        </w:rPr>
         <w:t>, resolved QA issues, and ensured stakeholder alignment</w:t>
       </w:r>
     </w:p>
@@ -1336,6 +1940,7 @@
           <w:numId w:val="0"/>
         </w:numPr>
         <w:rPr>
+          <w:color w:val="000000" w:themeColor="text1"/>
           <w:sz w:val="14"/>
           <w:szCs w:val="14"/>
         </w:rPr>
@@ -1344,56 +1949,65 @@
     <w:p>
       <w:pPr>
         <w:pStyle w:val="List"/>
+        <w:rPr>
+          <w:color w:val="000000" w:themeColor="text1"/>
+        </w:rPr>
       </w:pPr>
       <w:r>
         <w:rPr>
           <w:b/>
           <w:iCs/>
+          <w:color w:val="000000" w:themeColor="text1"/>
         </w:rPr>
         <w:t>Samsung Medison – 5D Viewer</w:t>
       </w:r>
       <w:r>
+        <w:rPr>
+          <w:color w:val="000000" w:themeColor="text1"/>
+        </w:rPr>
         <w:tab/>
-      </w:r>
-      <w:r>
-        <w:t xml:space="preserve">Jan </w:t>
-      </w:r>
-      <w:r>
-        <w:t>20</w:t>
-      </w:r>
-      <w:r>
-        <w:t>23 –</w:t>
-      </w:r>
-      <w:r>
-        <w:t xml:space="preserve"> </w:t>
-      </w:r>
-      <w:r>
-        <w:t>Feb 2024</w:t>
+        <w:t>Jan 2023 – Feb 2024</w:t>
       </w:r>
     </w:p>
     <w:p>
       <w:pPr>
         <w:pStyle w:val="ListBullet"/>
-      </w:pPr>
-      <w:r>
+        <w:rPr>
+          <w:color w:val="000000" w:themeColor="text1"/>
+        </w:rPr>
+      </w:pPr>
+      <w:r>
+        <w:rPr>
+          <w:color w:val="000000" w:themeColor="text1"/>
+        </w:rPr>
         <w:t xml:space="preserve">Acted as </w:t>
       </w:r>
       <w:r>
         <w:rPr>
           <w:b/>
           <w:bCs/>
+          <w:color w:val="000000" w:themeColor="text1"/>
         </w:rPr>
         <w:t>Tech Lead</w:t>
       </w:r>
       <w:r>
+        <w:rPr>
+          <w:color w:val="000000" w:themeColor="text1"/>
+        </w:rPr>
         <w:t>, facilitating communication with HQ and managing comprehensive documentation.</w:t>
       </w:r>
     </w:p>
     <w:p>
       <w:pPr>
         <w:pStyle w:val="ListBullet"/>
-      </w:pPr>
-      <w:r>
+        <w:rPr>
+          <w:color w:val="000000" w:themeColor="text1"/>
+        </w:rPr>
+      </w:pPr>
+      <w:r>
+        <w:rPr>
+          <w:color w:val="000000" w:themeColor="text1"/>
+        </w:rPr>
         <w:t>Conducted knowledge-sharing sessions across teams to ensure seamless domain transfer</w:t>
       </w:r>
     </w:p>
@@ -1405,6 +2019,7 @@
           <w:numId w:val="0"/>
         </w:numPr>
         <w:rPr>
+          <w:color w:val="000000" w:themeColor="text1"/>
           <w:sz w:val="14"/>
           <w:szCs w:val="14"/>
         </w:rPr>
@@ -1413,10 +2028,14 @@
     <w:p>
       <w:pPr>
         <w:pStyle w:val="List"/>
+        <w:rPr>
+          <w:color w:val="000000" w:themeColor="text1"/>
+        </w:rPr>
       </w:pPr>
       <w:r>
         <w:rPr>
           <w:rStyle w:val="Emphasis"/>
+          <w:color w:val="000000" w:themeColor="text1"/>
         </w:rPr>
         <w:t xml:space="preserve">Samsung </w:t>
       </w:r>
@@ -1424,6 +2043,7 @@
       <w:r>
         <w:rPr>
           <w:rStyle w:val="Emphasis"/>
+          <w:color w:val="000000" w:themeColor="text1"/>
         </w:rPr>
         <w:t>DeX</w:t>
       </w:r>
@@ -1431,42 +2051,30 @@
       <w:r>
         <w:rPr>
           <w:rStyle w:val="Emphasis"/>
+          <w:color w:val="000000" w:themeColor="text1"/>
         </w:rPr>
         <w:t xml:space="preserve"> for PC</w:t>
       </w:r>
       <w:r>
+        <w:rPr>
+          <w:color w:val="000000" w:themeColor="text1"/>
+        </w:rPr>
         <w:tab/>
-      </w:r>
-      <w:r>
-        <w:t xml:space="preserve">Mar </w:t>
-      </w:r>
-      <w:r>
-        <w:t>20</w:t>
-      </w:r>
-      <w:r>
-        <w:t>19 –</w:t>
-      </w:r>
-      <w:r>
-        <w:t xml:space="preserve"> </w:t>
-      </w:r>
-      <w:r>
-        <w:t xml:space="preserve">Dec </w:t>
-      </w:r>
-      <w:r>
-        <w:t>20</w:t>
-      </w:r>
-      <w:r>
-        <w:t>22</w:t>
+        <w:t>Mar 2019 – Dec 2022</w:t>
       </w:r>
     </w:p>
     <w:p>
       <w:pPr>
         <w:pStyle w:val="ListBullet"/>
-      </w:pPr>
-      <w:r>
-        <w:rPr>
-          <w:b/>
-          <w:bCs/>
+        <w:rPr>
+          <w:color w:val="000000" w:themeColor="text1"/>
+        </w:rPr>
+      </w:pPr>
+      <w:r>
+        <w:rPr>
+          <w:b/>
+          <w:bCs/>
+          <w:color w:val="000000" w:themeColor="text1"/>
         </w:rPr>
         <w:t xml:space="preserve">Tech </w:t>
       </w:r>
@@ -1475,86 +2083,127 @@
         <w:rPr>
           <w:b/>
           <w:bCs/>
+          <w:color w:val="000000" w:themeColor="text1"/>
         </w:rPr>
         <w:t>Lead</w:t>
       </w:r>
       <w:proofErr w:type="gramEnd"/>
       <w:r>
-        <w:t xml:space="preserve"> -</w:t>
-      </w:r>
-      <w:r>
-        <w:t xml:space="preserve"> responsible for feature planning, delivery, and cross-platform coordination</w:t>
+        <w:rPr>
+          <w:color w:val="000000" w:themeColor="text1"/>
+        </w:rPr>
+        <w:t xml:space="preserve"> - responsible for feature planning, delivery, and cross-platform coordination</w:t>
       </w:r>
     </w:p>
     <w:p>
       <w:pPr>
         <w:pStyle w:val="ListBullet"/>
-      </w:pPr>
-      <w:r>
+        <w:rPr>
+          <w:color w:val="000000" w:themeColor="text1"/>
+        </w:rPr>
+      </w:pPr>
+      <w:r>
+        <w:rPr>
+          <w:color w:val="000000" w:themeColor="text1"/>
+        </w:rPr>
         <w:t xml:space="preserve">Mentored </w:t>
       </w:r>
       <w:r>
         <w:rPr>
           <w:b/>
           <w:bCs/>
+          <w:color w:val="000000" w:themeColor="text1"/>
         </w:rPr>
         <w:t>12+ engineers</w:t>
       </w:r>
       <w:r>
+        <w:rPr>
+          <w:color w:val="000000" w:themeColor="text1"/>
+        </w:rPr>
         <w:t>, ensuring timely and high-quality deliverables.</w:t>
       </w:r>
     </w:p>
     <w:p>
       <w:pPr>
         <w:pStyle w:val="ListBullet"/>
-      </w:pPr>
-      <w:r>
+        <w:rPr>
+          <w:color w:val="000000" w:themeColor="text1"/>
+        </w:rPr>
+      </w:pPr>
+      <w:r>
+        <w:rPr>
+          <w:color w:val="000000" w:themeColor="text1"/>
+        </w:rPr>
         <w:t xml:space="preserve">Served as </w:t>
       </w:r>
       <w:r>
         <w:rPr>
           <w:b/>
           <w:bCs/>
+          <w:color w:val="000000" w:themeColor="text1"/>
         </w:rPr>
         <w:t>Lead Developer</w:t>
       </w:r>
       <w:r>
+        <w:rPr>
+          <w:color w:val="000000" w:themeColor="text1"/>
+        </w:rPr>
         <w:t xml:space="preserve"> (macOS), overseeing architecture, implementation, and release pipeline</w:t>
       </w:r>
     </w:p>
     <w:p>
       <w:pPr>
         <w:pStyle w:val="ListBullet"/>
-      </w:pPr>
-      <w:r>
+        <w:rPr>
+          <w:color w:val="000000" w:themeColor="text1"/>
+        </w:rPr>
+      </w:pPr>
+      <w:r>
+        <w:rPr>
+          <w:color w:val="000000" w:themeColor="text1"/>
+        </w:rPr>
         <w:t xml:space="preserve">Delivered a PoC of the </w:t>
       </w:r>
       <w:r>
         <w:rPr>
           <w:b/>
           <w:bCs/>
+          <w:color w:val="000000" w:themeColor="text1"/>
         </w:rPr>
         <w:t>macOS</w:t>
       </w:r>
       <w:r>
+        <w:rPr>
+          <w:color w:val="000000" w:themeColor="text1"/>
+        </w:rPr>
         <w:t xml:space="preserve"> client to the </w:t>
       </w:r>
       <w:r>
         <w:rPr>
           <w:b/>
           <w:bCs/>
+          <w:color w:val="000000" w:themeColor="text1"/>
         </w:rPr>
         <w:t>CTO</w:t>
       </w:r>
       <w:r>
+        <w:rPr>
+          <w:color w:val="000000" w:themeColor="text1"/>
+        </w:rPr>
         <w:t xml:space="preserve"> of Samsung Electronics, securing executive alignment</w:t>
       </w:r>
     </w:p>
     <w:p>
       <w:pPr>
         <w:pStyle w:val="ListBullet"/>
-      </w:pPr>
-      <w:r>
+        <w:rPr>
+          <w:color w:val="000000" w:themeColor="text1"/>
+        </w:rPr>
+      </w:pPr>
+      <w:r>
+        <w:rPr>
+          <w:color w:val="000000" w:themeColor="text1"/>
+        </w:rPr>
         <w:t>Collaborated with Product Managers and VPs to define functional and non-functional requirements</w:t>
       </w:r>
     </w:p>
@@ -1566,6 +2215,7 @@
           <w:numId w:val="0"/>
         </w:numPr>
         <w:rPr>
+          <w:color w:val="000000" w:themeColor="text1"/>
           <w:sz w:val="14"/>
           <w:szCs w:val="14"/>
         </w:rPr>
@@ -1574,42 +2224,65 @@
     <w:p>
       <w:pPr>
         <w:pStyle w:val="List"/>
+        <w:rPr>
+          <w:color w:val="000000" w:themeColor="text1"/>
+        </w:rPr>
       </w:pPr>
       <w:r>
         <w:rPr>
           <w:b/>
           <w:iCs/>
-        </w:rPr>
-        <w:t>Organization-wide</w:t>
-      </w:r>
-      <w:r>
+          <w:color w:val="000000" w:themeColor="text1"/>
+        </w:rPr>
+        <w:t>Organization-wide Contributions</w:t>
+      </w:r>
+      <w:r>
+        <w:rPr>
+          <w:color w:val="000000" w:themeColor="text1"/>
+        </w:rPr>
         <w:tab/>
       </w:r>
     </w:p>
     <w:p>
       <w:pPr>
         <w:pStyle w:val="ListBullet"/>
-      </w:pPr>
-      <w:r>
+        <w:rPr>
+          <w:color w:val="000000" w:themeColor="text1"/>
+        </w:rPr>
+      </w:pPr>
+      <w:r>
+        <w:rPr>
+          <w:color w:val="000000" w:themeColor="text1"/>
+        </w:rPr>
         <w:t xml:space="preserve">Onboarded </w:t>
       </w:r>
       <w:r>
         <w:rPr>
           <w:b/>
           <w:bCs/>
-        </w:rPr>
-        <w:t>5+ new engineers</w:t>
-      </w:r>
-      <w:r>
-        <w:t xml:space="preserve"> across multiple projects</w:t>
+          <w:color w:val="000000" w:themeColor="text1"/>
+        </w:rPr>
+        <w:t>7 new engineers</w:t>
+      </w:r>
+      <w:r>
+        <w:rPr>
+          <w:color w:val="000000" w:themeColor="text1"/>
+        </w:rPr>
+        <w:t xml:space="preserve"> across multiple projects, ensuring smooth integration into team workflows and technical environments</w:t>
       </w:r>
     </w:p>
     <w:p>
       <w:pPr>
         <w:pStyle w:val="ListBullet"/>
-      </w:pPr>
-      <w:r>
-        <w:t>Actively participated in recruitment processes, including technical interviews and evaluations</w:t>
+        <w:rPr>
+          <w:color w:val="000000" w:themeColor="text1"/>
+        </w:rPr>
+      </w:pPr>
+      <w:r>
+        <w:rPr>
+          <w:color w:val="000000" w:themeColor="text1"/>
+        </w:rPr>
+        <w:t>Actively contributed to recruitment processes, conducting technical interviews and evaluations</w:t>
       </w:r>
     </w:p>
     <w:p>
@@ -1619,63 +2292,92 @@
           <w:ilvl w:val="0"/>
           <w:numId w:val="0"/>
         </w:numPr>
+        <w:rPr>
+          <w:color w:val="000000" w:themeColor="text1"/>
+        </w:rPr>
       </w:pPr>
     </w:p>
     <w:p>
       <w:pPr>
         <w:pStyle w:val="Heading1"/>
-      </w:pPr>
-      <w:r>
-        <w:t xml:space="preserve">Education </w:t>
-      </w:r>
-      <w:r>
-        <w:t>a</w:t>
-      </w:r>
-      <w:r>
-        <w:t>nd Certification</w:t>
+        <w:rPr>
+          <w:color w:val="000000" w:themeColor="text1"/>
+        </w:rPr>
+      </w:pPr>
+      <w:r>
+        <w:rPr>
+          <w:color w:val="000000" w:themeColor="text1"/>
+        </w:rPr>
+        <w:t>Education and Certification</w:t>
       </w:r>
     </w:p>
     <w:p>
       <w:pPr>
         <w:pStyle w:val="List"/>
-      </w:pPr>
-      <w:r>
-        <w:rPr>
-          <w:b/>
-          <w:bCs/>
+        <w:rPr>
+          <w:color w:val="000000" w:themeColor="text1"/>
+        </w:rPr>
+      </w:pPr>
+      <w:r>
+        <w:rPr>
+          <w:b/>
+          <w:bCs/>
+          <w:color w:val="000000" w:themeColor="text1"/>
         </w:rPr>
         <w:t xml:space="preserve">B.Sc. </w:t>
       </w:r>
       <w:r>
+        <w:rPr>
+          <w:color w:val="000000" w:themeColor="text1"/>
+        </w:rPr>
         <w:t>in</w:t>
       </w:r>
       <w:r>
         <w:rPr>
           <w:b/>
           <w:bCs/>
+          <w:color w:val="000000" w:themeColor="text1"/>
         </w:rPr>
         <w:t xml:space="preserve"> Computer Science and Engineering</w:t>
       </w:r>
       <w:r>
+        <w:rPr>
+          <w:color w:val="000000" w:themeColor="text1"/>
+        </w:rPr>
         <w:tab/>
       </w:r>
     </w:p>
     <w:p>
       <w:pPr>
         <w:pStyle w:val="List"/>
+        <w:rPr>
+          <w:color w:val="000000" w:themeColor="text1"/>
+        </w:rPr>
       </w:pPr>
       <w:proofErr w:type="spellStart"/>
       <w:r>
+        <w:rPr>
+          <w:color w:val="000000" w:themeColor="text1"/>
+        </w:rPr>
         <w:t>Rajshahi</w:t>
       </w:r>
       <w:proofErr w:type="spellEnd"/>
       <w:r>
+        <w:rPr>
+          <w:color w:val="000000" w:themeColor="text1"/>
+        </w:rPr>
         <w:t xml:space="preserve"> University of Engineering &amp; Technology</w:t>
       </w:r>
       <w:r>
+        <w:rPr>
+          <w:color w:val="000000" w:themeColor="text1"/>
+        </w:rPr>
         <w:tab/>
       </w:r>
       <w:r>
+        <w:rPr>
+          <w:color w:val="000000" w:themeColor="text1"/>
+        </w:rPr>
         <w:t>Feb 2008 – Sep 2012</w:t>
       </w:r>
     </w:p>

</xml_diff>

<commit_message>
Updated Resume to v3.1
</commit_message>
<xml_diff>
--- a/assets/resume/Resume_Md-Arafat-Hossain.docx
+++ b/assets/resume/Resume_Md-Arafat-Hossain.docx
@@ -322,7 +322,7 @@
           <w:sz w:val="20"/>
           <w:szCs w:val="20"/>
         </w:rPr>
-        <w:t>, MVVM, MVVM-C, Redux</w:t>
+        <w:t>, MVVM, MVVM-C, State Management Architecture</w:t>
       </w:r>
     </w:p>
     <w:p>
@@ -345,25 +345,7 @@
           <w:sz w:val="20"/>
           <w:szCs w:val="20"/>
         </w:rPr>
-        <w:t xml:space="preserve">RESTful API integration, </w:t>
-      </w:r>
-      <w:proofErr w:type="spellStart"/>
-      <w:r>
-        <w:rPr>
-          <w:color w:val="000000" w:themeColor="text1"/>
-          <w:sz w:val="20"/>
-          <w:szCs w:val="20"/>
-        </w:rPr>
-        <w:t>XCTest</w:t>
-      </w:r>
-      <w:proofErr w:type="spellEnd"/>
-      <w:r>
-        <w:rPr>
-          <w:color w:val="000000" w:themeColor="text1"/>
-          <w:sz w:val="20"/>
-          <w:szCs w:val="20"/>
-        </w:rPr>
-        <w:t>, Time Profiler</w:t>
+        <w:t>Deep Linking, Universal Links</w:t>
       </w:r>
     </w:p>
     <w:p>
@@ -386,7 +368,25 @@
           <w:sz w:val="20"/>
           <w:szCs w:val="20"/>
         </w:rPr>
-        <w:t>Embedded rendering integration (Godot Engine)</w:t>
+        <w:t xml:space="preserve">RESTful API integration, </w:t>
+      </w:r>
+      <w:proofErr w:type="spellStart"/>
+      <w:r>
+        <w:rPr>
+          <w:color w:val="000000" w:themeColor="text1"/>
+          <w:sz w:val="20"/>
+          <w:szCs w:val="20"/>
+        </w:rPr>
+        <w:t>XCTest</w:t>
+      </w:r>
+      <w:proofErr w:type="spellEnd"/>
+      <w:r>
+        <w:rPr>
+          <w:color w:val="000000" w:themeColor="text1"/>
+          <w:sz w:val="20"/>
+          <w:szCs w:val="20"/>
+        </w:rPr>
+        <w:t>, Time Profiler</w:t>
       </w:r>
     </w:p>
     <w:p>
@@ -409,7 +409,25 @@
           <w:sz w:val="20"/>
           <w:szCs w:val="20"/>
         </w:rPr>
-        <w:t>Cross-platform architecture &amp; IPC</w:t>
+        <w:t xml:space="preserve">Swift Package Manager (SPM), </w:t>
+      </w:r>
+      <w:proofErr w:type="spellStart"/>
+      <w:r>
+        <w:rPr>
+          <w:color w:val="000000" w:themeColor="text1"/>
+          <w:sz w:val="20"/>
+          <w:szCs w:val="20"/>
+        </w:rPr>
+        <w:t>CocoaPods</w:t>
+      </w:r>
+      <w:proofErr w:type="spellEnd"/>
+      <w:r>
+        <w:rPr>
+          <w:color w:val="000000" w:themeColor="text1"/>
+          <w:sz w:val="20"/>
+          <w:szCs w:val="20"/>
+        </w:rPr>
+        <w:t>, Carthage</w:t>
       </w:r>
     </w:p>
     <w:p>
@@ -432,8 +450,18 @@
           <w:sz w:val="20"/>
           <w:szCs w:val="20"/>
         </w:rPr>
-        <w:t>macOS notarization &amp; release pipeline</w:t>
-      </w:r>
+        <w:t xml:space="preserve">Firebase, </w:t>
+      </w:r>
+      <w:proofErr w:type="spellStart"/>
+      <w:r>
+        <w:rPr>
+          <w:color w:val="000000" w:themeColor="text1"/>
+          <w:sz w:val="20"/>
+          <w:szCs w:val="20"/>
+        </w:rPr>
+        <w:t>Alamofire</w:t>
+      </w:r>
+      <w:proofErr w:type="spellEnd"/>
     </w:p>
     <w:p>
       <w:pPr>
@@ -455,7 +483,7 @@
           <w:sz w:val="20"/>
           <w:szCs w:val="20"/>
         </w:rPr>
-        <w:t>Open-source contribution workflows</w:t>
+        <w:t>Analytics &amp; crash reporting (Firebase Crashlytics, Google Analytics)</w:t>
       </w:r>
     </w:p>
     <w:p>
@@ -478,7 +506,7 @@
           <w:sz w:val="20"/>
           <w:szCs w:val="20"/>
         </w:rPr>
-        <w:t>Git, GitHub, GitHub Actions, Jenkins, Perforce</w:t>
+        <w:t>Feature flagging &amp; remote configuration</w:t>
       </w:r>
     </w:p>
     <w:p>
@@ -491,23 +519,130 @@
         <w:jc w:val="left"/>
         <w:rPr>
           <w:color w:val="000000" w:themeColor="text1"/>
-        </w:rPr>
-      </w:pPr>
-      <w:r>
-        <w:rPr>
-          <w:color w:val="000000" w:themeColor="text1"/>
-          <w:sz w:val="20"/>
-          <w:szCs w:val="20"/>
-        </w:rPr>
-        <w:t>C/C++, C#, Java, WPF, MFC</w:t>
-      </w:r>
-      <w:r>
-        <w:rPr>
-          <w:color w:val="000000" w:themeColor="text1"/>
-          <w:sz w:val="20"/>
-          <w:szCs w:val="20"/>
-        </w:rPr>
-        <w:t>, Android (Java)</w:t>
+          <w:sz w:val="20"/>
+          <w:szCs w:val="20"/>
+        </w:rPr>
+      </w:pPr>
+      <w:r>
+        <w:rPr>
+          <w:color w:val="000000" w:themeColor="text1"/>
+          <w:sz w:val="20"/>
+          <w:szCs w:val="20"/>
+        </w:rPr>
+        <w:t>Embedded rendering integration (Godot Engine)</w:t>
+      </w:r>
+    </w:p>
+    <w:p>
+      <w:pPr>
+        <w:pStyle w:val="ListParagraph"/>
+        <w:numPr>
+          <w:ilvl w:val="0"/>
+          <w:numId w:val="13"/>
+        </w:numPr>
+        <w:jc w:val="left"/>
+        <w:rPr>
+          <w:color w:val="000000" w:themeColor="text1"/>
+          <w:sz w:val="20"/>
+          <w:szCs w:val="20"/>
+        </w:rPr>
+      </w:pPr>
+      <w:r>
+        <w:rPr>
+          <w:color w:val="000000" w:themeColor="text1"/>
+          <w:sz w:val="20"/>
+          <w:szCs w:val="20"/>
+        </w:rPr>
+        <w:t>App Store &amp; Google Play release management, TestFlight, macOS notarization &amp; release pipeline</w:t>
+      </w:r>
+    </w:p>
+    <w:p>
+      <w:pPr>
+        <w:pStyle w:val="ListParagraph"/>
+        <w:numPr>
+          <w:ilvl w:val="0"/>
+          <w:numId w:val="13"/>
+        </w:numPr>
+        <w:jc w:val="left"/>
+        <w:rPr>
+          <w:color w:val="000000" w:themeColor="text1"/>
+          <w:sz w:val="20"/>
+          <w:szCs w:val="20"/>
+        </w:rPr>
+      </w:pPr>
+      <w:r>
+        <w:rPr>
+          <w:color w:val="000000" w:themeColor="text1"/>
+          <w:sz w:val="20"/>
+          <w:szCs w:val="20"/>
+        </w:rPr>
+        <w:t>Agile/Scrum development methodology</w:t>
+      </w:r>
+    </w:p>
+    <w:p>
+      <w:pPr>
+        <w:pStyle w:val="ListParagraph"/>
+        <w:numPr>
+          <w:ilvl w:val="0"/>
+          <w:numId w:val="13"/>
+        </w:numPr>
+        <w:jc w:val="left"/>
+        <w:rPr>
+          <w:color w:val="000000" w:themeColor="text1"/>
+          <w:sz w:val="20"/>
+          <w:szCs w:val="20"/>
+        </w:rPr>
+      </w:pPr>
+      <w:r>
+        <w:rPr>
+          <w:color w:val="000000" w:themeColor="text1"/>
+          <w:sz w:val="20"/>
+          <w:szCs w:val="20"/>
+        </w:rPr>
+        <w:t>Open-source contribution workflows</w:t>
+      </w:r>
+    </w:p>
+    <w:p>
+      <w:pPr>
+        <w:pStyle w:val="ListParagraph"/>
+        <w:numPr>
+          <w:ilvl w:val="0"/>
+          <w:numId w:val="13"/>
+        </w:numPr>
+        <w:jc w:val="left"/>
+        <w:rPr>
+          <w:color w:val="000000" w:themeColor="text1"/>
+          <w:sz w:val="20"/>
+          <w:szCs w:val="20"/>
+        </w:rPr>
+      </w:pPr>
+      <w:r>
+        <w:rPr>
+          <w:color w:val="000000" w:themeColor="text1"/>
+          <w:sz w:val="20"/>
+          <w:szCs w:val="20"/>
+        </w:rPr>
+        <w:t>Git, GitHub, GitHub Actions, Jenkins, Perforce</w:t>
+      </w:r>
+    </w:p>
+    <w:p>
+      <w:pPr>
+        <w:pStyle w:val="ListParagraph"/>
+        <w:numPr>
+          <w:ilvl w:val="0"/>
+          <w:numId w:val="13"/>
+        </w:numPr>
+        <w:jc w:val="left"/>
+        <w:rPr>
+          <w:color w:val="000000" w:themeColor="text1"/>
+        </w:rPr>
+      </w:pPr>
+      <w:r>
+        <w:rPr>
+          <w:color w:val="000000" w:themeColor="text1"/>
+          <w:sz w:val="20"/>
+          <w:szCs w:val="20"/>
+        </w:rPr>
+        <w:t>C/C++, C#, Java, WPF, MFC, Android (Java)</w:t>
       </w:r>
     </w:p>
     <w:p>
@@ -953,7 +1088,7 @@
           <w:sz w:val="20"/>
           <w:szCs w:val="20"/>
         </w:rPr>
-        <w:t>Modernized UI and improved IPC for Samsung Medison 5D Viewer (WPF) used in medical ultrasound systems.</w:t>
+        <w:t>Awarded Star Employee of the Month (January 2026).</w:t>
       </w:r>
     </w:p>
     <w:p>
@@ -975,25 +1110,7 @@
           <w:sz w:val="20"/>
           <w:szCs w:val="20"/>
         </w:rPr>
-        <w:t xml:space="preserve">Technical Lead for Samsung </w:t>
-      </w:r>
-      <w:proofErr w:type="spellStart"/>
-      <w:r>
-        <w:rPr>
-          <w:color w:val="000000" w:themeColor="text1"/>
-          <w:sz w:val="20"/>
-          <w:szCs w:val="20"/>
-        </w:rPr>
-        <w:t>DeX</w:t>
-      </w:r>
-      <w:proofErr w:type="spellEnd"/>
-      <w:r>
-        <w:rPr>
-          <w:color w:val="000000" w:themeColor="text1"/>
-          <w:sz w:val="20"/>
-          <w:szCs w:val="20"/>
-        </w:rPr>
-        <w:t xml:space="preserve"> for PC (7M+ downloads, 757K+ monthly users), contributing to planning, architecture, and optimization.</w:t>
+        <w:t>Achieved Professional Level (Top 20%) in Samsung’s SW Certificate Test.</w:t>
       </w:r>
     </w:p>
     <w:p>
@@ -1015,7 +1132,7 @@
           <w:sz w:val="20"/>
           <w:szCs w:val="20"/>
         </w:rPr>
-        <w:t>Performed memory optimization and code reviews for MFC-based Windows applications.</w:t>
+        <w:t>Modernized UI and improved IPC for Samsung Medison 5D Viewer (WPF) used in medical ultrasound systems.</w:t>
       </w:r>
     </w:p>
     <w:p>
@@ -1037,7 +1154,25 @@
           <w:sz w:val="20"/>
           <w:szCs w:val="20"/>
         </w:rPr>
-        <w:t>Achieved Professional Level (Top 20%) in Samsung’s SW Certificate Test.</w:t>
+        <w:t xml:space="preserve">Technical Lead for Samsung </w:t>
+      </w:r>
+      <w:proofErr w:type="spellStart"/>
+      <w:r>
+        <w:rPr>
+          <w:color w:val="000000" w:themeColor="text1"/>
+          <w:sz w:val="20"/>
+          <w:szCs w:val="20"/>
+        </w:rPr>
+        <w:t>DeX</w:t>
+      </w:r>
+      <w:proofErr w:type="spellEnd"/>
+      <w:r>
+        <w:rPr>
+          <w:color w:val="000000" w:themeColor="text1"/>
+          <w:sz w:val="20"/>
+          <w:szCs w:val="20"/>
+        </w:rPr>
+        <w:t xml:space="preserve"> for PC (7M+ downloads, 757K+ monthly users), contributing to planning, architecture, and optimization.</w:t>
       </w:r>
     </w:p>
     <w:p>
@@ -1059,7 +1194,8 @@
           <w:sz w:val="20"/>
           <w:szCs w:val="20"/>
         </w:rPr>
-        <w:t>Awarded Star Employee of the Month (January 2026).</w:t>
+        <w:lastRenderedPageBreak/>
+        <w:t>Performed memory optimization and code reviews for MFC-based Windows applications.</w:t>
       </w:r>
     </w:p>
     <w:p>
@@ -1200,7 +1336,6 @@
           <w:sz w:val="20"/>
           <w:szCs w:val="20"/>
         </w:rPr>
-        <w:lastRenderedPageBreak/>
         <w:t>Implemented USB and wireless connectivity between Android devices and macOS.</w:t>
       </w:r>
     </w:p>
@@ -1557,64 +1692,6 @@
           <w:szCs w:val="20"/>
         </w:rPr>
         <w:t>Built a C# .NET desktop application to remotely control Android &amp; Tizen devices.</w:t>
-      </w:r>
-    </w:p>
-    <w:p>
-      <w:pPr>
-        <w:pStyle w:val="List"/>
-        <w:numPr>
-          <w:ilvl w:val="0"/>
-          <w:numId w:val="20"/>
-        </w:numPr>
-        <w:rPr>
-          <w:color w:val="000000" w:themeColor="text1"/>
-          <w:sz w:val="20"/>
-          <w:szCs w:val="20"/>
-        </w:rPr>
-      </w:pPr>
-      <w:r>
-        <w:rPr>
-          <w:color w:val="000000" w:themeColor="text1"/>
-          <w:sz w:val="20"/>
-          <w:szCs w:val="20"/>
-        </w:rPr>
-        <w:t xml:space="preserve">Achieved </w:t>
-      </w:r>
-      <w:r>
-        <w:rPr>
-          <w:b/>
-          <w:bCs/>
-          <w:color w:val="000000" w:themeColor="text1"/>
-          <w:sz w:val="20"/>
-          <w:szCs w:val="20"/>
-        </w:rPr>
-        <w:t>Advanced</w:t>
-      </w:r>
-      <w:r>
-        <w:rPr>
-          <w:color w:val="000000" w:themeColor="text1"/>
-          <w:sz w:val="20"/>
-          <w:szCs w:val="20"/>
-        </w:rPr>
-        <w:t xml:space="preserve"> Level (Top 50%) in Samsung’s </w:t>
-      </w:r>
-      <w:r>
-        <w:rPr>
-          <w:b/>
-          <w:bCs/>
-          <w:color w:val="000000" w:themeColor="text1"/>
-          <w:sz w:val="20"/>
-          <w:szCs w:val="20"/>
-        </w:rPr>
-        <w:t>SW Certificate</w:t>
-      </w:r>
-      <w:r>
-        <w:rPr>
-          <w:color w:val="000000" w:themeColor="text1"/>
-          <w:sz w:val="20"/>
-          <w:szCs w:val="20"/>
-        </w:rPr>
-        <w:t xml:space="preserve"> Test.</w:t>
       </w:r>
     </w:p>
     <w:p>
@@ -2019,11 +2096,26 @@
       </w:pPr>
       <w:r>
         <w:rPr>
-          <w:b/>
-          <w:iCs/>
-          <w:color w:val="000000" w:themeColor="text1"/>
-        </w:rPr>
-        <w:t>Samsung Medison – 5D Viewer</w:t>
+          <w:rStyle w:val="Emphasis"/>
+          <w:color w:val="000000" w:themeColor="text1"/>
+        </w:rPr>
+        <w:t xml:space="preserve">Samsung </w:t>
+      </w:r>
+      <w:proofErr w:type="spellStart"/>
+      <w:r>
+        <w:rPr>
+          <w:rStyle w:val="Emphasis"/>
+          <w:color w:val="000000" w:themeColor="text1"/>
+        </w:rPr>
+        <w:t>DeX</w:t>
+      </w:r>
+      <w:proofErr w:type="spellEnd"/>
+      <w:r>
+        <w:rPr>
+          <w:rStyle w:val="Emphasis"/>
+          <w:color w:val="000000" w:themeColor="text1"/>
+        </w:rPr>
+        <w:t xml:space="preserve"> for PC</w:t>
       </w:r>
       <w:r>
         <w:rPr>
@@ -2035,7 +2127,7 @@
         <w:rPr>
           <w:color w:val="000000" w:themeColor="text1"/>
         </w:rPr>
-        <w:t>Jan 2023 – Feb 2024</w:t>
+        <w:t>Mar 2019 – Dec 2022</w:t>
       </w:r>
     </w:p>
     <w:p>
@@ -2043,7 +2135,7 @@
         <w:pStyle w:val="List"/>
         <w:numPr>
           <w:ilvl w:val="0"/>
-          <w:numId w:val="23"/>
+          <w:numId w:val="24"/>
         </w:numPr>
         <w:rPr>
           <w:color w:val="000000" w:themeColor="text1"/>
@@ -2079,7 +2171,7 @@
           <w:sz w:val="20"/>
           <w:szCs w:val="20"/>
         </w:rPr>
-        <w:t xml:space="preserve"> overseeing documentation, cross-team collaboration, and knowledge sharing.</w:t>
+        <w:t xml:space="preserve"> for Windows/macOS/Android teams; ensured high-quality feature delivery.</w:t>
       </w:r>
     </w:p>
     <w:p>
@@ -2087,7 +2179,7 @@
         <w:pStyle w:val="List"/>
         <w:numPr>
           <w:ilvl w:val="0"/>
-          <w:numId w:val="23"/>
+          <w:numId w:val="24"/>
         </w:numPr>
         <w:rPr>
           <w:color w:val="000000" w:themeColor="text1"/>
@@ -2101,7 +2193,69 @@
           <w:sz w:val="20"/>
           <w:szCs w:val="20"/>
         </w:rPr>
-        <w:t>Facilitated onboarding and architecture clarification for distributed teams.</w:t>
+        <w:t xml:space="preserve">Mentored </w:t>
+      </w:r>
+      <w:r>
+        <w:rPr>
+          <w:b/>
+          <w:bCs/>
+          <w:color w:val="000000" w:themeColor="text1"/>
+          <w:sz w:val="20"/>
+          <w:szCs w:val="20"/>
+        </w:rPr>
+        <w:t>12+ engineers</w:t>
+      </w:r>
+      <w:r>
+        <w:rPr>
+          <w:color w:val="000000" w:themeColor="text1"/>
+          <w:sz w:val="20"/>
+          <w:szCs w:val="20"/>
+        </w:rPr>
+        <w:t xml:space="preserve"> and guided architecture, performance, and release pipeline.</w:t>
+      </w:r>
+    </w:p>
+    <w:p>
+      <w:pPr>
+        <w:pStyle w:val="List"/>
+        <w:numPr>
+          <w:ilvl w:val="0"/>
+          <w:numId w:val="24"/>
+        </w:numPr>
+        <w:rPr>
+          <w:color w:val="000000" w:themeColor="text1"/>
+          <w:sz w:val="20"/>
+          <w:szCs w:val="20"/>
+        </w:rPr>
+      </w:pPr>
+      <w:r>
+        <w:rPr>
+          <w:color w:val="000000" w:themeColor="text1"/>
+          <w:sz w:val="20"/>
+          <w:szCs w:val="20"/>
+        </w:rPr>
+        <w:t>Delivered PoC to Samsung CTO securing executive approval.</w:t>
+      </w:r>
+    </w:p>
+    <w:p>
+      <w:pPr>
+        <w:pStyle w:val="List"/>
+        <w:numPr>
+          <w:ilvl w:val="0"/>
+          <w:numId w:val="24"/>
+        </w:numPr>
+        <w:rPr>
+          <w:color w:val="000000" w:themeColor="text1"/>
+          <w:sz w:val="20"/>
+          <w:szCs w:val="20"/>
+        </w:rPr>
+      </w:pPr>
+      <w:r>
+        <w:rPr>
+          <w:color w:val="000000" w:themeColor="text1"/>
+          <w:sz w:val="20"/>
+          <w:szCs w:val="20"/>
+        </w:rPr>
+        <w:t>Collaborated with PMs and VPs to define functional/non-functional requirements and drive product direction.</w:t>
       </w:r>
     </w:p>
     <w:p>
@@ -2122,43 +2276,18 @@
       <w:pPr>
         <w:pStyle w:val="List"/>
         <w:rPr>
-          <w:color w:val="000000" w:themeColor="text1"/>
-        </w:rPr>
-      </w:pPr>
-      <w:r>
-        <w:rPr>
-          <w:rStyle w:val="Emphasis"/>
-          <w:color w:val="000000" w:themeColor="text1"/>
-        </w:rPr>
-        <w:t xml:space="preserve">Samsung </w:t>
-      </w:r>
-      <w:proofErr w:type="spellStart"/>
-      <w:r>
-        <w:rPr>
-          <w:rStyle w:val="Emphasis"/>
-          <w:color w:val="000000" w:themeColor="text1"/>
-        </w:rPr>
-        <w:t>DeX</w:t>
-      </w:r>
-      <w:proofErr w:type="spellEnd"/>
-      <w:r>
-        <w:rPr>
-          <w:rStyle w:val="Emphasis"/>
-          <w:color w:val="000000" w:themeColor="text1"/>
-        </w:rPr>
-        <w:t xml:space="preserve"> for PC</w:t>
-      </w:r>
-      <w:r>
-        <w:rPr>
-          <w:color w:val="000000" w:themeColor="text1"/>
-        </w:rPr>
-        <w:t xml:space="preserve"> | </w:t>
-      </w:r>
-      <w:r>
-        <w:rPr>
-          <w:color w:val="000000" w:themeColor="text1"/>
-        </w:rPr>
-        <w:t>Mar 2019 – Dec 2022</w:t>
+          <w:b/>
+          <w:iCs/>
+          <w:color w:val="000000" w:themeColor="text1"/>
+        </w:rPr>
+      </w:pPr>
+      <w:r>
+        <w:rPr>
+          <w:b/>
+          <w:iCs/>
+          <w:color w:val="000000" w:themeColor="text1"/>
+        </w:rPr>
+        <w:t>Organization-wide Contributions</w:t>
       </w:r>
     </w:p>
     <w:p>
@@ -2166,7 +2295,7 @@
         <w:pStyle w:val="List"/>
         <w:numPr>
           <w:ilvl w:val="0"/>
-          <w:numId w:val="24"/>
+          <w:numId w:val="25"/>
         </w:numPr>
         <w:rPr>
           <w:color w:val="000000" w:themeColor="text1"/>
@@ -2176,33 +2305,11 @@
       </w:pPr>
       <w:r>
         <w:rPr>
-          <w:b/>
-          <w:bCs/>
-          <w:color w:val="000000" w:themeColor="text1"/>
-          <w:sz w:val="20"/>
-          <w:szCs w:val="20"/>
-        </w:rPr>
-        <w:t xml:space="preserve">Tech </w:t>
-      </w:r>
-      <w:proofErr w:type="gramStart"/>
-      <w:r>
-        <w:rPr>
-          <w:b/>
-          <w:bCs/>
-          <w:color w:val="000000" w:themeColor="text1"/>
-          <w:sz w:val="20"/>
-          <w:szCs w:val="20"/>
-        </w:rPr>
-        <w:t>Lead</w:t>
-      </w:r>
-      <w:proofErr w:type="gramEnd"/>
-      <w:r>
-        <w:rPr>
-          <w:color w:val="000000" w:themeColor="text1"/>
-          <w:sz w:val="20"/>
-          <w:szCs w:val="20"/>
-        </w:rPr>
-        <w:t xml:space="preserve"> for Windows/macOS/Android teams; ensured high-quality feature delivery.</w:t>
+          <w:color w:val="000000" w:themeColor="text1"/>
+          <w:sz w:val="20"/>
+          <w:szCs w:val="20"/>
+        </w:rPr>
+        <w:t>Onboarded 7+ engineers across multiple projects.</w:t>
       </w:r>
     </w:p>
     <w:p>
@@ -2210,7 +2317,7 @@
         <w:pStyle w:val="List"/>
         <w:numPr>
           <w:ilvl w:val="0"/>
-          <w:numId w:val="24"/>
+          <w:numId w:val="25"/>
         </w:numPr>
         <w:rPr>
           <w:color w:val="000000" w:themeColor="text1"/>
@@ -2224,25 +2331,7 @@
           <w:sz w:val="20"/>
           <w:szCs w:val="20"/>
         </w:rPr>
-        <w:t xml:space="preserve">Mentored </w:t>
-      </w:r>
-      <w:r>
-        <w:rPr>
-          <w:b/>
-          <w:bCs/>
-          <w:color w:val="000000" w:themeColor="text1"/>
-          <w:sz w:val="20"/>
-          <w:szCs w:val="20"/>
-        </w:rPr>
-        <w:t>12+ engineers</w:t>
-      </w:r>
-      <w:r>
-        <w:rPr>
-          <w:color w:val="000000" w:themeColor="text1"/>
-          <w:sz w:val="20"/>
-          <w:szCs w:val="20"/>
-        </w:rPr>
-        <w:t xml:space="preserve"> and guided architecture, performance, and release pipeline.</w:t>
+        <w:t>Participated in technical interviews and candidate evaluations.</w:t>
       </w:r>
     </w:p>
     <w:p>
@@ -2250,7 +2339,7 @@
         <w:pStyle w:val="List"/>
         <w:numPr>
           <w:ilvl w:val="0"/>
-          <w:numId w:val="24"/>
+          <w:numId w:val="25"/>
         </w:numPr>
         <w:rPr>
           <w:color w:val="000000" w:themeColor="text1"/>
@@ -2264,29 +2353,7 @@
           <w:sz w:val="20"/>
           <w:szCs w:val="20"/>
         </w:rPr>
-        <w:t>Delivered PoC to Samsung CTO securing executive approval.</w:t>
-      </w:r>
-    </w:p>
-    <w:p>
-      <w:pPr>
-        <w:pStyle w:val="List"/>
-        <w:numPr>
-          <w:ilvl w:val="0"/>
-          <w:numId w:val="24"/>
-        </w:numPr>
-        <w:rPr>
-          <w:color w:val="000000" w:themeColor="text1"/>
-          <w:sz w:val="20"/>
-          <w:szCs w:val="20"/>
-        </w:rPr>
-      </w:pPr>
-      <w:r>
-        <w:rPr>
-          <w:color w:val="000000" w:themeColor="text1"/>
-          <w:sz w:val="20"/>
-          <w:szCs w:val="20"/>
-        </w:rPr>
-        <w:t>Collaborated with PMs and VPs to define functional/non-functional requirements and drive product direction.</w:t>
+        <w:t>Conducted internal technical training sessions and knowledge-sharing activities.</w:t>
       </w:r>
     </w:p>
     <w:p>
@@ -2305,117 +2372,18 @@
     </w:p>
     <w:p>
       <w:pPr>
-        <w:pStyle w:val="List"/>
-        <w:rPr>
-          <w:b/>
-          <w:iCs/>
-          <w:color w:val="000000" w:themeColor="text1"/>
-        </w:rPr>
-      </w:pPr>
-      <w:r>
-        <w:rPr>
-          <w:b/>
-          <w:iCs/>
-          <w:color w:val="000000" w:themeColor="text1"/>
-        </w:rPr>
-        <w:t>Organization-wide Contributions</w:t>
-      </w:r>
-    </w:p>
-    <w:p>
-      <w:pPr>
-        <w:pStyle w:val="List"/>
-        <w:numPr>
-          <w:ilvl w:val="0"/>
-          <w:numId w:val="25"/>
-        </w:numPr>
-        <w:rPr>
-          <w:color w:val="000000" w:themeColor="text1"/>
-          <w:sz w:val="20"/>
-          <w:szCs w:val="20"/>
-        </w:rPr>
-      </w:pPr>
-      <w:r>
-        <w:rPr>
-          <w:color w:val="000000" w:themeColor="text1"/>
-          <w:sz w:val="20"/>
-          <w:szCs w:val="20"/>
-        </w:rPr>
-        <w:t>Onboarded 7+ engineers across multiple projects.</w:t>
-      </w:r>
-    </w:p>
-    <w:p>
-      <w:pPr>
-        <w:pStyle w:val="List"/>
-        <w:numPr>
-          <w:ilvl w:val="0"/>
-          <w:numId w:val="25"/>
-        </w:numPr>
-        <w:rPr>
-          <w:color w:val="000000" w:themeColor="text1"/>
-          <w:sz w:val="20"/>
-          <w:szCs w:val="20"/>
-        </w:rPr>
-      </w:pPr>
-      <w:r>
-        <w:rPr>
-          <w:color w:val="000000" w:themeColor="text1"/>
-          <w:sz w:val="20"/>
-          <w:szCs w:val="20"/>
-        </w:rPr>
-        <w:t>Participated in technical interviews and candidate evaluations.</w:t>
-      </w:r>
-    </w:p>
-    <w:p>
-      <w:pPr>
-        <w:pStyle w:val="List"/>
-        <w:numPr>
-          <w:ilvl w:val="0"/>
-          <w:numId w:val="25"/>
-        </w:numPr>
-        <w:rPr>
-          <w:color w:val="000000" w:themeColor="text1"/>
-          <w:sz w:val="20"/>
-          <w:szCs w:val="20"/>
-        </w:rPr>
-      </w:pPr>
-      <w:r>
-        <w:rPr>
-          <w:color w:val="000000" w:themeColor="text1"/>
-          <w:sz w:val="20"/>
-          <w:szCs w:val="20"/>
-        </w:rPr>
-        <w:t>Conducted internal technical training sessions and knowledge-sharing activities.</w:t>
-      </w:r>
-    </w:p>
-    <w:p>
-      <w:pPr>
         <w:pStyle w:val="ListBullet"/>
         <w:numPr>
           <w:ilvl w:val="0"/>
           <w:numId w:val="0"/>
         </w:numPr>
         <w:rPr>
-          <w:color w:val="000000" w:themeColor="text1"/>
-          <w:sz w:val="10"/>
-          <w:szCs w:val="10"/>
-        </w:rPr>
-      </w:pPr>
-    </w:p>
-    <w:p>
-      <w:pPr>
-        <w:pStyle w:val="ListBullet"/>
-        <w:numPr>
-          <w:ilvl w:val="0"/>
-          <w:numId w:val="0"/>
-        </w:numPr>
-        <w:rPr>
           <w:b/>
           <w:iCs/>
           <w:color w:val="000000" w:themeColor="text1"/>
           <w:sz w:val="24"/>
         </w:rPr>
       </w:pPr>
-      <w:proofErr w:type="gramStart"/>
       <w:r>
         <w:rPr>
           <w:b/>
@@ -2423,9 +2391,8 @@
           <w:color w:val="000000" w:themeColor="text1"/>
           <w:sz w:val="24"/>
         </w:rPr>
-        <w:t>Open Source</w:t>
-      </w:r>
-      <w:proofErr w:type="gramEnd"/>
+        <w:t>Open-Source</w:t>
+      </w:r>
       <w:r>
         <w:rPr>
           <w:b/>
@@ -6501,6 +6468,7 @@
   <w:style w:type="character" w:default="1" w:styleId="DefaultParagraphFont">
     <w:name w:val="Default Paragraph Font"/>
     <w:uiPriority w:val="1"/>
+    <w:semiHidden/>
     <w:unhideWhenUsed/>
   </w:style>
   <w:style w:type="table" w:default="1" w:styleId="TableNormal">

</xml_diff>

<commit_message>
Major update on resume v4.0
</commit_message>
<xml_diff>
--- a/assets/resume/Resume_Md-Arafat-Hossain.docx
+++ b/assets/resume/Resume_Md-Arafat-Hossain.docx
@@ -30,7 +30,7 @@
         <w:rPr>
           <w:color w:val="000000" w:themeColor="text1"/>
         </w:rPr>
-        <w:t>Staff Engineer | iOS, macOS</w:t>
+        <w:t>Staff Engineer | Senior iOS Engineer | Mobile Platform Engineer</w:t>
       </w:r>
     </w:p>
     <w:p>
@@ -57,20 +57,28 @@
         </w:rPr>
         <w:t>+8801717451117</w:t>
       </w:r>
-    </w:p>
-    <w:p>
-      <w:pPr>
-        <w:rPr>
-          <w:color w:val="000000" w:themeColor="text1"/>
-        </w:rPr>
-      </w:pPr>
-      <w:r>
-        <w:rPr>
-          <w:color w:val="000000" w:themeColor="text1"/>
-        </w:rPr>
-        <w:t xml:space="preserve">arafat07.ruet@gmail.com | </w:t>
+      <w:r>
+        <w:rPr>
+          <w:color w:val="000000" w:themeColor="text1"/>
+        </w:rPr>
+        <w:t xml:space="preserve"> | </w:t>
       </w:r>
       <w:hyperlink r:id="rId11" w:history="1">
+        <w:r>
+          <w:rPr>
+            <w:rStyle w:val="Hyperlink"/>
+          </w:rPr>
+          <w:t>arafat07.ruet@gmail.com</w:t>
+        </w:r>
+      </w:hyperlink>
+    </w:p>
+    <w:p>
+      <w:pPr>
+        <w:rPr>
+          <w:color w:val="000000" w:themeColor="text1"/>
+        </w:rPr>
+      </w:pPr>
+      <w:hyperlink r:id="rId12" w:history="1">
         <w:r>
           <w:rPr>
             <w:rStyle w:val="Hyperlink"/>
@@ -92,7 +100,7 @@
         </w:rPr>
         <w:t xml:space="preserve"> | </w:t>
       </w:r>
-      <w:hyperlink r:id="rId12" w:history="1">
+      <w:hyperlink r:id="rId13" w:history="1">
         <w:r>
           <w:rPr>
             <w:rStyle w:val="Hyperlink"/>
@@ -145,67 +153,102 @@
         <w:rPr>
           <w:color w:val="000000" w:themeColor="text1"/>
         </w:rPr>
-        <w:t>Career Summary</w:t>
-      </w:r>
-    </w:p>
-    <w:p>
-      <w:pPr>
-        <w:rPr>
-          <w:color w:val="000000" w:themeColor="text1"/>
-        </w:rPr>
-      </w:pPr>
-      <w:r>
-        <w:rPr>
-          <w:color w:val="000000" w:themeColor="text1"/>
-        </w:rPr>
-        <w:t xml:space="preserve">Staff Software Engineer with 13+ years of experience building scalable iOS, macOS, Windows, and IoT applications. Expertise in Swift, Swift Concurrency, </w:t>
-      </w:r>
-      <w:proofErr w:type="spellStart"/>
-      <w:r>
-        <w:rPr>
-          <w:color w:val="000000" w:themeColor="text1"/>
-        </w:rPr>
-        <w:t>UIKit</w:t>
-      </w:r>
-      <w:proofErr w:type="spellEnd"/>
-      <w:r>
-        <w:rPr>
-          <w:color w:val="000000" w:themeColor="text1"/>
-        </w:rPr>
-        <w:t xml:space="preserve">, </w:t>
-      </w:r>
-      <w:proofErr w:type="spellStart"/>
-      <w:r>
-        <w:rPr>
-          <w:color w:val="000000" w:themeColor="text1"/>
-        </w:rPr>
-        <w:t>SwiftUI</w:t>
-      </w:r>
-      <w:proofErr w:type="spellEnd"/>
-      <w:r>
-        <w:rPr>
-          <w:color w:val="000000" w:themeColor="text1"/>
-        </w:rPr>
-        <w:t xml:space="preserve">, Combine, MVVM/MVVM-C, and software architecture. Contributed to Samsung SmartThings iOS (62M+ users) and led core development of Samsung </w:t>
-      </w:r>
-      <w:proofErr w:type="spellStart"/>
-      <w:r>
-        <w:rPr>
-          <w:color w:val="000000" w:themeColor="text1"/>
-        </w:rPr>
-        <w:t>DeX</w:t>
-      </w:r>
-      <w:proofErr w:type="spellEnd"/>
-      <w:r>
-        <w:rPr>
-          <w:color w:val="000000" w:themeColor="text1"/>
-        </w:rPr>
-        <w:t xml:space="preserve"> for PC on macOS. Proven track record of technical leadership, feature ownership, and delivering high-quality products at scale.</w:t>
-      </w:r>
-    </w:p>
-    <w:p>
-      <w:pPr>
-        <w:pStyle w:val="Space"/>
+        <w:t>PROFESSIONAL</w:t>
+      </w:r>
+      <w:r>
+        <w:rPr>
+          <w:color w:val="000000" w:themeColor="text1"/>
+        </w:rPr>
+        <w:t xml:space="preserve"> </w:t>
+      </w:r>
+      <w:r>
+        <w:rPr>
+          <w:color w:val="000000" w:themeColor="text1"/>
+        </w:rPr>
+        <w:t>Experience</w:t>
+      </w:r>
+    </w:p>
+    <w:p>
+      <w:pPr>
+        <w:pStyle w:val="List"/>
+        <w:rPr>
+          <w:rStyle w:val="Emphasis"/>
+          <w:color w:val="000000" w:themeColor="text1"/>
+        </w:rPr>
+      </w:pPr>
+      <w:r>
+        <w:rPr>
+          <w:rStyle w:val="Emphasis"/>
+          <w:color w:val="000000" w:themeColor="text1"/>
+        </w:rPr>
+        <w:t>Samsung R&amp;D Institute Bangladesh Ltd.</w:t>
+      </w:r>
+    </w:p>
+    <w:p>
+      <w:pPr>
+        <w:pStyle w:val="List"/>
+        <w:rPr>
+          <w:color w:val="000000" w:themeColor="text1"/>
+        </w:rPr>
+      </w:pPr>
+      <w:r>
+        <w:rPr>
+          <w:color w:val="000000" w:themeColor="text1"/>
+        </w:rPr>
+        <w:t>Staff Engineer</w:t>
+      </w:r>
+      <w:r>
+        <w:rPr>
+          <w:color w:val="000000" w:themeColor="text1"/>
+        </w:rPr>
+        <w:t xml:space="preserve"> |</w:t>
+      </w:r>
+      <w:r>
+        <w:rPr>
+          <w:color w:val="000000" w:themeColor="text1"/>
+        </w:rPr>
+        <w:t xml:space="preserve"> </w:t>
+      </w:r>
+      <w:r>
+        <w:rPr>
+          <w:color w:val="000000" w:themeColor="text1"/>
+        </w:rPr>
+        <w:t>June</w:t>
+      </w:r>
+      <w:r>
+        <w:rPr>
+          <w:color w:val="000000" w:themeColor="text1"/>
+        </w:rPr>
+        <w:t xml:space="preserve"> 20</w:t>
+      </w:r>
+      <w:r>
+        <w:rPr>
+          <w:color w:val="000000" w:themeColor="text1"/>
+        </w:rPr>
+        <w:t>13</w:t>
+      </w:r>
+      <w:r>
+        <w:rPr>
+          <w:color w:val="000000" w:themeColor="text1"/>
+        </w:rPr>
+        <w:t xml:space="preserve"> </w:t>
+      </w:r>
+      <w:r>
+        <w:rPr>
+          <w:color w:val="000000" w:themeColor="text1"/>
+        </w:rPr>
+        <w:t>–</w:t>
+      </w:r>
+      <w:r>
+        <w:rPr>
+          <w:color w:val="000000" w:themeColor="text1"/>
+        </w:rPr>
+        <w:t xml:space="preserve"> Present</w:t>
+      </w:r>
+    </w:p>
+    <w:p>
+      <w:pPr>
+        <w:pStyle w:val="List"/>
         <w:rPr>
           <w:color w:val="000000" w:themeColor="text1"/>
           <w:sz w:val="10"/>
@@ -215,546 +258,31 @@
     </w:p>
     <w:p>
       <w:pPr>
-        <w:pStyle w:val="Heading1"/>
-        <w:rPr>
-          <w:color w:val="000000" w:themeColor="text1"/>
-        </w:rPr>
-      </w:pPr>
-      <w:r>
-        <w:rPr>
-          <w:color w:val="000000" w:themeColor="text1"/>
-        </w:rPr>
-        <w:t>Technical Skills</w:t>
-      </w:r>
-    </w:p>
-    <w:p>
-      <w:pPr>
-        <w:pStyle w:val="ListParagraph"/>
-        <w:numPr>
-          <w:ilvl w:val="0"/>
-          <w:numId w:val="13"/>
-        </w:numPr>
-        <w:jc w:val="left"/>
-        <w:rPr>
-          <w:color w:val="000000" w:themeColor="text1"/>
-          <w:sz w:val="20"/>
-          <w:szCs w:val="20"/>
-        </w:rPr>
-      </w:pPr>
-      <w:r>
-        <w:rPr>
-          <w:color w:val="000000" w:themeColor="text1"/>
-          <w:sz w:val="20"/>
-          <w:szCs w:val="20"/>
-        </w:rPr>
-        <w:t xml:space="preserve">Swift &amp; Swift 6 (Concurrency – async/await, actors), </w:t>
-      </w:r>
-      <w:proofErr w:type="spellStart"/>
-      <w:r>
-        <w:rPr>
-          <w:color w:val="000000" w:themeColor="text1"/>
-          <w:sz w:val="20"/>
-          <w:szCs w:val="20"/>
-        </w:rPr>
-        <w:t>UIKit</w:t>
-      </w:r>
-      <w:proofErr w:type="spellEnd"/>
-      <w:r>
-        <w:rPr>
-          <w:color w:val="000000" w:themeColor="text1"/>
-          <w:sz w:val="20"/>
-          <w:szCs w:val="20"/>
-        </w:rPr>
-        <w:t xml:space="preserve">, </w:t>
-      </w:r>
-      <w:proofErr w:type="spellStart"/>
-      <w:r>
-        <w:rPr>
-          <w:color w:val="000000" w:themeColor="text1"/>
-          <w:sz w:val="20"/>
-          <w:szCs w:val="20"/>
-        </w:rPr>
-        <w:t>SwiftUI</w:t>
-      </w:r>
-      <w:proofErr w:type="spellEnd"/>
-      <w:r>
-        <w:rPr>
-          <w:color w:val="000000" w:themeColor="text1"/>
-          <w:sz w:val="20"/>
-          <w:szCs w:val="20"/>
-        </w:rPr>
-        <w:t>, Objective-C</w:t>
-      </w:r>
-    </w:p>
-    <w:p>
-      <w:pPr>
-        <w:pStyle w:val="ListParagraph"/>
-        <w:numPr>
-          <w:ilvl w:val="0"/>
-          <w:numId w:val="13"/>
-        </w:numPr>
-        <w:jc w:val="left"/>
-        <w:rPr>
-          <w:color w:val="000000" w:themeColor="text1"/>
-          <w:sz w:val="20"/>
-          <w:szCs w:val="20"/>
-        </w:rPr>
-      </w:pPr>
-      <w:r>
-        <w:rPr>
-          <w:color w:val="000000" w:themeColor="text1"/>
-          <w:sz w:val="20"/>
-          <w:szCs w:val="20"/>
-        </w:rPr>
-        <w:t xml:space="preserve">Combine, </w:t>
-      </w:r>
-      <w:proofErr w:type="spellStart"/>
-      <w:r>
-        <w:rPr>
-          <w:color w:val="000000" w:themeColor="text1"/>
-          <w:sz w:val="20"/>
-          <w:szCs w:val="20"/>
-        </w:rPr>
-        <w:t>ReactiveSwift</w:t>
-      </w:r>
-      <w:proofErr w:type="spellEnd"/>
-      <w:r>
-        <w:rPr>
-          <w:color w:val="000000" w:themeColor="text1"/>
-          <w:sz w:val="20"/>
-          <w:szCs w:val="20"/>
-        </w:rPr>
-        <w:t>, MVVM, MVVM-C, State Management Architecture</w:t>
-      </w:r>
-    </w:p>
-    <w:p>
-      <w:pPr>
-        <w:pStyle w:val="ListParagraph"/>
-        <w:numPr>
-          <w:ilvl w:val="0"/>
-          <w:numId w:val="13"/>
-        </w:numPr>
-        <w:jc w:val="left"/>
-        <w:rPr>
-          <w:color w:val="000000" w:themeColor="text1"/>
-          <w:sz w:val="20"/>
-          <w:szCs w:val="20"/>
-        </w:rPr>
-      </w:pPr>
-      <w:r>
-        <w:rPr>
-          <w:color w:val="000000" w:themeColor="text1"/>
-          <w:sz w:val="20"/>
-          <w:szCs w:val="20"/>
-        </w:rPr>
-        <w:t>Deep Linking, Universal Links</w:t>
-      </w:r>
-    </w:p>
-    <w:p>
-      <w:pPr>
-        <w:pStyle w:val="ListParagraph"/>
-        <w:numPr>
-          <w:ilvl w:val="0"/>
-          <w:numId w:val="13"/>
-        </w:numPr>
-        <w:jc w:val="left"/>
-        <w:rPr>
-          <w:color w:val="000000" w:themeColor="text1"/>
-          <w:sz w:val="20"/>
-          <w:szCs w:val="20"/>
-        </w:rPr>
-      </w:pPr>
-      <w:r>
-        <w:rPr>
-          <w:color w:val="000000" w:themeColor="text1"/>
-          <w:sz w:val="20"/>
-          <w:szCs w:val="20"/>
-        </w:rPr>
-        <w:t xml:space="preserve">RESTful API integration, </w:t>
-      </w:r>
-      <w:proofErr w:type="spellStart"/>
-      <w:r>
-        <w:rPr>
-          <w:color w:val="000000" w:themeColor="text1"/>
-          <w:sz w:val="20"/>
-          <w:szCs w:val="20"/>
-        </w:rPr>
-        <w:t>XCTest</w:t>
-      </w:r>
-      <w:proofErr w:type="spellEnd"/>
-      <w:r>
-        <w:rPr>
-          <w:color w:val="000000" w:themeColor="text1"/>
-          <w:sz w:val="20"/>
-          <w:szCs w:val="20"/>
-        </w:rPr>
-        <w:t>, Time Profiler</w:t>
-      </w:r>
-    </w:p>
-    <w:p>
-      <w:pPr>
-        <w:pStyle w:val="ListParagraph"/>
-        <w:numPr>
-          <w:ilvl w:val="0"/>
-          <w:numId w:val="13"/>
-        </w:numPr>
-        <w:jc w:val="left"/>
-        <w:rPr>
-          <w:color w:val="000000" w:themeColor="text1"/>
-          <w:sz w:val="20"/>
-          <w:szCs w:val="20"/>
-        </w:rPr>
-      </w:pPr>
-      <w:r>
-        <w:rPr>
-          <w:color w:val="000000" w:themeColor="text1"/>
-          <w:sz w:val="20"/>
-          <w:szCs w:val="20"/>
-        </w:rPr>
-        <w:t xml:space="preserve">Swift Package Manager (SPM), </w:t>
-      </w:r>
-      <w:proofErr w:type="spellStart"/>
-      <w:r>
-        <w:rPr>
-          <w:color w:val="000000" w:themeColor="text1"/>
-          <w:sz w:val="20"/>
-          <w:szCs w:val="20"/>
-        </w:rPr>
-        <w:t>CocoaPods</w:t>
-      </w:r>
-      <w:proofErr w:type="spellEnd"/>
-      <w:r>
-        <w:rPr>
-          <w:color w:val="000000" w:themeColor="text1"/>
-          <w:sz w:val="20"/>
-          <w:szCs w:val="20"/>
-        </w:rPr>
-        <w:t>, Carthage</w:t>
-      </w:r>
-    </w:p>
-    <w:p>
-      <w:pPr>
-        <w:pStyle w:val="ListParagraph"/>
-        <w:numPr>
-          <w:ilvl w:val="0"/>
-          <w:numId w:val="13"/>
-        </w:numPr>
-        <w:jc w:val="left"/>
-        <w:rPr>
-          <w:color w:val="000000" w:themeColor="text1"/>
-          <w:sz w:val="20"/>
-          <w:szCs w:val="20"/>
-        </w:rPr>
-      </w:pPr>
-      <w:r>
-        <w:rPr>
-          <w:color w:val="000000" w:themeColor="text1"/>
-          <w:sz w:val="20"/>
-          <w:szCs w:val="20"/>
-        </w:rPr>
-        <w:t xml:space="preserve">Firebase, </w:t>
-      </w:r>
-      <w:proofErr w:type="spellStart"/>
-      <w:r>
-        <w:rPr>
-          <w:color w:val="000000" w:themeColor="text1"/>
-          <w:sz w:val="20"/>
-          <w:szCs w:val="20"/>
-        </w:rPr>
-        <w:t>Alamofire</w:t>
-      </w:r>
-      <w:proofErr w:type="spellEnd"/>
-    </w:p>
-    <w:p>
-      <w:pPr>
-        <w:pStyle w:val="ListParagraph"/>
-        <w:numPr>
-          <w:ilvl w:val="0"/>
-          <w:numId w:val="13"/>
-        </w:numPr>
-        <w:jc w:val="left"/>
-        <w:rPr>
-          <w:color w:val="000000" w:themeColor="text1"/>
-          <w:sz w:val="20"/>
-          <w:szCs w:val="20"/>
-        </w:rPr>
-      </w:pPr>
-      <w:r>
-        <w:rPr>
-          <w:color w:val="000000" w:themeColor="text1"/>
-          <w:sz w:val="20"/>
-          <w:szCs w:val="20"/>
-        </w:rPr>
-        <w:t>Analytics &amp; crash reporting (Firebase Crashlytics, Google Analytics)</w:t>
-      </w:r>
-    </w:p>
-    <w:p>
-      <w:pPr>
-        <w:pStyle w:val="ListParagraph"/>
-        <w:numPr>
-          <w:ilvl w:val="0"/>
-          <w:numId w:val="13"/>
-        </w:numPr>
-        <w:jc w:val="left"/>
-        <w:rPr>
-          <w:color w:val="000000" w:themeColor="text1"/>
-          <w:sz w:val="20"/>
-          <w:szCs w:val="20"/>
-        </w:rPr>
-      </w:pPr>
-      <w:r>
-        <w:rPr>
-          <w:color w:val="000000" w:themeColor="text1"/>
-          <w:sz w:val="20"/>
-          <w:szCs w:val="20"/>
-        </w:rPr>
-        <w:t>Feature flagging &amp; remote configuration</w:t>
-      </w:r>
-    </w:p>
-    <w:p>
-      <w:pPr>
-        <w:pStyle w:val="ListParagraph"/>
-        <w:numPr>
-          <w:ilvl w:val="0"/>
-          <w:numId w:val="13"/>
-        </w:numPr>
-        <w:jc w:val="left"/>
-        <w:rPr>
-          <w:color w:val="000000" w:themeColor="text1"/>
-          <w:sz w:val="20"/>
-          <w:szCs w:val="20"/>
-        </w:rPr>
-      </w:pPr>
-      <w:r>
-        <w:rPr>
-          <w:color w:val="000000" w:themeColor="text1"/>
-          <w:sz w:val="20"/>
-          <w:szCs w:val="20"/>
-        </w:rPr>
-        <w:t>Embedded rendering integration (Godot Engine)</w:t>
-      </w:r>
-    </w:p>
-    <w:p>
-      <w:pPr>
-        <w:pStyle w:val="ListParagraph"/>
-        <w:numPr>
-          <w:ilvl w:val="0"/>
-          <w:numId w:val="13"/>
-        </w:numPr>
-        <w:jc w:val="left"/>
-        <w:rPr>
-          <w:color w:val="000000" w:themeColor="text1"/>
-          <w:sz w:val="20"/>
-          <w:szCs w:val="20"/>
-        </w:rPr>
-      </w:pPr>
-      <w:r>
-        <w:rPr>
-          <w:color w:val="000000" w:themeColor="text1"/>
-          <w:sz w:val="20"/>
-          <w:szCs w:val="20"/>
-        </w:rPr>
-        <w:t>App Store &amp; Google Play release management, TestFlight, macOS notarization &amp; release pipeline</w:t>
-      </w:r>
-    </w:p>
-    <w:p>
-      <w:pPr>
-        <w:pStyle w:val="ListParagraph"/>
-        <w:numPr>
-          <w:ilvl w:val="0"/>
-          <w:numId w:val="13"/>
-        </w:numPr>
-        <w:jc w:val="left"/>
-        <w:rPr>
-          <w:color w:val="000000" w:themeColor="text1"/>
-          <w:sz w:val="20"/>
-          <w:szCs w:val="20"/>
-        </w:rPr>
-      </w:pPr>
-      <w:r>
-        <w:rPr>
-          <w:color w:val="000000" w:themeColor="text1"/>
-          <w:sz w:val="20"/>
-          <w:szCs w:val="20"/>
-        </w:rPr>
-        <w:t>Agile/Scrum development methodology</w:t>
-      </w:r>
-    </w:p>
-    <w:p>
-      <w:pPr>
-        <w:pStyle w:val="ListParagraph"/>
-        <w:numPr>
-          <w:ilvl w:val="0"/>
-          <w:numId w:val="13"/>
-        </w:numPr>
-        <w:jc w:val="left"/>
-        <w:rPr>
-          <w:color w:val="000000" w:themeColor="text1"/>
-          <w:sz w:val="20"/>
-          <w:szCs w:val="20"/>
-        </w:rPr>
-      </w:pPr>
-      <w:r>
-        <w:rPr>
-          <w:color w:val="000000" w:themeColor="text1"/>
-          <w:sz w:val="20"/>
-          <w:szCs w:val="20"/>
-        </w:rPr>
-        <w:t>Open-source contribution workflows</w:t>
-      </w:r>
-    </w:p>
-    <w:p>
-      <w:pPr>
-        <w:pStyle w:val="ListParagraph"/>
-        <w:numPr>
-          <w:ilvl w:val="0"/>
-          <w:numId w:val="13"/>
-        </w:numPr>
-        <w:jc w:val="left"/>
-        <w:rPr>
-          <w:color w:val="000000" w:themeColor="text1"/>
-          <w:sz w:val="20"/>
-          <w:szCs w:val="20"/>
-        </w:rPr>
-      </w:pPr>
-      <w:r>
-        <w:rPr>
-          <w:color w:val="000000" w:themeColor="text1"/>
-          <w:sz w:val="20"/>
-          <w:szCs w:val="20"/>
-        </w:rPr>
-        <w:t>Git, GitHub, GitHub Actions, Jenkins, Perforce</w:t>
-      </w:r>
-    </w:p>
-    <w:p>
-      <w:pPr>
-        <w:pStyle w:val="ListParagraph"/>
-        <w:numPr>
-          <w:ilvl w:val="0"/>
-          <w:numId w:val="13"/>
-        </w:numPr>
-        <w:jc w:val="left"/>
-        <w:rPr>
-          <w:color w:val="000000" w:themeColor="text1"/>
-        </w:rPr>
-      </w:pPr>
-      <w:r>
-        <w:rPr>
-          <w:color w:val="000000" w:themeColor="text1"/>
-          <w:sz w:val="20"/>
-          <w:szCs w:val="20"/>
-        </w:rPr>
-        <w:t>C/C++, C#, Java, WPF, MFC, Android (Java)</w:t>
-      </w:r>
-    </w:p>
-    <w:p>
-      <w:pPr>
-        <w:pStyle w:val="Space"/>
-        <w:rPr>
-          <w:color w:val="000000" w:themeColor="text1"/>
-          <w:sz w:val="10"/>
-          <w:szCs w:val="10"/>
-        </w:rPr>
-      </w:pPr>
-    </w:p>
-    <w:p>
-      <w:pPr>
-        <w:pStyle w:val="Heading1"/>
-        <w:rPr>
-          <w:color w:val="000000" w:themeColor="text1"/>
-        </w:rPr>
-      </w:pPr>
-      <w:r>
-        <w:rPr>
-          <w:color w:val="000000" w:themeColor="text1"/>
-        </w:rPr>
-        <w:t>Work Experience</w:t>
-      </w:r>
-    </w:p>
-    <w:p>
-      <w:pPr>
         <w:pStyle w:val="List"/>
         <w:rPr>
-          <w:color w:val="000000" w:themeColor="text1"/>
-        </w:rPr>
-      </w:pPr>
-      <w:r>
-        <w:rPr>
-          <w:rStyle w:val="Emphasis"/>
-          <w:color w:val="000000" w:themeColor="text1"/>
-        </w:rPr>
-        <w:t>Samsung R&amp;D Institute Bangladesh Ltd.</w:t>
-      </w:r>
-      <w:r>
-        <w:rPr>
-          <w:rStyle w:val="Emphasis"/>
-          <w:color w:val="000000" w:themeColor="text1"/>
-        </w:rPr>
-        <w:t xml:space="preserve"> </w:t>
-      </w:r>
-      <w:r>
-        <w:rPr>
-          <w:color w:val="000000" w:themeColor="text1"/>
-        </w:rPr>
-        <w:t xml:space="preserve">| </w:t>
-      </w:r>
-      <w:r>
-        <w:rPr>
-          <w:color w:val="000000" w:themeColor="text1"/>
-        </w:rPr>
-        <w:t>Staff Engineer-I</w:t>
-      </w:r>
-      <w:r>
-        <w:rPr>
-          <w:color w:val="000000" w:themeColor="text1"/>
-        </w:rPr>
-        <w:t xml:space="preserve"> | </w:t>
-      </w:r>
-      <w:r>
-        <w:rPr>
-          <w:color w:val="000000" w:themeColor="text1"/>
-        </w:rPr>
-        <w:t>Mar 202</w:t>
-      </w:r>
-      <w:r>
-        <w:rPr>
-          <w:color w:val="000000" w:themeColor="text1"/>
-        </w:rPr>
-        <w:t>1</w:t>
-      </w:r>
-      <w:r>
-        <w:rPr>
-          <w:color w:val="000000" w:themeColor="text1"/>
-        </w:rPr>
-        <w:t xml:space="preserve"> </w:t>
-      </w:r>
-      <w:r>
-        <w:rPr>
-          <w:color w:val="000000" w:themeColor="text1"/>
-        </w:rPr>
-        <w:t>–</w:t>
-      </w:r>
-      <w:r>
-        <w:rPr>
-          <w:color w:val="000000" w:themeColor="text1"/>
-        </w:rPr>
-        <w:t xml:space="preserve"> Present</w:t>
-      </w:r>
-    </w:p>
-    <w:p>
-      <w:pPr>
-        <w:pStyle w:val="List"/>
-        <w:rPr>
+          <w:b/>
+          <w:bCs/>
           <w:color w:val="000000" w:themeColor="text1"/>
           <w:sz w:val="22"/>
         </w:rPr>
       </w:pPr>
       <w:r>
         <w:rPr>
+          <w:b/>
+          <w:bCs/>
           <w:color w:val="000000" w:themeColor="text1"/>
           <w:sz w:val="22"/>
         </w:rPr>
         <w:t>SmartThings iOS</w:t>
+      </w:r>
+      <w:r>
+        <w:rPr>
+          <w:b/>
+          <w:bCs/>
+          <w:color w:val="000000" w:themeColor="text1"/>
+          <w:sz w:val="22"/>
+        </w:rPr>
+        <w:t xml:space="preserve"> (2023 – Present)</w:t>
       </w:r>
     </w:p>
     <w:p>
@@ -776,7 +304,7 @@
           <w:sz w:val="20"/>
           <w:szCs w:val="20"/>
         </w:rPr>
-        <w:t xml:space="preserve">Led development of Settings and </w:t>
+        <w:t xml:space="preserve">Own the Settings and </w:t>
       </w:r>
       <w:proofErr w:type="spellStart"/>
       <w:r>
@@ -794,7 +322,7 @@
           <w:sz w:val="20"/>
           <w:szCs w:val="20"/>
         </w:rPr>
-        <w:t xml:space="preserve"> features for SmartThings iOS (62M+ active users, 4.5+ App Store rating).</w:t>
+        <w:t xml:space="preserve"> domains within SmartThings iOS, a leading IoT platform serving 62M+ active users worldwide.</w:t>
       </w:r>
     </w:p>
     <w:p>
@@ -816,25 +344,7 @@
           <w:sz w:val="20"/>
           <w:szCs w:val="20"/>
         </w:rPr>
-        <w:t xml:space="preserve">Integrated new device cards (TV, lights, sensors) and enhanced </w:t>
-      </w:r>
-      <w:proofErr w:type="spellStart"/>
-      <w:r>
-        <w:rPr>
-          <w:color w:val="000000" w:themeColor="text1"/>
-          <w:sz w:val="20"/>
-          <w:szCs w:val="20"/>
-        </w:rPr>
-        <w:t>MapView</w:t>
-      </w:r>
-      <w:proofErr w:type="spellEnd"/>
-      <w:r>
-        <w:rPr>
-          <w:color w:val="000000" w:themeColor="text1"/>
-          <w:sz w:val="20"/>
-          <w:szCs w:val="20"/>
-        </w:rPr>
-        <w:t xml:space="preserve"> user experience.</w:t>
+        <w:t>Drive technical design, implementation, and delivery of user configuration, support, diagnostics, content-driven experiences, and device visualization features.</w:t>
       </w:r>
     </w:p>
     <w:p>
@@ -856,7 +366,7 @@
           <w:sz w:val="20"/>
           <w:szCs w:val="20"/>
         </w:rPr>
-        <w:t xml:space="preserve">Migrated modules from </w:t>
+        <w:t xml:space="preserve">Lead architecture and feature development for </w:t>
       </w:r>
       <w:proofErr w:type="spellStart"/>
       <w:r>
@@ -865,7 +375,7 @@
           <w:sz w:val="20"/>
           <w:szCs w:val="20"/>
         </w:rPr>
-        <w:t>ReactiveSwift</w:t>
+        <w:t>MapView</w:t>
       </w:r>
       <w:proofErr w:type="spellEnd"/>
       <w:r>
@@ -874,7 +384,7 @@
           <w:sz w:val="20"/>
           <w:szCs w:val="20"/>
         </w:rPr>
-        <w:t xml:space="preserve"> to Combine and modernized application architecture.</w:t>
+        <w:t>, integrating new device experiences including TVs, lighting systems, sensors, and smart home devices.</w:t>
       </w:r>
     </w:p>
     <w:p>
@@ -896,7 +406,25 @@
           <w:sz w:val="20"/>
           <w:szCs w:val="20"/>
         </w:rPr>
-        <w:t>Migrating existing modules to Swift 6 Concurrency (async/await, actors).</w:t>
+        <w:t xml:space="preserve">Migrate application modules from </w:t>
+      </w:r>
+      <w:proofErr w:type="spellStart"/>
+      <w:r>
+        <w:rPr>
+          <w:color w:val="000000" w:themeColor="text1"/>
+          <w:sz w:val="20"/>
+          <w:szCs w:val="20"/>
+        </w:rPr>
+        <w:t>ReactiveSwift</w:t>
+      </w:r>
+      <w:proofErr w:type="spellEnd"/>
+      <w:r>
+        <w:rPr>
+          <w:color w:val="000000" w:themeColor="text1"/>
+          <w:sz w:val="20"/>
+          <w:szCs w:val="20"/>
+        </w:rPr>
+        <w:t xml:space="preserve"> to Combine, modernizing the reactive architecture and improving maintainability.</w:t>
       </w:r>
     </w:p>
     <w:p>
@@ -918,7 +446,51 @@
           <w:sz w:val="20"/>
           <w:szCs w:val="20"/>
         </w:rPr>
-        <w:t xml:space="preserve">Conducted performance optimization using Time Profiler and resolved major market </w:t>
+        <w:t>Modernize application components using Swift Concurrency (async/await, actors).</w:t>
+      </w:r>
+    </w:p>
+    <w:p>
+      <w:pPr>
+        <w:pStyle w:val="List"/>
+        <w:numPr>
+          <w:ilvl w:val="0"/>
+          <w:numId w:val="15"/>
+        </w:numPr>
+        <w:rPr>
+          <w:color w:val="000000" w:themeColor="text1"/>
+          <w:sz w:val="20"/>
+          <w:szCs w:val="20"/>
+        </w:rPr>
+      </w:pPr>
+      <w:r>
+        <w:rPr>
+          <w:color w:val="000000" w:themeColor="text1"/>
+          <w:sz w:val="20"/>
+          <w:szCs w:val="20"/>
+        </w:rPr>
+        <w:t>Partner with Product, QA, Design, and platform teams to define requirements and deliver large-scale mobile experiences.</w:t>
+      </w:r>
+    </w:p>
+    <w:p>
+      <w:pPr>
+        <w:pStyle w:val="List"/>
+        <w:numPr>
+          <w:ilvl w:val="0"/>
+          <w:numId w:val="15"/>
+        </w:numPr>
+        <w:rPr>
+          <w:color w:val="000000" w:themeColor="text1"/>
+          <w:sz w:val="20"/>
+          <w:szCs w:val="20"/>
+        </w:rPr>
+      </w:pPr>
+      <w:r>
+        <w:rPr>
+          <w:color w:val="000000" w:themeColor="text1"/>
+          <w:sz w:val="20"/>
+          <w:szCs w:val="20"/>
+        </w:rPr>
+        <w:t xml:space="preserve">Lead application-side integration of a new rendering architecture for SmartThings </w:t>
       </w:r>
       <w:proofErr w:type="spellStart"/>
       <w:r>
@@ -927,7 +499,7 @@
           <w:sz w:val="20"/>
           <w:szCs w:val="20"/>
         </w:rPr>
-        <w:t>VoCs</w:t>
+        <w:t>MapView</w:t>
       </w:r>
       <w:proofErr w:type="spellEnd"/>
       <w:r>
@@ -936,39 +508,153 @@
           <w:sz w:val="20"/>
           <w:szCs w:val="20"/>
         </w:rPr>
-        <w:t>.</w:t>
+        <w:t>, driving migration from Unity to Godot Engine and defining integration strategy, platform interfaces, and rollout approach.</w:t>
       </w:r>
     </w:p>
     <w:p>
       <w:pPr>
         <w:pStyle w:val="List"/>
-        <w:rPr>
+        <w:numPr>
+          <w:ilvl w:val="0"/>
+          <w:numId w:val="15"/>
+        </w:numPr>
+        <w:rPr>
+          <w:color w:val="000000" w:themeColor="text1"/>
+          <w:sz w:val="20"/>
+          <w:szCs w:val="20"/>
+        </w:rPr>
+      </w:pPr>
+      <w:r>
+        <w:rPr>
+          <w:color w:val="000000" w:themeColor="text1"/>
+          <w:sz w:val="20"/>
+          <w:szCs w:val="20"/>
+        </w:rPr>
+        <w:t xml:space="preserve">Contribute to </w:t>
+      </w:r>
+      <w:proofErr w:type="spellStart"/>
+      <w:r>
+        <w:rPr>
+          <w:color w:val="000000" w:themeColor="text1"/>
+          <w:sz w:val="20"/>
+          <w:szCs w:val="20"/>
+        </w:rPr>
+        <w:t>SwiftGodotKit</w:t>
+      </w:r>
+      <w:proofErr w:type="spellEnd"/>
+      <w:r>
+        <w:rPr>
+          <w:color w:val="000000" w:themeColor="text1"/>
+          <w:sz w:val="20"/>
+          <w:szCs w:val="20"/>
+        </w:rPr>
+        <w:t xml:space="preserve"> and related projects supporting native Swift ↔ Godot interoperability for SmartThings </w:t>
+      </w:r>
+      <w:proofErr w:type="spellStart"/>
+      <w:r>
+        <w:rPr>
+          <w:color w:val="000000" w:themeColor="text1"/>
+          <w:sz w:val="20"/>
+          <w:szCs w:val="20"/>
+        </w:rPr>
+        <w:t>MapView</w:t>
+      </w:r>
+      <w:proofErr w:type="spellEnd"/>
+      <w:r>
+        <w:rPr>
+          <w:color w:val="000000" w:themeColor="text1"/>
+          <w:sz w:val="20"/>
+          <w:szCs w:val="20"/>
+        </w:rPr>
+        <w:t xml:space="preserve"> integration.</w:t>
+      </w:r>
+    </w:p>
+    <w:p>
+      <w:pPr>
+        <w:pStyle w:val="List"/>
+        <w:numPr>
+          <w:ilvl w:val="0"/>
+          <w:numId w:val="15"/>
+        </w:numPr>
+        <w:rPr>
+          <w:color w:val="000000" w:themeColor="text1"/>
+          <w:sz w:val="20"/>
+          <w:szCs w:val="20"/>
+        </w:rPr>
+      </w:pPr>
+      <w:r>
+        <w:rPr>
+          <w:color w:val="000000" w:themeColor="text1"/>
+          <w:sz w:val="20"/>
+          <w:szCs w:val="20"/>
+        </w:rPr>
+        <w:t>Investigate and resolve high-impact customer issues through performance profiling, debugging, and root-cause analysis.</w:t>
+      </w:r>
+    </w:p>
+    <w:p>
+      <w:pPr>
+        <w:pStyle w:val="List"/>
+        <w:rPr>
+          <w:color w:val="000000" w:themeColor="text1"/>
+          <w:sz w:val="10"/>
+          <w:szCs w:val="10"/>
+        </w:rPr>
+      </w:pPr>
+    </w:p>
+    <w:p>
+      <w:pPr>
+        <w:pStyle w:val="List"/>
+        <w:rPr>
+          <w:b/>
+          <w:bCs/>
           <w:color w:val="000000" w:themeColor="text1"/>
           <w:sz w:val="22"/>
         </w:rPr>
       </w:pPr>
       <w:r>
         <w:rPr>
+          <w:b/>
+          <w:bCs/>
           <w:color w:val="000000" w:themeColor="text1"/>
           <w:sz w:val="22"/>
         </w:rPr>
-        <w:t xml:space="preserve">Godot Migration for </w:t>
+        <w:t xml:space="preserve">Samsung </w:t>
       </w:r>
       <w:proofErr w:type="spellStart"/>
       <w:r>
         <w:rPr>
+          <w:b/>
+          <w:bCs/>
           <w:color w:val="000000" w:themeColor="text1"/>
           <w:sz w:val="22"/>
         </w:rPr>
-        <w:t>MapView</w:t>
+        <w:t>DeX</w:t>
       </w:r>
       <w:proofErr w:type="spellEnd"/>
       <w:r>
         <w:rPr>
+          <w:b/>
+          <w:bCs/>
           <w:color w:val="000000" w:themeColor="text1"/>
           <w:sz w:val="22"/>
         </w:rPr>
-        <w:t xml:space="preserve"> 3D</w:t>
+        <w:t xml:space="preserve"> for PC (2019 – 2023)</w:t>
+      </w:r>
+    </w:p>
+    <w:p>
+      <w:pPr>
+        <w:pStyle w:val="List"/>
+        <w:rPr>
+          <w:color w:val="000000" w:themeColor="text1"/>
+          <w:sz w:val="22"/>
+        </w:rPr>
+      </w:pPr>
+      <w:r>
+        <w:rPr>
+          <w:color w:val="000000" w:themeColor="text1"/>
+          <w:sz w:val="22"/>
+        </w:rPr>
+        <w:t>Technical Lead (macOS)</w:t>
       </w:r>
     </w:p>
     <w:p>
@@ -990,7 +676,25 @@
           <w:sz w:val="20"/>
           <w:szCs w:val="20"/>
         </w:rPr>
-        <w:t>Exploring embedded Godot Engine integration within SmartThings iOS to replace Unity-based rendering workflows.</w:t>
+        <w:t xml:space="preserve">Led architecture and development of Samsung </w:t>
+      </w:r>
+      <w:proofErr w:type="spellStart"/>
+      <w:r>
+        <w:rPr>
+          <w:color w:val="000000" w:themeColor="text1"/>
+          <w:sz w:val="20"/>
+          <w:szCs w:val="20"/>
+        </w:rPr>
+        <w:t>DeX</w:t>
+      </w:r>
+      <w:proofErr w:type="spellEnd"/>
+      <w:r>
+        <w:rPr>
+          <w:color w:val="000000" w:themeColor="text1"/>
+          <w:sz w:val="20"/>
+          <w:szCs w:val="20"/>
+        </w:rPr>
+        <w:t xml:space="preserve"> for macOS, contributing to a platform with 7M+ downloads and 750K+ monthly active users.</w:t>
       </w:r>
     </w:p>
     <w:p>
@@ -1012,25 +716,7 @@
           <w:sz w:val="20"/>
           <w:szCs w:val="20"/>
         </w:rPr>
-        <w:t xml:space="preserve">Contributed to </w:t>
-      </w:r>
-      <w:proofErr w:type="spellStart"/>
-      <w:r>
-        <w:rPr>
-          <w:color w:val="000000" w:themeColor="text1"/>
-          <w:sz w:val="20"/>
-          <w:szCs w:val="20"/>
-        </w:rPr>
-        <w:t>SwiftGodotKit</w:t>
-      </w:r>
-      <w:proofErr w:type="spellEnd"/>
-      <w:r>
-        <w:rPr>
-          <w:color w:val="000000" w:themeColor="text1"/>
-          <w:sz w:val="20"/>
-          <w:szCs w:val="20"/>
-        </w:rPr>
-        <w:t xml:space="preserve"> and Godot iOS embedding support for native Swift ↔ Godot interoperability.</w:t>
+        <w:t>Partnered directly with Product Management to define feature roadmaps, architecture, and delivery strategy.</w:t>
       </w:r>
     </w:p>
     <w:p>
@@ -1052,23 +738,147 @@
           <w:sz w:val="20"/>
           <w:szCs w:val="20"/>
         </w:rPr>
-        <w:t>Worked on native-engine communication and rendering lifecycle integration for iOS.</w:t>
+        <w:t>Designed workflows and architecture for file transfer, clipboard sharing, wireless connectivity, device communication, and cross-device interaction experiences.</w:t>
       </w:r>
     </w:p>
     <w:p>
       <w:pPr>
         <w:pStyle w:val="List"/>
-        <w:rPr>
+        <w:numPr>
+          <w:ilvl w:val="0"/>
+          <w:numId w:val="16"/>
+        </w:numPr>
+        <w:rPr>
+          <w:color w:val="000000" w:themeColor="text1"/>
+          <w:sz w:val="20"/>
+          <w:szCs w:val="20"/>
+        </w:rPr>
+      </w:pPr>
+      <w:r>
+        <w:rPr>
+          <w:color w:val="000000" w:themeColor="text1"/>
+          <w:sz w:val="20"/>
+          <w:szCs w:val="20"/>
+        </w:rPr>
+        <w:t>Delivered Apple Silicon (M1) compatibility and Universal Binary support.</w:t>
+      </w:r>
+    </w:p>
+    <w:p>
+      <w:pPr>
+        <w:pStyle w:val="List"/>
+        <w:numPr>
+          <w:ilvl w:val="0"/>
+          <w:numId w:val="16"/>
+        </w:numPr>
+        <w:rPr>
+          <w:color w:val="000000" w:themeColor="text1"/>
+          <w:sz w:val="20"/>
+          <w:szCs w:val="20"/>
+        </w:rPr>
+      </w:pPr>
+      <w:r>
+        <w:rPr>
+          <w:color w:val="000000" w:themeColor="text1"/>
+          <w:sz w:val="20"/>
+          <w:szCs w:val="20"/>
+        </w:rPr>
+        <w:t>Owned release planning, release management, code reviews, performance optimization, and macOS notarization pipelines.</w:t>
+      </w:r>
+    </w:p>
+    <w:p>
+      <w:pPr>
+        <w:pStyle w:val="List"/>
+        <w:numPr>
+          <w:ilvl w:val="0"/>
+          <w:numId w:val="16"/>
+        </w:numPr>
+        <w:rPr>
+          <w:color w:val="000000" w:themeColor="text1"/>
+          <w:sz w:val="20"/>
+          <w:szCs w:val="20"/>
+        </w:rPr>
+      </w:pPr>
+      <w:r>
+        <w:rPr>
+          <w:color w:val="000000" w:themeColor="text1"/>
+          <w:sz w:val="20"/>
+          <w:szCs w:val="20"/>
+        </w:rPr>
+        <w:t>Collaborated with Android, Windows, QA, and Product teams to deliver major platform capabilities.</w:t>
+      </w:r>
+    </w:p>
+    <w:p>
+      <w:pPr>
+        <w:pStyle w:val="List"/>
+        <w:numPr>
+          <w:ilvl w:val="0"/>
+          <w:numId w:val="16"/>
+        </w:numPr>
+        <w:rPr>
+          <w:color w:val="000000" w:themeColor="text1"/>
+          <w:sz w:val="20"/>
+          <w:szCs w:val="20"/>
+        </w:rPr>
+      </w:pPr>
+      <w:r>
+        <w:rPr>
+          <w:color w:val="000000" w:themeColor="text1"/>
+          <w:sz w:val="20"/>
+          <w:szCs w:val="20"/>
+        </w:rPr>
+        <w:t>Mentored engineers and contributed to technical planning, architecture reviews, and delivery execution.</w:t>
+      </w:r>
+    </w:p>
+    <w:p>
+      <w:pPr>
+        <w:pStyle w:val="List"/>
+        <w:numPr>
+          <w:ilvl w:val="0"/>
+          <w:numId w:val="16"/>
+        </w:numPr>
+        <w:rPr>
+          <w:color w:val="000000" w:themeColor="text1"/>
+          <w:sz w:val="20"/>
+          <w:szCs w:val="20"/>
+        </w:rPr>
+      </w:pPr>
+      <w:r>
+        <w:rPr>
+          <w:color w:val="000000" w:themeColor="text1"/>
+          <w:sz w:val="20"/>
+          <w:szCs w:val="20"/>
+        </w:rPr>
+        <w:t>Developed proof-of-concept solutions and technical proposals presented to Samsung leadership and stakeholders.</w:t>
+      </w:r>
+    </w:p>
+    <w:p>
+      <w:pPr>
+        <w:pStyle w:val="List"/>
+        <w:rPr>
+          <w:color w:val="000000" w:themeColor="text1"/>
+          <w:sz w:val="10"/>
+          <w:szCs w:val="10"/>
+        </w:rPr>
+      </w:pPr>
+    </w:p>
+    <w:p>
+      <w:pPr>
+        <w:pStyle w:val="List"/>
+        <w:rPr>
+          <w:b/>
+          <w:bCs/>
           <w:color w:val="000000" w:themeColor="text1"/>
           <w:sz w:val="22"/>
         </w:rPr>
       </w:pPr>
       <w:r>
         <w:rPr>
+          <w:b/>
+          <w:bCs/>
           <w:color w:val="000000" w:themeColor="text1"/>
           <w:sz w:val="22"/>
         </w:rPr>
-        <w:t>Other Key Contributions</w:t>
+        <w:t>Platform &amp; Framework Engineering (2013 – 2019)</w:t>
       </w:r>
     </w:p>
     <w:p>
@@ -1090,7 +900,7 @@
           <w:sz w:val="20"/>
           <w:szCs w:val="20"/>
         </w:rPr>
-        <w:t>Awarded Star Employee of the Month (January 2026).</w:t>
+        <w:t>Designed and implemented mobile UI automation frameworks used for automated testing across Android, Tizen, and iOS ecosystems.</w:t>
       </w:r>
     </w:p>
     <w:p>
@@ -1112,7 +922,7 @@
           <w:sz w:val="20"/>
           <w:szCs w:val="20"/>
         </w:rPr>
-        <w:t>Achieved Professional Level (Top 20%) in Samsung’s SW Certificate Test.</w:t>
+        <w:t>Developed automation tooling and supporting infrastructure to improve testing efficiency and product quality.</w:t>
       </w:r>
     </w:p>
     <w:p>
@@ -1134,7 +944,26 @@
           <w:sz w:val="20"/>
           <w:szCs w:val="20"/>
         </w:rPr>
-        <w:t>Modernized UI and improved IPC for Samsung Medison 5D Viewer (WPF) used in medical ultrasound systems.</w:t>
+        <w:lastRenderedPageBreak/>
+        <w:t xml:space="preserve">Contributed to the open-source </w:t>
+      </w:r>
+      <w:proofErr w:type="spellStart"/>
+      <w:r>
+        <w:rPr>
+          <w:color w:val="000000" w:themeColor="text1"/>
+          <w:sz w:val="20"/>
+          <w:szCs w:val="20"/>
+        </w:rPr>
+        <w:t>IoTivity</w:t>
+      </w:r>
+      <w:proofErr w:type="spellEnd"/>
+      <w:r>
+        <w:rPr>
+          <w:color w:val="000000" w:themeColor="text1"/>
+          <w:sz w:val="20"/>
+          <w:szCs w:val="20"/>
+        </w:rPr>
+        <w:t xml:space="preserve"> framework, implementing OCF-compliant APIs and interoperability features for connected-device ecosystems.</w:t>
       </w:r>
     </w:p>
     <w:p>
@@ -1156,427 +985,12 @@
           <w:sz w:val="20"/>
           <w:szCs w:val="20"/>
         </w:rPr>
-        <w:t xml:space="preserve">Technical Lead for Samsung </w:t>
-      </w:r>
-      <w:proofErr w:type="spellStart"/>
-      <w:r>
-        <w:rPr>
-          <w:color w:val="000000" w:themeColor="text1"/>
-          <w:sz w:val="20"/>
-          <w:szCs w:val="20"/>
-        </w:rPr>
-        <w:t>DeX</w:t>
-      </w:r>
-      <w:proofErr w:type="spellEnd"/>
-      <w:r>
-        <w:rPr>
-          <w:color w:val="000000" w:themeColor="text1"/>
-          <w:sz w:val="20"/>
-          <w:szCs w:val="20"/>
-        </w:rPr>
-        <w:t xml:space="preserve"> for PC (7M+ downloads, 757K+ monthly users), contributing to planning, architecture, and optimization.</w:t>
+        <w:t>Participated in SDK and framework development enabling communication across heterogeneous IoT platforms.</w:t>
       </w:r>
     </w:p>
     <w:p>
       <w:pPr>
         <w:pStyle w:val="List"/>
-        <w:numPr>
-          <w:ilvl w:val="0"/>
-          <w:numId w:val="17"/>
-        </w:numPr>
-        <w:rPr>
-          <w:color w:val="000000" w:themeColor="text1"/>
-          <w:sz w:val="20"/>
-          <w:szCs w:val="20"/>
-        </w:rPr>
-      </w:pPr>
-      <w:r>
-        <w:rPr>
-          <w:color w:val="000000" w:themeColor="text1"/>
-          <w:sz w:val="20"/>
-          <w:szCs w:val="20"/>
-        </w:rPr>
-        <w:lastRenderedPageBreak/>
-        <w:t>Performed memory optimization and code reviews for MFC-based Windows applications.</w:t>
-      </w:r>
-    </w:p>
-    <w:p>
-      <w:pPr>
-        <w:pStyle w:val="List"/>
-        <w:rPr>
-          <w:color w:val="000000" w:themeColor="text1"/>
-        </w:rPr>
-      </w:pPr>
-      <w:r>
-        <w:rPr>
-          <w:rStyle w:val="Emphasis"/>
-          <w:color w:val="000000" w:themeColor="text1"/>
-        </w:rPr>
-        <w:t xml:space="preserve">Samsung R&amp;D Institute Bangladesh Ltd. </w:t>
-      </w:r>
-      <w:r>
-        <w:rPr>
-          <w:color w:val="000000" w:themeColor="text1"/>
-        </w:rPr>
-        <w:t>| Engineer-III</w:t>
-      </w:r>
-      <w:r>
-        <w:rPr>
-          <w:color w:val="000000" w:themeColor="text1"/>
-        </w:rPr>
-        <w:t xml:space="preserve"> | </w:t>
-      </w:r>
-      <w:r>
-        <w:rPr>
-          <w:color w:val="000000" w:themeColor="text1"/>
-        </w:rPr>
-        <w:t>Mar 2019 –</w:t>
-      </w:r>
-      <w:r>
-        <w:rPr>
-          <w:color w:val="000000" w:themeColor="text1"/>
-        </w:rPr>
-        <w:t xml:space="preserve"> </w:t>
-      </w:r>
-      <w:r>
-        <w:rPr>
-          <w:color w:val="000000" w:themeColor="text1"/>
-        </w:rPr>
-        <w:t xml:space="preserve">Feb </w:t>
-      </w:r>
-      <w:r>
-        <w:rPr>
-          <w:color w:val="000000" w:themeColor="text1"/>
-        </w:rPr>
-        <w:t>20</w:t>
-      </w:r>
-      <w:r>
-        <w:rPr>
-          <w:color w:val="000000" w:themeColor="text1"/>
-        </w:rPr>
-        <w:t>21</w:t>
-      </w:r>
-    </w:p>
-    <w:p>
-      <w:pPr>
-        <w:pStyle w:val="List"/>
-        <w:numPr>
-          <w:ilvl w:val="0"/>
-          <w:numId w:val="18"/>
-        </w:numPr>
-        <w:rPr>
-          <w:color w:val="000000" w:themeColor="text1"/>
-          <w:sz w:val="20"/>
-          <w:szCs w:val="20"/>
-        </w:rPr>
-      </w:pPr>
-      <w:r>
-        <w:rPr>
-          <w:color w:val="000000" w:themeColor="text1"/>
-          <w:sz w:val="20"/>
-          <w:szCs w:val="20"/>
-        </w:rPr>
-        <w:t xml:space="preserve">Lead macOS engineer for Samsung </w:t>
-      </w:r>
-      <w:proofErr w:type="spellStart"/>
-      <w:r>
-        <w:rPr>
-          <w:color w:val="000000" w:themeColor="text1"/>
-          <w:sz w:val="20"/>
-          <w:szCs w:val="20"/>
-        </w:rPr>
-        <w:t>DeX</w:t>
-      </w:r>
-      <w:proofErr w:type="spellEnd"/>
-      <w:r>
-        <w:rPr>
-          <w:color w:val="000000" w:themeColor="text1"/>
-          <w:sz w:val="20"/>
-          <w:szCs w:val="20"/>
-        </w:rPr>
-        <w:t xml:space="preserve"> for PC, owning architecture, release pipeline, notarization, and Apple Silicon transition.</w:t>
-      </w:r>
-    </w:p>
-    <w:p>
-      <w:pPr>
-        <w:pStyle w:val="List"/>
-        <w:numPr>
-          <w:ilvl w:val="0"/>
-          <w:numId w:val="18"/>
-        </w:numPr>
-        <w:rPr>
-          <w:color w:val="000000" w:themeColor="text1"/>
-          <w:sz w:val="20"/>
-          <w:szCs w:val="20"/>
-        </w:rPr>
-      </w:pPr>
-      <w:r>
-        <w:rPr>
-          <w:color w:val="000000" w:themeColor="text1"/>
-          <w:sz w:val="20"/>
-          <w:szCs w:val="20"/>
-        </w:rPr>
-        <w:t>Delivered universal macOS application support for Apple Silicon (M1).</w:t>
-      </w:r>
-    </w:p>
-    <w:p>
-      <w:pPr>
-        <w:pStyle w:val="List"/>
-        <w:numPr>
-          <w:ilvl w:val="0"/>
-          <w:numId w:val="18"/>
-        </w:numPr>
-        <w:rPr>
-          <w:color w:val="000000" w:themeColor="text1"/>
-          <w:sz w:val="20"/>
-          <w:szCs w:val="20"/>
-        </w:rPr>
-      </w:pPr>
-      <w:r>
-        <w:rPr>
-          <w:color w:val="000000" w:themeColor="text1"/>
-          <w:sz w:val="20"/>
-          <w:szCs w:val="20"/>
-        </w:rPr>
-        <w:t>Implemented USB and wireless connectivity between Android devices and macOS.</w:t>
-      </w:r>
-    </w:p>
-    <w:p>
-      <w:pPr>
-        <w:pStyle w:val="List"/>
-        <w:numPr>
-          <w:ilvl w:val="0"/>
-          <w:numId w:val="18"/>
-        </w:numPr>
-        <w:rPr>
-          <w:color w:val="000000" w:themeColor="text1"/>
-          <w:sz w:val="20"/>
-          <w:szCs w:val="20"/>
-        </w:rPr>
-      </w:pPr>
-      <w:r>
-        <w:rPr>
-          <w:color w:val="000000" w:themeColor="text1"/>
-          <w:sz w:val="20"/>
-          <w:szCs w:val="20"/>
-        </w:rPr>
-        <w:t>Developed file transfer, RTSP-based screen rendering, and input-sharing features.</w:t>
-      </w:r>
-    </w:p>
-    <w:p>
-      <w:pPr>
-        <w:pStyle w:val="List"/>
-        <w:numPr>
-          <w:ilvl w:val="0"/>
-          <w:numId w:val="18"/>
-        </w:numPr>
-        <w:rPr>
-          <w:color w:val="000000" w:themeColor="text1"/>
-        </w:rPr>
-      </w:pPr>
-      <w:r>
-        <w:rPr>
-          <w:color w:val="000000" w:themeColor="text1"/>
-          <w:sz w:val="20"/>
-          <w:szCs w:val="20"/>
-        </w:rPr>
-        <w:t>Ensured performance, stability, and cross-platform compatibility.</w:t>
-      </w:r>
-    </w:p>
-    <w:p>
-      <w:pPr>
-        <w:pStyle w:val="Space"/>
-        <w:rPr>
-          <w:color w:val="000000" w:themeColor="text1"/>
-          <w:sz w:val="10"/>
-          <w:szCs w:val="10"/>
-        </w:rPr>
-      </w:pPr>
-    </w:p>
-    <w:p>
-      <w:pPr>
-        <w:pStyle w:val="List"/>
-        <w:rPr>
-          <w:color w:val="000000" w:themeColor="text1"/>
-        </w:rPr>
-      </w:pPr>
-      <w:r>
-        <w:rPr>
-          <w:rStyle w:val="Emphasis"/>
-          <w:color w:val="000000" w:themeColor="text1"/>
-        </w:rPr>
-        <w:t xml:space="preserve">Samsung R&amp;D Institute Bangladesh Ltd. </w:t>
-      </w:r>
-      <w:r>
-        <w:rPr>
-          <w:color w:val="000000" w:themeColor="text1"/>
-        </w:rPr>
-        <w:t>| Engineer-II</w:t>
-      </w:r>
-      <w:r>
-        <w:rPr>
-          <w:color w:val="000000" w:themeColor="text1"/>
-        </w:rPr>
-        <w:t xml:space="preserve"> | </w:t>
-      </w:r>
-      <w:r>
-        <w:rPr>
-          <w:color w:val="000000" w:themeColor="text1"/>
-        </w:rPr>
-        <w:t xml:space="preserve">Mar </w:t>
-      </w:r>
-      <w:r>
-        <w:rPr>
-          <w:color w:val="000000" w:themeColor="text1"/>
-        </w:rPr>
-        <w:t>20</w:t>
-      </w:r>
-      <w:r>
-        <w:rPr>
-          <w:color w:val="000000" w:themeColor="text1"/>
-        </w:rPr>
-        <w:t>17 –</w:t>
-      </w:r>
-      <w:r>
-        <w:rPr>
-          <w:color w:val="000000" w:themeColor="text1"/>
-        </w:rPr>
-        <w:t xml:space="preserve"> </w:t>
-      </w:r>
-      <w:r>
-        <w:rPr>
-          <w:color w:val="000000" w:themeColor="text1"/>
-        </w:rPr>
-        <w:t xml:space="preserve">Feb </w:t>
-      </w:r>
-      <w:r>
-        <w:rPr>
-          <w:color w:val="000000" w:themeColor="text1"/>
-        </w:rPr>
-        <w:t>20</w:t>
-      </w:r>
-      <w:r>
-        <w:rPr>
-          <w:color w:val="000000" w:themeColor="text1"/>
-        </w:rPr>
-        <w:t>19</w:t>
-      </w:r>
-    </w:p>
-    <w:p>
-      <w:pPr>
-        <w:pStyle w:val="List"/>
-        <w:numPr>
-          <w:ilvl w:val="0"/>
-          <w:numId w:val="19"/>
-        </w:numPr>
-        <w:rPr>
-          <w:color w:val="000000" w:themeColor="text1"/>
-          <w:sz w:val="20"/>
-          <w:szCs w:val="20"/>
-        </w:rPr>
-      </w:pPr>
-      <w:r>
-        <w:rPr>
-          <w:color w:val="000000" w:themeColor="text1"/>
-          <w:sz w:val="20"/>
-          <w:szCs w:val="20"/>
-        </w:rPr>
-        <w:t>Built UI Automator solutions for Android and Tizen platforms for internal B2B device testing.</w:t>
-      </w:r>
-    </w:p>
-    <w:p>
-      <w:pPr>
-        <w:pStyle w:val="List"/>
-        <w:numPr>
-          <w:ilvl w:val="0"/>
-          <w:numId w:val="19"/>
-        </w:numPr>
-        <w:rPr>
-          <w:color w:val="000000" w:themeColor="text1"/>
-          <w:sz w:val="20"/>
-          <w:szCs w:val="20"/>
-        </w:rPr>
-      </w:pPr>
-      <w:r>
-        <w:rPr>
-          <w:color w:val="000000" w:themeColor="text1"/>
-          <w:sz w:val="20"/>
-          <w:szCs w:val="20"/>
-        </w:rPr>
-        <w:t>Developed an iOS UI automation framework similar to Appium.</w:t>
-      </w:r>
-    </w:p>
-    <w:p>
-      <w:pPr>
-        <w:pStyle w:val="List"/>
-        <w:numPr>
-          <w:ilvl w:val="0"/>
-          <w:numId w:val="19"/>
-        </w:numPr>
-        <w:rPr>
-          <w:color w:val="000000" w:themeColor="text1"/>
-          <w:sz w:val="20"/>
-          <w:szCs w:val="20"/>
-        </w:rPr>
-      </w:pPr>
-      <w:r>
-        <w:rPr>
-          <w:color w:val="000000" w:themeColor="text1"/>
-          <w:sz w:val="20"/>
-          <w:szCs w:val="20"/>
-        </w:rPr>
-        <w:t>Created an Eclipse plugin to generate automated test cases and integrate internal tools.</w:t>
-      </w:r>
-    </w:p>
-    <w:p>
-      <w:pPr>
-        <w:pStyle w:val="List"/>
-        <w:rPr>
-          <w:rStyle w:val="Emphasis"/>
-          <w:b w:val="0"/>
-          <w:iCs w:val="0"/>
-          <w:color w:val="000000" w:themeColor="text1"/>
-          <w:sz w:val="10"/>
-          <w:szCs w:val="10"/>
-        </w:rPr>
-      </w:pPr>
-    </w:p>
-    <w:p>
-      <w:pPr>
-        <w:pStyle w:val="List"/>
-        <w:rPr>
-          <w:color w:val="000000" w:themeColor="text1"/>
-        </w:rPr>
-      </w:pPr>
-      <w:r>
-        <w:rPr>
-          <w:rStyle w:val="Emphasis"/>
-          <w:color w:val="000000" w:themeColor="text1"/>
-        </w:rPr>
-        <w:t xml:space="preserve">Samsung R&amp;D Institute Bangladesh Ltd. </w:t>
-      </w:r>
-      <w:r>
-        <w:rPr>
-          <w:color w:val="000000" w:themeColor="text1"/>
-        </w:rPr>
-        <w:t>| Engineer-I</w:t>
-      </w:r>
-      <w:r>
-        <w:rPr>
-          <w:color w:val="000000" w:themeColor="text1"/>
-        </w:rPr>
-        <w:t xml:space="preserve"> | </w:t>
-      </w:r>
-      <w:r>
-        <w:rPr>
-          <w:color w:val="000000" w:themeColor="text1"/>
-        </w:rPr>
-        <w:t>Jun 2013 – Feb 2017</w:t>
-      </w:r>
-    </w:p>
-    <w:p>
-      <w:pPr>
-        <w:pStyle w:val="ListBullet"/>
         <w:numPr>
           <w:ilvl w:val="0"/>
           <w:numId w:val="20"/>
@@ -1593,9 +1007,99 @@
           <w:sz w:val="20"/>
           <w:szCs w:val="20"/>
         </w:rPr>
-        <w:t xml:space="preserve">Contributed to </w:t>
-      </w:r>
-      <w:hyperlink r:id="rId13" w:history="1">
+        <w:t>Built internal engineering tools supporting device automation, testing, and productivity workflows.</w:t>
+      </w:r>
+    </w:p>
+    <w:p>
+      <w:pPr>
+        <w:pStyle w:val="List"/>
+        <w:rPr>
+          <w:color w:val="000000" w:themeColor="text1"/>
+          <w:sz w:val="16"/>
+          <w:szCs w:val="16"/>
+        </w:rPr>
+      </w:pPr>
+    </w:p>
+    <w:p>
+      <w:pPr>
+        <w:pStyle w:val="List"/>
+        <w:rPr>
+          <w:rStyle w:val="Emphasis"/>
+          <w:color w:val="000000" w:themeColor="text1"/>
+        </w:rPr>
+      </w:pPr>
+      <w:r>
+        <w:rPr>
+          <w:rStyle w:val="Emphasis"/>
+          <w:color w:val="000000" w:themeColor="text1"/>
+        </w:rPr>
+        <w:t>RTC Hubs Limited</w:t>
+      </w:r>
+    </w:p>
+    <w:p>
+      <w:pPr>
+        <w:pStyle w:val="List"/>
+        <w:rPr>
+          <w:color w:val="000000" w:themeColor="text1"/>
+        </w:rPr>
+      </w:pPr>
+      <w:r>
+        <w:rPr>
+          <w:color w:val="000000" w:themeColor="text1"/>
+        </w:rPr>
+        <w:t>Junior Programmer</w:t>
+      </w:r>
+      <w:r>
+        <w:rPr>
+          <w:color w:val="000000" w:themeColor="text1"/>
+        </w:rPr>
+        <w:t xml:space="preserve"> (iOS Developer)</w:t>
+      </w:r>
+      <w:r>
+        <w:rPr>
+          <w:color w:val="000000" w:themeColor="text1"/>
+        </w:rPr>
+        <w:t xml:space="preserve"> | </w:t>
+      </w:r>
+      <w:r>
+        <w:rPr>
+          <w:color w:val="000000" w:themeColor="text1"/>
+        </w:rPr>
+        <w:t>Sep 2012 – Jun 2013</w:t>
+      </w:r>
+    </w:p>
+    <w:p>
+      <w:pPr>
+        <w:pStyle w:val="List"/>
+        <w:rPr>
+          <w:color w:val="000000" w:themeColor="text1"/>
+          <w:sz w:val="10"/>
+          <w:szCs w:val="10"/>
+        </w:rPr>
+      </w:pPr>
+    </w:p>
+    <w:p>
+      <w:pPr>
+        <w:pStyle w:val="List"/>
+        <w:numPr>
+          <w:ilvl w:val="0"/>
+          <w:numId w:val="21"/>
+        </w:numPr>
+        <w:rPr>
+          <w:color w:val="000000" w:themeColor="text1"/>
+          <w:sz w:val="20"/>
+          <w:szCs w:val="20"/>
+        </w:rPr>
+      </w:pPr>
+      <w:r>
+        <w:rPr>
+          <w:color w:val="000000" w:themeColor="text1"/>
+          <w:sz w:val="20"/>
+          <w:szCs w:val="20"/>
+        </w:rPr>
+        <w:t xml:space="preserve">Developed 8+ iOS applications using Objective-C and </w:t>
+      </w:r>
+      <w:hyperlink r:id="rId14" w:history="1">
         <w:proofErr w:type="spellStart"/>
         <w:r>
           <w:rPr>
@@ -1603,7 +1107,7 @@
             <w:sz w:val="20"/>
             <w:szCs w:val="20"/>
           </w:rPr>
-          <w:t>IoTivity</w:t>
+          <w:t>GPUImage</w:t>
         </w:r>
         <w:proofErr w:type="spellEnd"/>
       </w:hyperlink>
@@ -1613,130 +1117,7 @@
           <w:sz w:val="20"/>
           <w:szCs w:val="20"/>
         </w:rPr>
-        <w:t xml:space="preserve"> </w:t>
-      </w:r>
-      <w:hyperlink r:id="rId14" w:history="1">
-        <w:r>
-          <w:rPr>
-            <w:rStyle w:val="Hyperlink"/>
-            <w:sz w:val="20"/>
-            <w:szCs w:val="20"/>
-          </w:rPr>
-          <w:t>SDK</w:t>
-        </w:r>
-      </w:hyperlink>
-      <w:r>
-        <w:rPr>
-          <w:color w:val="000000" w:themeColor="text1"/>
-          <w:sz w:val="20"/>
-          <w:szCs w:val="20"/>
-        </w:rPr>
-        <w:t>, adopted by Samsung, LG, and Microsoft IoT solutions.</w:t>
-      </w:r>
-    </w:p>
-    <w:p>
-      <w:pPr>
-        <w:pStyle w:val="ListBullet"/>
-        <w:numPr>
-          <w:ilvl w:val="0"/>
-          <w:numId w:val="20"/>
-        </w:numPr>
-        <w:rPr>
-          <w:color w:val="000000" w:themeColor="text1"/>
-          <w:sz w:val="20"/>
-          <w:szCs w:val="20"/>
-        </w:rPr>
-      </w:pPr>
-      <w:r>
-        <w:rPr>
-          <w:color w:val="000000" w:themeColor="text1"/>
-          <w:sz w:val="20"/>
-          <w:szCs w:val="20"/>
-        </w:rPr>
-        <w:t xml:space="preserve">Developed </w:t>
-      </w:r>
-      <w:hyperlink r:id="rId15" w:history="1">
-        <w:r>
-          <w:rPr>
-            <w:rStyle w:val="Hyperlink"/>
-            <w:sz w:val="20"/>
-            <w:szCs w:val="20"/>
-          </w:rPr>
-          <w:t>OCF</w:t>
-        </w:r>
-      </w:hyperlink>
-      <w:r>
-        <w:rPr>
-          <w:color w:val="000000" w:themeColor="text1"/>
-          <w:sz w:val="20"/>
-          <w:szCs w:val="20"/>
-        </w:rPr>
-        <w:t>-compliant APIs enabling cross-platform IoT interoperability.</w:t>
-      </w:r>
-    </w:p>
-    <w:p>
-      <w:pPr>
-        <w:pStyle w:val="ListBullet"/>
-        <w:numPr>
-          <w:ilvl w:val="0"/>
-          <w:numId w:val="20"/>
-        </w:numPr>
-        <w:rPr>
-          <w:color w:val="000000" w:themeColor="text1"/>
-          <w:sz w:val="20"/>
-          <w:szCs w:val="20"/>
-        </w:rPr>
-      </w:pPr>
-      <w:r>
-        <w:rPr>
-          <w:color w:val="000000" w:themeColor="text1"/>
-          <w:sz w:val="20"/>
-          <w:szCs w:val="20"/>
-        </w:rPr>
-        <w:t>Built a C# .NET desktop application to remotely control Android &amp; Tizen devices.</w:t>
-      </w:r>
-    </w:p>
-    <w:p>
-      <w:pPr>
-        <w:pStyle w:val="List"/>
-        <w:rPr>
-          <w:color w:val="000000" w:themeColor="text1"/>
-          <w:sz w:val="10"/>
-          <w:szCs w:val="10"/>
-        </w:rPr>
-      </w:pPr>
-    </w:p>
-    <w:p>
-      <w:pPr>
-        <w:pStyle w:val="List"/>
-        <w:rPr>
-          <w:color w:val="000000" w:themeColor="text1"/>
-        </w:rPr>
-      </w:pPr>
-      <w:r>
-        <w:rPr>
-          <w:rStyle w:val="Emphasis"/>
-          <w:color w:val="000000" w:themeColor="text1"/>
-        </w:rPr>
-        <w:t xml:space="preserve">RTC Hubs Limited </w:t>
-      </w:r>
-      <w:r>
-        <w:rPr>
-          <w:color w:val="000000" w:themeColor="text1"/>
-        </w:rPr>
-        <w:t>| Junior Programmer</w:t>
-      </w:r>
-      <w:r>
-        <w:rPr>
-          <w:color w:val="000000" w:themeColor="text1"/>
-        </w:rPr>
-        <w:t xml:space="preserve"> | </w:t>
-      </w:r>
-      <w:r>
-        <w:rPr>
-          <w:color w:val="000000" w:themeColor="text1"/>
-        </w:rPr>
-        <w:t>Sep 2012 – Jun 2013</w:t>
+        <w:t>.</w:t>
       </w:r>
     </w:p>
     <w:p>
@@ -1758,7 +1139,7 @@
           <w:sz w:val="20"/>
           <w:szCs w:val="20"/>
         </w:rPr>
-        <w:t>Created Multi Shot Cam, a top-charted iOS app generating highest revenue at RTC Hubs.</w:t>
+        <w:t>Built camera and productivity applications for iPhone and iPad.</w:t>
       </w:r>
     </w:p>
     <w:p>
@@ -1780,35 +1161,75 @@
           <w:sz w:val="20"/>
           <w:szCs w:val="20"/>
         </w:rPr>
-        <w:t xml:space="preserve">Developed 8+ iOS apps including camera &amp; productivity tools using </w:t>
-      </w:r>
-      <w:hyperlink r:id="rId16" w:history="1">
-        <w:proofErr w:type="spellStart"/>
-        <w:r>
-          <w:rPr>
-            <w:rStyle w:val="Hyperlink"/>
-            <w:b/>
-            <w:bCs/>
-            <w:color w:val="000000" w:themeColor="text1"/>
-            <w:sz w:val="20"/>
-            <w:szCs w:val="20"/>
-          </w:rPr>
-          <w:t>GPUImage</w:t>
-        </w:r>
-        <w:proofErr w:type="spellEnd"/>
-      </w:hyperlink>
-      <w:r>
-        <w:rPr>
-          <w:sz w:val="20"/>
-          <w:szCs w:val="20"/>
-        </w:rPr>
-        <w:t>.</w:t>
+        <w:t>Delivered Multi Shot Cam, one of the company’s highest-performing applications.</w:t>
       </w:r>
     </w:p>
     <w:p>
       <w:pPr>
         <w:pStyle w:val="List"/>
         <w:rPr>
+          <w:color w:val="000000" w:themeColor="text1"/>
+          <w:sz w:val="16"/>
+          <w:szCs w:val="16"/>
+        </w:rPr>
+      </w:pPr>
+    </w:p>
+    <w:p>
+      <w:pPr>
+        <w:pStyle w:val="Heading1"/>
+        <w:rPr>
+          <w:color w:val="000000" w:themeColor="text1"/>
+        </w:rPr>
+      </w:pPr>
+      <w:r>
+        <w:rPr>
+          <w:color w:val="000000" w:themeColor="text1"/>
+        </w:rPr>
+        <w:t>TECHNICAL SKILLS</w:t>
+      </w:r>
+    </w:p>
+    <w:p>
+      <w:pPr>
+        <w:pStyle w:val="List"/>
+        <w:rPr>
+          <w:b/>
+          <w:iCs/>
+          <w:color w:val="000000" w:themeColor="text1"/>
+        </w:rPr>
+      </w:pPr>
+      <w:r>
+        <w:rPr>
+          <w:b/>
+          <w:iCs/>
+          <w:color w:val="000000" w:themeColor="text1"/>
+        </w:rPr>
+        <w:t>Languages</w:t>
+      </w:r>
+    </w:p>
+    <w:p>
+      <w:pPr>
+        <w:pStyle w:val="List"/>
+        <w:rPr>
+          <w:bCs/>
+          <w:iCs/>
+          <w:color w:val="000000" w:themeColor="text1"/>
+        </w:rPr>
+      </w:pPr>
+      <w:r>
+        <w:rPr>
+          <w:bCs/>
+          <w:iCs/>
+          <w:color w:val="000000" w:themeColor="text1"/>
+        </w:rPr>
+        <w:t>Swift, Objective-C, C++, C#, Java</w:t>
+      </w:r>
+    </w:p>
+    <w:p>
+      <w:pPr>
+        <w:pStyle w:val="List"/>
+        <w:rPr>
+          <w:b/>
+          <w:iCs/>
           <w:color w:val="000000" w:themeColor="text1"/>
           <w:sz w:val="10"/>
           <w:szCs w:val="10"/>
@@ -1817,41 +1238,31 @@
     </w:p>
     <w:p>
       <w:pPr>
-        <w:pStyle w:val="Heading1"/>
-        <w:rPr>
-          <w:color w:val="000000" w:themeColor="text1"/>
-        </w:rPr>
-      </w:pPr>
-      <w:r>
-        <w:rPr>
-          <w:color w:val="000000" w:themeColor="text1"/>
-        </w:rPr>
-        <w:t>Mentoring and Leadership</w:t>
-      </w:r>
-    </w:p>
-    <w:p>
-      <w:pPr>
         <w:pStyle w:val="List"/>
-        <w:rPr>
-          <w:color w:val="000000" w:themeColor="text1"/>
-        </w:rPr>
-      </w:pPr>
-      <w:r>
         <w:rPr>
           <w:b/>
           <w:iCs/>
           <w:color w:val="000000" w:themeColor="text1"/>
         </w:rPr>
-        <w:t>SmartThings (iOS)</w:t>
-      </w:r>
-      <w:r>
+      </w:pPr>
+      <w:r>
+        <w:rPr>
+          <w:b/>
+          <w:iCs/>
+          <w:color w:val="000000" w:themeColor="text1"/>
+        </w:rPr>
+        <w:t>Apple Platform Development</w:t>
+      </w:r>
+    </w:p>
+    <w:p>
+      <w:pPr>
+        <w:pStyle w:val="List"/>
         <w:rPr>
           <w:bCs/>
           <w:iCs/>
           <w:color w:val="000000" w:themeColor="text1"/>
         </w:rPr>
-        <w:t xml:space="preserve"> – Settings &amp; </w:t>
-      </w:r>
+      </w:pPr>
       <w:proofErr w:type="spellStart"/>
       <w:r>
         <w:rPr>
@@ -1859,208 +1270,272 @@
           <w:iCs/>
           <w:color w:val="000000" w:themeColor="text1"/>
         </w:rPr>
-        <w:t>MapView</w:t>
+        <w:t>UIKit</w:t>
       </w:r>
       <w:proofErr w:type="spellEnd"/>
       <w:r>
         <w:rPr>
-          <w:color w:val="000000" w:themeColor="text1"/>
-        </w:rPr>
-        <w:t xml:space="preserve"> | </w:t>
-      </w:r>
-      <w:r>
-        <w:rPr>
-          <w:color w:val="000000" w:themeColor="text1"/>
-        </w:rPr>
-        <w:t>Mar 2024 – Present</w:t>
-      </w:r>
-    </w:p>
-    <w:p>
-      <w:pPr>
-        <w:pStyle w:val="ListBullet"/>
-        <w:numPr>
-          <w:ilvl w:val="0"/>
-          <w:numId w:val="22"/>
-        </w:numPr>
-        <w:rPr>
-          <w:color w:val="000000" w:themeColor="text1"/>
-          <w:sz w:val="20"/>
-          <w:szCs w:val="20"/>
-        </w:rPr>
-      </w:pPr>
-      <w:r>
+          <w:bCs/>
+          <w:iCs/>
+          <w:color w:val="000000" w:themeColor="text1"/>
+        </w:rPr>
+        <w:t xml:space="preserve">, </w:t>
+      </w:r>
+      <w:proofErr w:type="spellStart"/>
+      <w:r>
+        <w:rPr>
+          <w:bCs/>
+          <w:iCs/>
+          <w:color w:val="000000" w:themeColor="text1"/>
+        </w:rPr>
+        <w:t>SwiftUI</w:t>
+      </w:r>
+      <w:proofErr w:type="spellEnd"/>
+      <w:r>
+        <w:rPr>
+          <w:bCs/>
+          <w:iCs/>
+          <w:color w:val="000000" w:themeColor="text1"/>
+        </w:rPr>
+        <w:t xml:space="preserve">, Combine, Swift Concurrency, Grand Central Dispatch (GCD), </w:t>
+      </w:r>
+      <w:proofErr w:type="spellStart"/>
+      <w:r>
+        <w:rPr>
+          <w:bCs/>
+          <w:iCs/>
+          <w:color w:val="000000" w:themeColor="text1"/>
+        </w:rPr>
+        <w:t>XCTest</w:t>
+      </w:r>
+      <w:proofErr w:type="spellEnd"/>
+    </w:p>
+    <w:p>
+      <w:pPr>
+        <w:pStyle w:val="List"/>
         <w:rPr>
           <w:b/>
+          <w:iCs/>
+          <w:color w:val="000000" w:themeColor="text1"/>
+          <w:sz w:val="10"/>
+          <w:szCs w:val="10"/>
+        </w:rPr>
+      </w:pPr>
+    </w:p>
+    <w:p>
+      <w:pPr>
+        <w:pStyle w:val="List"/>
+        <w:rPr>
+          <w:b/>
+          <w:iCs/>
+          <w:color w:val="000000" w:themeColor="text1"/>
+        </w:rPr>
+      </w:pPr>
+      <w:r>
+        <w:rPr>
+          <w:b/>
+          <w:iCs/>
+          <w:color w:val="000000" w:themeColor="text1"/>
+        </w:rPr>
+        <w:t>Architecture &amp; Engineering</w:t>
+      </w:r>
+    </w:p>
+    <w:p>
+      <w:pPr>
+        <w:pStyle w:val="List"/>
+        <w:rPr>
           <w:bCs/>
-          <w:color w:val="000000" w:themeColor="text1"/>
-          <w:sz w:val="20"/>
-          <w:szCs w:val="20"/>
-        </w:rPr>
-        <w:t>Part Lead</w:t>
-      </w:r>
-      <w:r>
-        <w:rPr>
-          <w:color w:val="000000" w:themeColor="text1"/>
-          <w:sz w:val="20"/>
-          <w:szCs w:val="20"/>
-        </w:rPr>
-        <w:t xml:space="preserve"> for Settings &amp; </w:t>
+          <w:iCs/>
+          <w:color w:val="000000" w:themeColor="text1"/>
+        </w:rPr>
+      </w:pPr>
+      <w:r>
+        <w:rPr>
+          <w:bCs/>
+          <w:iCs/>
+          <w:color w:val="000000" w:themeColor="text1"/>
+        </w:rPr>
+        <w:t>MVVM, MVVM-C, Mobile Architecture, Mobile Platform Engineering, Modular Architecture, Dependency Injection, State Management</w:t>
+      </w:r>
+    </w:p>
+    <w:p>
+      <w:pPr>
+        <w:pStyle w:val="List"/>
+        <w:rPr>
+          <w:b/>
+          <w:iCs/>
+          <w:color w:val="000000" w:themeColor="text1"/>
+          <w:sz w:val="10"/>
+          <w:szCs w:val="10"/>
+        </w:rPr>
+      </w:pPr>
+    </w:p>
+    <w:p>
+      <w:pPr>
+        <w:pStyle w:val="List"/>
+        <w:rPr>
+          <w:b/>
+          <w:iCs/>
+          <w:color w:val="000000" w:themeColor="text1"/>
+        </w:rPr>
+      </w:pPr>
+      <w:r>
+        <w:rPr>
+          <w:b/>
+          <w:iCs/>
+          <w:color w:val="000000" w:themeColor="text1"/>
+        </w:rPr>
+        <w:t>Networking &amp; Integration</w:t>
+      </w:r>
+    </w:p>
+    <w:p>
+      <w:pPr>
+        <w:pStyle w:val="List"/>
+        <w:rPr>
+          <w:bCs/>
+          <w:iCs/>
+          <w:color w:val="000000" w:themeColor="text1"/>
+        </w:rPr>
+      </w:pPr>
+      <w:r>
+        <w:rPr>
+          <w:bCs/>
+          <w:iCs/>
+          <w:color w:val="000000" w:themeColor="text1"/>
+        </w:rPr>
+        <w:t xml:space="preserve">REST APIs, </w:t>
       </w:r>
       <w:proofErr w:type="spellStart"/>
       <w:r>
         <w:rPr>
-          <w:color w:val="000000" w:themeColor="text1"/>
-          <w:sz w:val="20"/>
-          <w:szCs w:val="20"/>
-        </w:rPr>
-        <w:t>MapView</w:t>
+          <w:bCs/>
+          <w:iCs/>
+          <w:color w:val="000000" w:themeColor="text1"/>
+        </w:rPr>
+        <w:t>URLSession</w:t>
       </w:r>
       <w:proofErr w:type="spellEnd"/>
       <w:r>
         <w:rPr>
-          <w:color w:val="000000" w:themeColor="text1"/>
-          <w:sz w:val="20"/>
-          <w:szCs w:val="20"/>
-        </w:rPr>
-        <w:t xml:space="preserve">; owned roadmap, design, and delivery for a </w:t>
-      </w:r>
-      <w:r>
+          <w:bCs/>
+          <w:iCs/>
+          <w:color w:val="000000" w:themeColor="text1"/>
+        </w:rPr>
+        <w:t>, Firebase, Analytics Integration</w:t>
+      </w:r>
+    </w:p>
+    <w:p>
+      <w:pPr>
+        <w:pStyle w:val="List"/>
         <w:rPr>
           <w:b/>
+          <w:iCs/>
+          <w:color w:val="000000" w:themeColor="text1"/>
+          <w:sz w:val="10"/>
+          <w:szCs w:val="10"/>
+        </w:rPr>
+      </w:pPr>
+    </w:p>
+    <w:p>
+      <w:pPr>
+        <w:pStyle w:val="List"/>
+        <w:rPr>
+          <w:b/>
+          <w:iCs/>
+          <w:color w:val="000000" w:themeColor="text1"/>
+        </w:rPr>
+      </w:pPr>
+      <w:r>
+        <w:rPr>
+          <w:b/>
+          <w:iCs/>
+          <w:color w:val="000000" w:themeColor="text1"/>
+        </w:rPr>
+        <w:t>Tools &amp; DevOps</w:t>
+      </w:r>
+    </w:p>
+    <w:p>
+      <w:pPr>
+        <w:pStyle w:val="List"/>
+        <w:rPr>
           <w:bCs/>
-          <w:color w:val="000000" w:themeColor="text1"/>
-          <w:sz w:val="20"/>
-          <w:szCs w:val="20"/>
-        </w:rPr>
-        <w:t>6-member</w:t>
-      </w:r>
-      <w:r>
-        <w:rPr>
-          <w:color w:val="000000" w:themeColor="text1"/>
-          <w:sz w:val="20"/>
-          <w:szCs w:val="20"/>
-        </w:rPr>
-        <w:t xml:space="preserve"> team.</w:t>
+          <w:iCs/>
+          <w:color w:val="000000" w:themeColor="text1"/>
+        </w:rPr>
+      </w:pPr>
+      <w:r>
+        <w:rPr>
+          <w:bCs/>
+          <w:iCs/>
+          <w:color w:val="000000" w:themeColor="text1"/>
+        </w:rPr>
+        <w:t xml:space="preserve">Git, GitHub, GitHub Actions, Jenkins, Swift Package Manager (SPM), </w:t>
+      </w:r>
+      <w:proofErr w:type="spellStart"/>
+      <w:r>
+        <w:rPr>
+          <w:bCs/>
+          <w:iCs/>
+          <w:color w:val="000000" w:themeColor="text1"/>
+        </w:rPr>
+        <w:t>CocoaPods</w:t>
+      </w:r>
+      <w:proofErr w:type="spellEnd"/>
+      <w:r>
+        <w:rPr>
+          <w:bCs/>
+          <w:iCs/>
+          <w:color w:val="000000" w:themeColor="text1"/>
+        </w:rPr>
+        <w:t>, TestFlight</w:t>
       </w:r>
     </w:p>
     <w:p>
       <w:pPr>
         <w:pStyle w:val="List"/>
-        <w:numPr>
-          <w:ilvl w:val="0"/>
-          <w:numId w:val="22"/>
-        </w:numPr>
-        <w:rPr>
-          <w:color w:val="000000" w:themeColor="text1"/>
-          <w:sz w:val="20"/>
-          <w:szCs w:val="20"/>
-        </w:rPr>
-      </w:pPr>
-      <w:r>
-        <w:rPr>
-          <w:color w:val="000000" w:themeColor="text1"/>
-          <w:sz w:val="20"/>
-          <w:szCs w:val="20"/>
-        </w:rPr>
-        <w:t xml:space="preserve">Mentoring engineers on Swift, </w:t>
-      </w:r>
-      <w:proofErr w:type="spellStart"/>
-      <w:r>
-        <w:rPr>
-          <w:color w:val="000000" w:themeColor="text1"/>
-          <w:sz w:val="20"/>
-          <w:szCs w:val="20"/>
-        </w:rPr>
-        <w:t>SwiftUI</w:t>
-      </w:r>
-      <w:proofErr w:type="spellEnd"/>
-      <w:r>
-        <w:rPr>
-          <w:color w:val="000000" w:themeColor="text1"/>
-          <w:sz w:val="20"/>
-          <w:szCs w:val="20"/>
-        </w:rPr>
-        <w:t>/</w:t>
-      </w:r>
-      <w:proofErr w:type="spellStart"/>
-      <w:r>
-        <w:rPr>
-          <w:color w:val="000000" w:themeColor="text1"/>
-          <w:sz w:val="20"/>
-          <w:szCs w:val="20"/>
-        </w:rPr>
-        <w:t>UIKit</w:t>
-      </w:r>
-      <w:proofErr w:type="spellEnd"/>
-      <w:r>
-        <w:rPr>
-          <w:color w:val="000000" w:themeColor="text1"/>
-          <w:sz w:val="20"/>
-          <w:szCs w:val="20"/>
-        </w:rPr>
-        <w:t>, MVVM, Combine, and development best practices.</w:t>
-      </w:r>
+        <w:rPr>
+          <w:b/>
+          <w:iCs/>
+          <w:color w:val="000000" w:themeColor="text1"/>
+          <w:sz w:val="10"/>
+          <w:szCs w:val="10"/>
+        </w:rPr>
+      </w:pPr>
     </w:p>
     <w:p>
       <w:pPr>
         <w:pStyle w:val="List"/>
-        <w:numPr>
-          <w:ilvl w:val="0"/>
-          <w:numId w:val="22"/>
-        </w:numPr>
-        <w:rPr>
-          <w:color w:val="000000" w:themeColor="text1"/>
-          <w:sz w:val="20"/>
-          <w:szCs w:val="20"/>
-        </w:rPr>
-      </w:pPr>
-      <w:r>
-        <w:rPr>
-          <w:color w:val="000000" w:themeColor="text1"/>
-          <w:sz w:val="20"/>
-          <w:szCs w:val="20"/>
-        </w:rPr>
-        <w:t>Supporting feature planning, technical discussions, and cross-team collaboration.</w:t>
+        <w:rPr>
+          <w:b/>
+          <w:iCs/>
+          <w:color w:val="000000" w:themeColor="text1"/>
+        </w:rPr>
+      </w:pPr>
+      <w:r>
+        <w:rPr>
+          <w:b/>
+          <w:iCs/>
+          <w:color w:val="000000" w:themeColor="text1"/>
+        </w:rPr>
+        <w:t>Quality &amp; Performance</w:t>
       </w:r>
     </w:p>
     <w:p>
       <w:pPr>
         <w:pStyle w:val="List"/>
-        <w:numPr>
-          <w:ilvl w:val="0"/>
-          <w:numId w:val="22"/>
-        </w:numPr>
-        <w:rPr>
-          <w:color w:val="000000" w:themeColor="text1"/>
-          <w:sz w:val="20"/>
-          <w:szCs w:val="20"/>
-        </w:rPr>
-      </w:pPr>
-      <w:r>
-        <w:rPr>
-          <w:color w:val="000000" w:themeColor="text1"/>
-          <w:sz w:val="20"/>
-          <w:szCs w:val="20"/>
-        </w:rPr>
-        <w:t xml:space="preserve">Coordinating issue resolution with QA and Product teams for high-priority market </w:t>
-      </w:r>
-      <w:proofErr w:type="spellStart"/>
-      <w:r>
-        <w:rPr>
-          <w:color w:val="000000" w:themeColor="text1"/>
-          <w:sz w:val="20"/>
-          <w:szCs w:val="20"/>
-        </w:rPr>
-        <w:t>VoCs</w:t>
-      </w:r>
-      <w:proofErr w:type="spellEnd"/>
-      <w:r>
-        <w:rPr>
-          <w:color w:val="000000" w:themeColor="text1"/>
-          <w:sz w:val="20"/>
-          <w:szCs w:val="20"/>
-        </w:rPr>
-        <w:t>.</w:t>
+        <w:rPr>
+          <w:bCs/>
+          <w:iCs/>
+          <w:color w:val="000000" w:themeColor="text1"/>
+        </w:rPr>
+      </w:pPr>
+      <w:r>
+        <w:rPr>
+          <w:bCs/>
+          <w:iCs/>
+          <w:color w:val="000000" w:themeColor="text1"/>
+        </w:rPr>
+        <w:t>Performance Profiling, Memory Optimization, Debugging, Code Reviews, CI/CD</w:t>
       </w:r>
     </w:p>
     <w:p>
@@ -2072,52 +1547,23 @@
         </w:numPr>
         <w:rPr>
           <w:color w:val="000000" w:themeColor="text1"/>
-          <w:sz w:val="10"/>
-          <w:szCs w:val="10"/>
-        </w:rPr>
-      </w:pPr>
-    </w:p>
-    <w:p>
-      <w:pPr>
-        <w:pStyle w:val="List"/>
-        <w:rPr>
-          <w:color w:val="000000" w:themeColor="text1"/>
-        </w:rPr>
-      </w:pPr>
-      <w:r>
-        <w:rPr>
-          <w:rStyle w:val="Emphasis"/>
-          <w:color w:val="000000" w:themeColor="text1"/>
-        </w:rPr>
-        <w:t xml:space="preserve">Samsung </w:t>
-      </w:r>
-      <w:proofErr w:type="spellStart"/>
-      <w:r>
-        <w:rPr>
-          <w:rStyle w:val="Emphasis"/>
-          <w:color w:val="000000" w:themeColor="text1"/>
-        </w:rPr>
-        <w:t>DeX</w:t>
-      </w:r>
-      <w:proofErr w:type="spellEnd"/>
-      <w:r>
-        <w:rPr>
-          <w:rStyle w:val="Emphasis"/>
-          <w:color w:val="000000" w:themeColor="text1"/>
-        </w:rPr>
-        <w:t xml:space="preserve"> for PC</w:t>
-      </w:r>
-      <w:r>
-        <w:rPr>
-          <w:color w:val="000000" w:themeColor="text1"/>
-        </w:rPr>
-        <w:t xml:space="preserve"> | </w:t>
-      </w:r>
-      <w:r>
-        <w:rPr>
-          <w:color w:val="000000" w:themeColor="text1"/>
-        </w:rPr>
-        <w:t>Mar 2019 – Dec 2022</w:t>
+          <w:sz w:val="14"/>
+          <w:szCs w:val="14"/>
+        </w:rPr>
+      </w:pPr>
+    </w:p>
+    <w:p>
+      <w:pPr>
+        <w:pStyle w:val="Heading1"/>
+        <w:rPr>
+          <w:color w:val="000000" w:themeColor="text1"/>
+        </w:rPr>
+      </w:pPr>
+      <w:r>
+        <w:rPr>
+          <w:color w:val="000000" w:themeColor="text1"/>
+        </w:rPr>
+        <w:t>SELECTED ACHIEVEMENTS</w:t>
       </w:r>
     </w:p>
     <w:p>
@@ -2125,7 +1571,7 @@
         <w:pStyle w:val="List"/>
         <w:numPr>
           <w:ilvl w:val="0"/>
-          <w:numId w:val="24"/>
+          <w:numId w:val="28"/>
         </w:numPr>
         <w:rPr>
           <w:color w:val="000000" w:themeColor="text1"/>
@@ -2135,21 +1581,29 @@
       </w:pPr>
       <w:r>
         <w:rPr>
-          <w:b/>
-          <w:bCs/>
-          <w:color w:val="000000" w:themeColor="text1"/>
-          <w:sz w:val="20"/>
-          <w:szCs w:val="20"/>
-        </w:rPr>
-        <w:t>Tech Lead</w:t>
-      </w:r>
-      <w:r>
-        <w:rPr>
-          <w:color w:val="000000" w:themeColor="text1"/>
-          <w:sz w:val="20"/>
-          <w:szCs w:val="20"/>
-        </w:rPr>
-        <w:t xml:space="preserve"> for Windows/macOS/Android teams; ensured high-quality feature delivery.</w:t>
+          <w:color w:val="000000" w:themeColor="text1"/>
+          <w:sz w:val="20"/>
+          <w:szCs w:val="20"/>
+        </w:rPr>
+        <w:t xml:space="preserve">Owner of key SmartThings iOS domains including Settings and </w:t>
+      </w:r>
+      <w:proofErr w:type="spellStart"/>
+      <w:r>
+        <w:rPr>
+          <w:color w:val="000000" w:themeColor="text1"/>
+          <w:sz w:val="20"/>
+          <w:szCs w:val="20"/>
+        </w:rPr>
+        <w:t>MapView</w:t>
+      </w:r>
+      <w:proofErr w:type="spellEnd"/>
+      <w:r>
+        <w:rPr>
+          <w:color w:val="000000" w:themeColor="text1"/>
+          <w:sz w:val="20"/>
+          <w:szCs w:val="20"/>
+        </w:rPr>
+        <w:t xml:space="preserve"> within a platform serving 62M+ active users worldwide.</w:t>
       </w:r>
     </w:p>
     <w:p>
@@ -2157,7 +1611,7 @@
         <w:pStyle w:val="List"/>
         <w:numPr>
           <w:ilvl w:val="0"/>
-          <w:numId w:val="24"/>
+          <w:numId w:val="28"/>
         </w:numPr>
         <w:rPr>
           <w:color w:val="000000" w:themeColor="text1"/>
@@ -2171,25 +1625,25 @@
           <w:sz w:val="20"/>
           <w:szCs w:val="20"/>
         </w:rPr>
-        <w:t xml:space="preserve">Mentored </w:t>
-      </w:r>
-      <w:r>
-        <w:rPr>
-          <w:b/>
-          <w:bCs/>
-          <w:color w:val="000000" w:themeColor="text1"/>
-          <w:sz w:val="20"/>
-          <w:szCs w:val="20"/>
-        </w:rPr>
-        <w:t>12+ engineers</w:t>
-      </w:r>
-      <w:r>
-        <w:rPr>
-          <w:color w:val="000000" w:themeColor="text1"/>
-          <w:sz w:val="20"/>
-          <w:szCs w:val="20"/>
-        </w:rPr>
-        <w:t xml:space="preserve"> and guided architecture, performance, and release pipeline.</w:t>
+        <w:t xml:space="preserve">Technical Lead for Samsung </w:t>
+      </w:r>
+      <w:proofErr w:type="spellStart"/>
+      <w:r>
+        <w:rPr>
+          <w:color w:val="000000" w:themeColor="text1"/>
+          <w:sz w:val="20"/>
+          <w:szCs w:val="20"/>
+        </w:rPr>
+        <w:t>DeX</w:t>
+      </w:r>
+      <w:proofErr w:type="spellEnd"/>
+      <w:r>
+        <w:rPr>
+          <w:color w:val="000000" w:themeColor="text1"/>
+          <w:sz w:val="20"/>
+          <w:szCs w:val="20"/>
+        </w:rPr>
+        <w:t xml:space="preserve"> macOS platform supporting 7M+ downloads and 750K+ monthly active users.</w:t>
       </w:r>
     </w:p>
     <w:p>
@@ -2197,7 +1651,7 @@
         <w:pStyle w:val="List"/>
         <w:numPr>
           <w:ilvl w:val="0"/>
-          <w:numId w:val="24"/>
+          <w:numId w:val="28"/>
         </w:numPr>
         <w:rPr>
           <w:color w:val="000000" w:themeColor="text1"/>
@@ -2211,7 +1665,25 @@
           <w:sz w:val="20"/>
           <w:szCs w:val="20"/>
         </w:rPr>
-        <w:t>Delivered PoC to Samsung CTO securing executive approval.</w:t>
+        <w:t xml:space="preserve">Led application-side architecture and integration strategy for SmartThings </w:t>
+      </w:r>
+      <w:proofErr w:type="spellStart"/>
+      <w:r>
+        <w:rPr>
+          <w:color w:val="000000" w:themeColor="text1"/>
+          <w:sz w:val="20"/>
+          <w:szCs w:val="20"/>
+        </w:rPr>
+        <w:t>MapView</w:t>
+      </w:r>
+      <w:proofErr w:type="spellEnd"/>
+      <w:r>
+        <w:rPr>
+          <w:color w:val="000000" w:themeColor="text1"/>
+          <w:sz w:val="20"/>
+          <w:szCs w:val="20"/>
+        </w:rPr>
+        <w:t xml:space="preserve"> migration from Unity to Godot Engine.</w:t>
       </w:r>
     </w:p>
     <w:p>
@@ -2219,7 +1691,7 @@
         <w:pStyle w:val="List"/>
         <w:numPr>
           <w:ilvl w:val="0"/>
-          <w:numId w:val="24"/>
+          <w:numId w:val="28"/>
         </w:numPr>
         <w:rPr>
           <w:color w:val="000000" w:themeColor="text1"/>
@@ -2233,7 +1705,29 @@
           <w:sz w:val="20"/>
           <w:szCs w:val="20"/>
         </w:rPr>
-        <w:t>Collaborated with PMs and VPs to define functional/non-functional requirements and drive product direction.</w:t>
+        <w:t>Achieved Professional Level (Top 20%) in Samsung SW Certificate Test.</w:t>
+      </w:r>
+    </w:p>
+    <w:p>
+      <w:pPr>
+        <w:pStyle w:val="List"/>
+        <w:numPr>
+          <w:ilvl w:val="0"/>
+          <w:numId w:val="28"/>
+        </w:numPr>
+        <w:rPr>
+          <w:color w:val="000000" w:themeColor="text1"/>
+          <w:sz w:val="20"/>
+          <w:szCs w:val="20"/>
+        </w:rPr>
+      </w:pPr>
+      <w:r>
+        <w:rPr>
+          <w:color w:val="000000" w:themeColor="text1"/>
+          <w:sz w:val="20"/>
+          <w:szCs w:val="20"/>
+        </w:rPr>
+        <w:t>Received Star Employee of the Month (January 2026).</w:t>
       </w:r>
     </w:p>
     <w:p>
@@ -2245,291 +1739,42 @@
         </w:numPr>
         <w:rPr>
           <w:color w:val="000000" w:themeColor="text1"/>
-          <w:sz w:val="10"/>
-          <w:szCs w:val="10"/>
-        </w:rPr>
-      </w:pPr>
+          <w:sz w:val="14"/>
+          <w:szCs w:val="14"/>
+        </w:rPr>
+      </w:pPr>
+    </w:p>
+    <w:p>
+      <w:pPr>
+        <w:pStyle w:val="Heading1"/>
+        <w:rPr>
+          <w:color w:val="000000" w:themeColor="text1"/>
+        </w:rPr>
+      </w:pPr>
+      <w:r>
+        <w:rPr>
+          <w:color w:val="000000" w:themeColor="text1"/>
+        </w:rPr>
+        <w:t>Education</w:t>
+      </w:r>
     </w:p>
     <w:p>
       <w:pPr>
         <w:pStyle w:val="List"/>
         <w:rPr>
-          <w:b/>
-          <w:iCs/>
-          <w:color w:val="000000" w:themeColor="text1"/>
-        </w:rPr>
-      </w:pPr>
-      <w:r>
-        <w:rPr>
-          <w:b/>
-          <w:iCs/>
-          <w:color w:val="000000" w:themeColor="text1"/>
-        </w:rPr>
-        <w:t>Organization-wide Contributions</w:t>
+          <w:color w:val="000000" w:themeColor="text1"/>
+        </w:rPr>
+      </w:pPr>
+      <w:r>
+        <w:rPr>
+          <w:color w:val="000000" w:themeColor="text1"/>
+        </w:rPr>
+        <w:t>Bachelor of Science (B.Sc.) in Computer Science &amp; Engineering</w:t>
       </w:r>
     </w:p>
     <w:p>
       <w:pPr>
         <w:pStyle w:val="List"/>
-        <w:numPr>
-          <w:ilvl w:val="0"/>
-          <w:numId w:val="25"/>
-        </w:numPr>
-        <w:rPr>
-          <w:color w:val="000000" w:themeColor="text1"/>
-          <w:sz w:val="20"/>
-          <w:szCs w:val="20"/>
-        </w:rPr>
-      </w:pPr>
-      <w:r>
-        <w:rPr>
-          <w:color w:val="000000" w:themeColor="text1"/>
-          <w:sz w:val="20"/>
-          <w:szCs w:val="20"/>
-        </w:rPr>
-        <w:t>Onboarded 7+ engineers across multiple projects.</w:t>
-      </w:r>
-    </w:p>
-    <w:p>
-      <w:pPr>
-        <w:pStyle w:val="List"/>
-        <w:numPr>
-          <w:ilvl w:val="0"/>
-          <w:numId w:val="25"/>
-        </w:numPr>
-        <w:rPr>
-          <w:color w:val="000000" w:themeColor="text1"/>
-          <w:sz w:val="20"/>
-          <w:szCs w:val="20"/>
-        </w:rPr>
-      </w:pPr>
-      <w:r>
-        <w:rPr>
-          <w:color w:val="000000" w:themeColor="text1"/>
-          <w:sz w:val="20"/>
-          <w:szCs w:val="20"/>
-        </w:rPr>
-        <w:t>Participated in technical interviews and candidate evaluations.</w:t>
-      </w:r>
-    </w:p>
-    <w:p>
-      <w:pPr>
-        <w:pStyle w:val="List"/>
-        <w:numPr>
-          <w:ilvl w:val="0"/>
-          <w:numId w:val="25"/>
-        </w:numPr>
-        <w:rPr>
-          <w:color w:val="000000" w:themeColor="text1"/>
-          <w:sz w:val="20"/>
-          <w:szCs w:val="20"/>
-        </w:rPr>
-      </w:pPr>
-      <w:r>
-        <w:rPr>
-          <w:color w:val="000000" w:themeColor="text1"/>
-          <w:sz w:val="20"/>
-          <w:szCs w:val="20"/>
-        </w:rPr>
-        <w:t>Conducted internal technical training sessions and knowledge-sharing activities.</w:t>
-      </w:r>
-    </w:p>
-    <w:p>
-      <w:pPr>
-        <w:pStyle w:val="ListBullet"/>
-        <w:numPr>
-          <w:ilvl w:val="0"/>
-          <w:numId w:val="0"/>
-        </w:numPr>
-        <w:rPr>
-          <w:color w:val="000000" w:themeColor="text1"/>
-          <w:sz w:val="10"/>
-          <w:szCs w:val="10"/>
-        </w:rPr>
-      </w:pPr>
-    </w:p>
-    <w:p>
-      <w:pPr>
-        <w:pStyle w:val="ListBullet"/>
-        <w:numPr>
-          <w:ilvl w:val="0"/>
-          <w:numId w:val="0"/>
-        </w:numPr>
-        <w:rPr>
-          <w:b/>
-          <w:iCs/>
-          <w:color w:val="000000" w:themeColor="text1"/>
-          <w:sz w:val="24"/>
-        </w:rPr>
-      </w:pPr>
-      <w:r>
-        <w:rPr>
-          <w:b/>
-          <w:iCs/>
-          <w:color w:val="000000" w:themeColor="text1"/>
-          <w:sz w:val="24"/>
-        </w:rPr>
-        <w:t>Open-Source</w:t>
-      </w:r>
-      <w:r>
-        <w:rPr>
-          <w:b/>
-          <w:iCs/>
-          <w:color w:val="000000" w:themeColor="text1"/>
-          <w:sz w:val="24"/>
-        </w:rPr>
-        <w:t xml:space="preserve"> Contributions</w:t>
-      </w:r>
-    </w:p>
-    <w:p>
-      <w:pPr>
-        <w:pStyle w:val="List"/>
-        <w:numPr>
-          <w:ilvl w:val="0"/>
-          <w:numId w:val="25"/>
-        </w:numPr>
-        <w:rPr>
-          <w:color w:val="000000" w:themeColor="text1"/>
-          <w:sz w:val="20"/>
-          <w:szCs w:val="20"/>
-        </w:rPr>
-      </w:pPr>
-      <w:r>
-        <w:rPr>
-          <w:color w:val="000000" w:themeColor="text1"/>
-          <w:sz w:val="20"/>
-          <w:szCs w:val="20"/>
-        </w:rPr>
-        <w:t xml:space="preserve">Contributor to </w:t>
-      </w:r>
-      <w:hyperlink r:id="rId17" w:history="1">
-        <w:proofErr w:type="spellStart"/>
-        <w:r>
-          <w:rPr>
-            <w:rStyle w:val="Hyperlink"/>
-            <w:sz w:val="20"/>
-            <w:szCs w:val="20"/>
-          </w:rPr>
-          <w:t>SwiftGodotKit</w:t>
-        </w:r>
-        <w:proofErr w:type="spellEnd"/>
-      </w:hyperlink>
-      <w:r>
-        <w:rPr>
-          <w:color w:val="000000" w:themeColor="text1"/>
-          <w:sz w:val="20"/>
-          <w:szCs w:val="20"/>
-        </w:rPr>
-        <w:t xml:space="preserve"> and Godot iOS embedding ecosystem for native Swift interoperability and </w:t>
-      </w:r>
-      <w:hyperlink r:id="rId18" w:history="1">
-        <w:r>
-          <w:rPr>
-            <w:rStyle w:val="Hyperlink"/>
-            <w:sz w:val="20"/>
-            <w:szCs w:val="20"/>
-          </w:rPr>
-          <w:t>embedded rendering</w:t>
-        </w:r>
-      </w:hyperlink>
-      <w:r>
-        <w:rPr>
-          <w:color w:val="000000" w:themeColor="text1"/>
-          <w:sz w:val="20"/>
-          <w:szCs w:val="20"/>
-        </w:rPr>
-        <w:t xml:space="preserve"> workflows.</w:t>
-      </w:r>
-    </w:p>
-    <w:p>
-      <w:pPr>
-        <w:pStyle w:val="List"/>
-        <w:numPr>
-          <w:ilvl w:val="0"/>
-          <w:numId w:val="25"/>
-        </w:numPr>
-        <w:rPr>
-          <w:color w:val="000000" w:themeColor="text1"/>
-          <w:sz w:val="20"/>
-          <w:szCs w:val="20"/>
-        </w:rPr>
-      </w:pPr>
-      <w:r>
-        <w:rPr>
-          <w:color w:val="000000" w:themeColor="text1"/>
-          <w:sz w:val="20"/>
-          <w:szCs w:val="20"/>
-        </w:rPr>
-        <w:t>Contributed fixes and improvements related to Swift ↔ Godot integration for iOS platforms.</w:t>
-      </w:r>
-    </w:p>
-    <w:p>
-      <w:pPr>
-        <w:pStyle w:val="ListBullet"/>
-        <w:numPr>
-          <w:ilvl w:val="0"/>
-          <w:numId w:val="0"/>
-        </w:numPr>
-        <w:rPr>
-          <w:color w:val="000000" w:themeColor="text1"/>
-          <w:sz w:val="10"/>
-          <w:szCs w:val="10"/>
-        </w:rPr>
-      </w:pPr>
-    </w:p>
-    <w:p>
-      <w:pPr>
-        <w:pStyle w:val="Heading1"/>
-        <w:rPr>
-          <w:color w:val="000000" w:themeColor="text1"/>
-        </w:rPr>
-      </w:pPr>
-      <w:r>
-        <w:rPr>
-          <w:color w:val="000000" w:themeColor="text1"/>
-        </w:rPr>
-        <w:t>Education and Certification</w:t>
-      </w:r>
-    </w:p>
-    <w:p>
-      <w:pPr>
-        <w:pStyle w:val="List"/>
-        <w:rPr>
-          <w:color w:val="000000" w:themeColor="text1"/>
-        </w:rPr>
-      </w:pPr>
-      <w:r>
-        <w:rPr>
-          <w:b/>
-          <w:bCs/>
-          <w:color w:val="000000" w:themeColor="text1"/>
-        </w:rPr>
-        <w:t xml:space="preserve">B.Sc. </w:t>
-      </w:r>
-      <w:r>
-        <w:rPr>
-          <w:color w:val="000000" w:themeColor="text1"/>
-        </w:rPr>
-        <w:t>in</w:t>
-      </w:r>
-      <w:r>
-        <w:rPr>
-          <w:b/>
-          <w:bCs/>
-          <w:color w:val="000000" w:themeColor="text1"/>
-        </w:rPr>
-        <w:t xml:space="preserve"> Computer Science and Engineering</w:t>
-      </w:r>
-      <w:r>
-        <w:rPr>
-          <w:color w:val="000000" w:themeColor="text1"/>
-        </w:rPr>
-        <w:tab/>
-      </w:r>
-    </w:p>
-    <w:p>
-      <w:pPr>
-        <w:pStyle w:val="List"/>
         <w:rPr>
           <w:color w:val="000000" w:themeColor="text1"/>
           <w:sz w:val="22"/>
@@ -2539,7 +1784,6 @@
       <w:r>
         <w:rPr>
           <w:color w:val="000000" w:themeColor="text1"/>
-          <w:sz w:val="22"/>
         </w:rPr>
         <w:t>Rajshahi</w:t>
       </w:r>
@@ -2547,23 +1791,8 @@
       <w:r>
         <w:rPr>
           <w:color w:val="000000" w:themeColor="text1"/>
-          <w:sz w:val="22"/>
-        </w:rPr>
-        <w:t xml:space="preserve"> University of Engineering &amp; Technology</w:t>
-      </w:r>
-      <w:r>
-        <w:rPr>
-          <w:color w:val="000000" w:themeColor="text1"/>
-          <w:sz w:val="22"/>
-        </w:rPr>
-        <w:tab/>
-      </w:r>
-      <w:r>
-        <w:rPr>
-          <w:color w:val="000000" w:themeColor="text1"/>
-          <w:sz w:val="22"/>
-        </w:rPr>
-        <w:t>Feb 2008 – Sep 2012</w:t>
+        </w:rPr>
+        <w:t xml:space="preserve"> University of Engineering &amp; Technology (RUET) | 2008 – 2012</w:t>
       </w:r>
     </w:p>
     <w:sectPr>
@@ -4561,6 +3790,119 @@
     </w:lvl>
   </w:abstractNum>
   <w:abstractNum w:abstractNumId="16" w15:restartNumberingAfterBreak="0">
+    <w:nsid w:val="52747761"/>
+    <w:multiLevelType w:val="hybridMultilevel"/>
+    <w:tmpl w:val="2E001A5E"/>
+    <w:lvl w:ilvl="0" w:tplc="04090001">
+      <w:start w:val="1"/>
+      <w:numFmt w:val="bullet"/>
+      <w:lvlText w:val=""/>
+      <w:lvlJc w:val="left"/>
+      <w:pPr>
+        <w:ind w:left="720" w:hanging="360"/>
+      </w:pPr>
+      <w:rPr>
+        <w:rFonts w:ascii="Symbol" w:hAnsi="Symbol" w:hint="default"/>
+      </w:rPr>
+    </w:lvl>
+    <w:lvl w:ilvl="1" w:tplc="04090003" w:tentative="1">
+      <w:start w:val="1"/>
+      <w:numFmt w:val="bullet"/>
+      <w:lvlText w:val="o"/>
+      <w:lvlJc w:val="left"/>
+      <w:pPr>
+        <w:ind w:left="1440" w:hanging="360"/>
+      </w:pPr>
+      <w:rPr>
+        <w:rFonts w:ascii="Courier New" w:hAnsi="Courier New" w:cs="Courier New" w:hint="default"/>
+      </w:rPr>
+    </w:lvl>
+    <w:lvl w:ilvl="2" w:tplc="04090005" w:tentative="1">
+      <w:start w:val="1"/>
+      <w:numFmt w:val="bullet"/>
+      <w:lvlText w:val=""/>
+      <w:lvlJc w:val="left"/>
+      <w:pPr>
+        <w:ind w:left="2160" w:hanging="360"/>
+      </w:pPr>
+      <w:rPr>
+        <w:rFonts w:ascii="Wingdings" w:hAnsi="Wingdings" w:hint="default"/>
+      </w:rPr>
+    </w:lvl>
+    <w:lvl w:ilvl="3" w:tplc="04090001" w:tentative="1">
+      <w:start w:val="1"/>
+      <w:numFmt w:val="bullet"/>
+      <w:lvlText w:val=""/>
+      <w:lvlJc w:val="left"/>
+      <w:pPr>
+        <w:ind w:left="2880" w:hanging="360"/>
+      </w:pPr>
+      <w:rPr>
+        <w:rFonts w:ascii="Symbol" w:hAnsi="Symbol" w:hint="default"/>
+      </w:rPr>
+    </w:lvl>
+    <w:lvl w:ilvl="4" w:tplc="04090003" w:tentative="1">
+      <w:start w:val="1"/>
+      <w:numFmt w:val="bullet"/>
+      <w:lvlText w:val="o"/>
+      <w:lvlJc w:val="left"/>
+      <w:pPr>
+        <w:ind w:left="3600" w:hanging="360"/>
+      </w:pPr>
+      <w:rPr>
+        <w:rFonts w:ascii="Courier New" w:hAnsi="Courier New" w:cs="Courier New" w:hint="default"/>
+      </w:rPr>
+    </w:lvl>
+    <w:lvl w:ilvl="5" w:tplc="04090005" w:tentative="1">
+      <w:start w:val="1"/>
+      <w:numFmt w:val="bullet"/>
+      <w:lvlText w:val=""/>
+      <w:lvlJc w:val="left"/>
+      <w:pPr>
+        <w:ind w:left="4320" w:hanging="360"/>
+      </w:pPr>
+      <w:rPr>
+        <w:rFonts w:ascii="Wingdings" w:hAnsi="Wingdings" w:hint="default"/>
+      </w:rPr>
+    </w:lvl>
+    <w:lvl w:ilvl="6" w:tplc="04090001" w:tentative="1">
+      <w:start w:val="1"/>
+      <w:numFmt w:val="bullet"/>
+      <w:lvlText w:val=""/>
+      <w:lvlJc w:val="left"/>
+      <w:pPr>
+        <w:ind w:left="5040" w:hanging="360"/>
+      </w:pPr>
+      <w:rPr>
+        <w:rFonts w:ascii="Symbol" w:hAnsi="Symbol" w:hint="default"/>
+      </w:rPr>
+    </w:lvl>
+    <w:lvl w:ilvl="7" w:tplc="04090003" w:tentative="1">
+      <w:start w:val="1"/>
+      <w:numFmt w:val="bullet"/>
+      <w:lvlText w:val="o"/>
+      <w:lvlJc w:val="left"/>
+      <w:pPr>
+        <w:ind w:left="5760" w:hanging="360"/>
+      </w:pPr>
+      <w:rPr>
+        <w:rFonts w:ascii="Courier New" w:hAnsi="Courier New" w:cs="Courier New" w:hint="default"/>
+      </w:rPr>
+    </w:lvl>
+    <w:lvl w:ilvl="8" w:tplc="04090005" w:tentative="1">
+      <w:start w:val="1"/>
+      <w:numFmt w:val="bullet"/>
+      <w:lvlText w:val=""/>
+      <w:lvlJc w:val="left"/>
+      <w:pPr>
+        <w:ind w:left="6480" w:hanging="360"/>
+      </w:pPr>
+      <w:rPr>
+        <w:rFonts w:ascii="Wingdings" w:hAnsi="Wingdings" w:hint="default"/>
+      </w:rPr>
+    </w:lvl>
+  </w:abstractNum>
+  <w:abstractNum w:abstractNumId="17" w15:restartNumberingAfterBreak="0">
     <w:nsid w:val="5FD07473"/>
     <w:multiLevelType w:val="hybridMultilevel"/>
     <w:tmpl w:val="5CCC9640"/>
@@ -4673,7 +4015,7 @@
       </w:rPr>
     </w:lvl>
   </w:abstractNum>
-  <w:abstractNum w:abstractNumId="17" w15:restartNumberingAfterBreak="0">
+  <w:abstractNum w:abstractNumId="18" w15:restartNumberingAfterBreak="0">
     <w:nsid w:val="672A0C07"/>
     <w:multiLevelType w:val="multilevel"/>
     <w:tmpl w:val="340E7B72"/>
@@ -4822,7 +4164,7 @@
       </w:rPr>
     </w:lvl>
   </w:abstractNum>
-  <w:abstractNum w:abstractNumId="18" w15:restartNumberingAfterBreak="0">
+  <w:abstractNum w:abstractNumId="19" w15:restartNumberingAfterBreak="0">
     <w:nsid w:val="6CD4404B"/>
     <w:multiLevelType w:val="hybridMultilevel"/>
     <w:tmpl w:val="9776199C"/>
@@ -4935,7 +4277,7 @@
       </w:rPr>
     </w:lvl>
   </w:abstractNum>
-  <w:abstractNum w:abstractNumId="19" w15:restartNumberingAfterBreak="0">
+  <w:abstractNum w:abstractNumId="20" w15:restartNumberingAfterBreak="0">
     <w:nsid w:val="6F2107DD"/>
     <w:multiLevelType w:val="hybridMultilevel"/>
     <w:tmpl w:val="987A0202"/>
@@ -5048,7 +4390,7 @@
       </w:rPr>
     </w:lvl>
   </w:abstractNum>
-  <w:abstractNum w:abstractNumId="20" w15:restartNumberingAfterBreak="0">
+  <w:abstractNum w:abstractNumId="21" w15:restartNumberingAfterBreak="0">
     <w:nsid w:val="6FF55F7D"/>
     <w:multiLevelType w:val="hybridMultilevel"/>
     <w:tmpl w:val="241A61A6"/>
@@ -5161,7 +4503,7 @@
       </w:rPr>
     </w:lvl>
   </w:abstractNum>
-  <w:abstractNum w:abstractNumId="21" w15:restartNumberingAfterBreak="0">
+  <w:abstractNum w:abstractNumId="22" w15:restartNumberingAfterBreak="0">
     <w:nsid w:val="74397629"/>
     <w:multiLevelType w:val="hybridMultilevel"/>
     <w:tmpl w:val="AEA6A412"/>
@@ -5274,7 +4616,7 @@
       </w:rPr>
     </w:lvl>
   </w:abstractNum>
-  <w:abstractNum w:abstractNumId="22" w15:restartNumberingAfterBreak="0">
+  <w:abstractNum w:abstractNumId="23" w15:restartNumberingAfterBreak="0">
     <w:nsid w:val="78291A2A"/>
     <w:multiLevelType w:val="hybridMultilevel"/>
     <w:tmpl w:val="ED08D306"/>
@@ -5387,7 +4729,7 @@
       </w:rPr>
     </w:lvl>
   </w:abstractNum>
-  <w:abstractNum w:abstractNumId="23" w15:restartNumberingAfterBreak="0">
+  <w:abstractNum w:abstractNumId="24" w15:restartNumberingAfterBreak="0">
     <w:nsid w:val="7A932FA1"/>
     <w:multiLevelType w:val="multilevel"/>
     <w:tmpl w:val="F9E2ECB4"/>
@@ -5536,7 +4878,7 @@
       </w:rPr>
     </w:lvl>
   </w:abstractNum>
-  <w:abstractNum w:abstractNumId="24" w15:restartNumberingAfterBreak="0">
+  <w:abstractNum w:abstractNumId="25" w15:restartNumberingAfterBreak="0">
     <w:nsid w:val="7C5B0993"/>
     <w:multiLevelType w:val="hybridMultilevel"/>
     <w:tmpl w:val="19589D08"/>
@@ -5649,7 +4991,7 @@
       </w:rPr>
     </w:lvl>
   </w:abstractNum>
-  <w:abstractNum w:abstractNumId="25" w15:restartNumberingAfterBreak="0">
+  <w:abstractNum w:abstractNumId="26" w15:restartNumberingAfterBreak="0">
     <w:nsid w:val="7CA87D3E"/>
     <w:multiLevelType w:val="multilevel"/>
     <w:tmpl w:val="ED8229AA"/>
@@ -5798,7 +5140,7 @@
       </w:rPr>
     </w:lvl>
   </w:abstractNum>
-  <w:abstractNum w:abstractNumId="26" w15:restartNumberingAfterBreak="0">
+  <w:abstractNum w:abstractNumId="27" w15:restartNumberingAfterBreak="0">
     <w:nsid w:val="7F860C59"/>
     <w:multiLevelType w:val="hybridMultilevel"/>
     <w:tmpl w:val="C65659F2"/>
@@ -5915,7 +5257,7 @@
     <w:abstractNumId w:val="2"/>
   </w:num>
   <w:num w:numId="2" w16cid:durableId="873925989">
-    <w:abstractNumId w:val="16"/>
+    <w:abstractNumId w:val="17"/>
   </w:num>
   <w:num w:numId="3" w16cid:durableId="1145048583">
     <w:abstractNumId w:val="4"/>
@@ -5927,13 +5269,13 @@
     <w:abstractNumId w:val="0"/>
   </w:num>
   <w:num w:numId="6" w16cid:durableId="1573856020">
-    <w:abstractNumId w:val="21"/>
+    <w:abstractNumId w:val="22"/>
   </w:num>
   <w:num w:numId="7" w16cid:durableId="418140883">
-    <w:abstractNumId w:val="17"/>
+    <w:abstractNumId w:val="18"/>
   </w:num>
   <w:num w:numId="8" w16cid:durableId="649212635">
-    <w:abstractNumId w:val="23"/>
+    <w:abstractNumId w:val="24"/>
   </w:num>
   <w:num w:numId="9" w16cid:durableId="1047559592">
     <w:abstractNumId w:val="14"/>
@@ -5942,7 +5284,7 @@
     <w:abstractNumId w:val="3"/>
   </w:num>
   <w:num w:numId="11" w16cid:durableId="1654528569">
-    <w:abstractNumId w:val="25"/>
+    <w:abstractNumId w:val="26"/>
   </w:num>
   <w:num w:numId="12" w16cid:durableId="1438134191">
     <w:abstractNumId w:val="10"/>
@@ -5954,10 +5296,10 @@
     <w:abstractNumId w:val="12"/>
   </w:num>
   <w:num w:numId="15" w16cid:durableId="398485624">
-    <w:abstractNumId w:val="26"/>
+    <w:abstractNumId w:val="27"/>
   </w:num>
   <w:num w:numId="16" w16cid:durableId="317997149">
-    <w:abstractNumId w:val="20"/>
+    <w:abstractNumId w:val="21"/>
   </w:num>
   <w:num w:numId="17" w16cid:durableId="1923564945">
     <w:abstractNumId w:val="5"/>
@@ -5972,16 +5314,16 @@
     <w:abstractNumId w:val="1"/>
   </w:num>
   <w:num w:numId="21" w16cid:durableId="569467139">
-    <w:abstractNumId w:val="22"/>
+    <w:abstractNumId w:val="23"/>
   </w:num>
   <w:num w:numId="22" w16cid:durableId="238180415">
     <w:abstractNumId w:val="7"/>
   </w:num>
   <w:num w:numId="23" w16cid:durableId="1314482179">
-    <w:abstractNumId w:val="24"/>
+    <w:abstractNumId w:val="25"/>
   </w:num>
   <w:num w:numId="24" w16cid:durableId="491064272">
-    <w:abstractNumId w:val="18"/>
+    <w:abstractNumId w:val="19"/>
   </w:num>
   <w:num w:numId="25" w16cid:durableId="2033796605">
     <w:abstractNumId w:val="15"/>
@@ -5990,7 +5332,10 @@
     <w:abstractNumId w:val="9"/>
   </w:num>
   <w:num w:numId="27" w16cid:durableId="1742560147">
-    <w:abstractNumId w:val="19"/>
+    <w:abstractNumId w:val="20"/>
+  </w:num>
+  <w:num w:numId="28" w16cid:durableId="72900976">
+    <w:abstractNumId w:val="16"/>
   </w:num>
 </w:numbering>
 </file>
@@ -6446,7 +5791,6 @@
   <w:style w:type="character" w:default="1" w:styleId="DefaultParagraphFont">
     <w:name w:val="Default Paragraph Font"/>
     <w:uiPriority w:val="1"/>
-    <w:semiHidden/>
     <w:unhideWhenUsed/>
   </w:style>
   <w:style w:type="table" w:default="1" w:styleId="TableNormal">
@@ -7035,15 +6379,6 @@
 </file>
 
 <file path=customXml/item1.xml><?xml version="1.0" encoding="utf-8"?>
-<?mso-contentType ?>
-<FormTemplates xmlns="http://schemas.microsoft.com/sharepoint/v3/contenttype/forms">
-  <Display>DocumentLibraryForm</Display>
-  <Edit>DocumentLibraryForm</Edit>
-  <New>DocumentLibraryForm</New>
-</FormTemplates>
-</file>
-
-<file path=customXml/item2.xml><?xml version="1.0" encoding="utf-8"?>
 <p:properties xmlns:p="http://schemas.microsoft.com/office/2006/metadata/properties" xmlns:xsi="http://www.w3.org/2001/XMLSchema-instance" xmlns:pc="http://schemas.microsoft.com/office/infopath/2007/PartnerControls">
   <documentManagement>
     <_ip_UnifiedCompliancePolicyUIAction xmlns="http://schemas.microsoft.com/sharepoint/v3" xsi:nil="true"/>
@@ -7070,7 +6405,20 @@
 </p:properties>
 </file>
 
+<file path=customXml/item2.xml><?xml version="1.0" encoding="utf-8"?>
+<?mso-contentType ?>
+<FormTemplates xmlns="http://schemas.microsoft.com/sharepoint/v3/contenttype/forms">
+  <Display>DocumentLibraryForm</Display>
+  <Edit>DocumentLibraryForm</Edit>
+  <New>DocumentLibraryForm</New>
+</FormTemplates>
+</file>
+
 <file path=customXml/item3.xml><?xml version="1.0" encoding="utf-8"?>
+<b:Sources xmlns:b="http://schemas.openxmlformats.org/officeDocument/2006/bibliography" xmlns="http://schemas.openxmlformats.org/officeDocument/2006/bibliography" SelectedStyle="\APASixthEditionOfficeOnline.xsl" StyleName="APA" Version="6"/>
+</file>
+
+<file path=customXml/item4.xml><?xml version="1.0" encoding="utf-8"?>
 <ct:contentTypeSchema xmlns:ct="http://schemas.microsoft.com/office/2006/metadata/contentType" xmlns:ma="http://schemas.microsoft.com/office/2006/metadata/properties/metaAttributes" ct:_="" ma:_="" ma:contentTypeName="Document" ma:contentTypeID="0x01010079F111ED35F8CC479449609E8A0923A6" ma:contentTypeVersion="30" ma:contentTypeDescription="Create a new document." ma:contentTypeScope="" ma:versionID="cec0622158e8f13124e9e8fd4de31bd1">
   <xsd:schema xmlns:xsd="http://www.w3.org/2001/XMLSchema" xmlns:xs="http://www.w3.org/2001/XMLSchema" xmlns:p="http://schemas.microsoft.com/office/2006/metadata/properties" xmlns:ns1="http://schemas.microsoft.com/sharepoint/v3" xmlns:ns2="71af3243-3dd4-4a8d-8c0d-dd76da1f02a5" xmlns:ns3="16c05727-aa75-4e4a-9b5f-8a80a1165891" xmlns:ns4="230e9df3-be65-4c73-a93b-d1236ebd677e" targetNamespace="http://schemas.microsoft.com/office/2006/metadata/properties" ma:root="true" ma:fieldsID="3b52f30ab005d15df08657af532e6e38" ns1:_="" ns2:_="" ns3:_="" ns4:_="">
     <xsd:import namespace="http://schemas.microsoft.com/sharepoint/v3"/>
@@ -7388,19 +6736,7 @@
 </ct:contentTypeSchema>
 </file>
 
-<file path=customXml/item4.xml><?xml version="1.0" encoding="utf-8"?>
-<b:Sources xmlns:b="http://schemas.openxmlformats.org/officeDocument/2006/bibliography" xmlns="http://schemas.openxmlformats.org/officeDocument/2006/bibliography" SelectedStyle="\APASixthEditionOfficeOnline.xsl" StyleName="APA" Version="6"/>
-</file>
-
 <file path=customXml/itemProps1.xml><?xml version="1.0" encoding="utf-8"?>
-<ds:datastoreItem xmlns:ds="http://schemas.openxmlformats.org/officeDocument/2006/customXml" ds:itemID="{F8158BE5-FF4A-47EA-ABCC-F2FC8C69734F}">
-  <ds:schemaRefs>
-    <ds:schemaRef ds:uri="http://schemas.microsoft.com/sharepoint/v3/contenttype/forms"/>
-  </ds:schemaRefs>
-</ds:datastoreItem>
-</file>
-
-<file path=customXml/itemProps2.xml><?xml version="1.0" encoding="utf-8"?>
 <ds:datastoreItem xmlns:ds="http://schemas.openxmlformats.org/officeDocument/2006/customXml" ds:itemID="{2FA1C4FC-8415-4BF3-9F42-41DE68C426A1}">
   <ds:schemaRefs>
     <ds:schemaRef ds:uri="http://schemas.microsoft.com/office/2006/metadata/properties"/>
@@ -7413,7 +6749,23 @@
 </ds:datastoreItem>
 </file>
 
+<file path=customXml/itemProps2.xml><?xml version="1.0" encoding="utf-8"?>
+<ds:datastoreItem xmlns:ds="http://schemas.openxmlformats.org/officeDocument/2006/customXml" ds:itemID="{F8158BE5-FF4A-47EA-ABCC-F2FC8C69734F}">
+  <ds:schemaRefs>
+    <ds:schemaRef ds:uri="http://schemas.microsoft.com/sharepoint/v3/contenttype/forms"/>
+  </ds:schemaRefs>
+</ds:datastoreItem>
+</file>
+
 <file path=customXml/itemProps3.xml><?xml version="1.0" encoding="utf-8"?>
+<ds:datastoreItem xmlns:ds="http://schemas.openxmlformats.org/officeDocument/2006/customXml" ds:itemID="{673513B2-79CE-4C66-ACE4-3D67382244F7}">
+  <ds:schemaRefs>
+    <ds:schemaRef ds:uri="http://schemas.openxmlformats.org/officeDocument/2006/bibliography"/>
+  </ds:schemaRefs>
+</ds:datastoreItem>
+</file>
+
+<file path=customXml/itemProps4.xml><?xml version="1.0" encoding="utf-8"?>
 <ds:datastoreItem xmlns:ds="http://schemas.openxmlformats.org/officeDocument/2006/customXml" ds:itemID="{E334ADCA-0391-45BE-A0B8-AA9AA9016254}">
   <ds:schemaRefs>
     <ds:schemaRef ds:uri="http://schemas.microsoft.com/office/2006/metadata/contentType"/>
@@ -7434,14 +6786,6 @@
 </ds:datastoreItem>
 </file>
 
-<file path=customXml/itemProps4.xml><?xml version="1.0" encoding="utf-8"?>
-<ds:datastoreItem xmlns:ds="http://schemas.openxmlformats.org/officeDocument/2006/customXml" ds:itemID="{673513B2-79CE-4C66-ACE4-3D67382244F7}">
-  <ds:schemaRefs>
-    <ds:schemaRef ds:uri="http://schemas.openxmlformats.org/officeDocument/2006/bibliography"/>
-  </ds:schemaRefs>
-</ds:datastoreItem>
-</file>
-
 <file path=docMetadata/LabelInfo.xml><?xml version="1.0" encoding="utf-8"?>
 <clbl:labelList xmlns:clbl="http://schemas.microsoft.com/office/2020/mipLabelMetadata"/>
 </file>
</xml_diff>